<commit_message>
Proofread Inn Trouble Brazilian Portuguese (375 fixes, 12 decisions); cloud queue complete
Co-Authored-By: Claude Opus 5.5 <noreply@anthropic.com>
Claude-Session: https://claude.ai/code/session_012Cm8JxdqzjuttdUSdkQCUg
</commit_message>
<xml_diff>
--- a/translated/corrected/Inn Trouble - ASSEMBLED - FORMATTED_Brazilian Portuguese.docx
+++ b/translated/corrected/Inn Trouble - ASSEMBLED - FORMATTED_Brazilian Portuguese.docx
@@ -4,146 +4,146 @@
   <w:body>
     <w:p>
       <w:r>
+        <w:t xml:space="preserve">&lt;bt&gt;Inn Trouble&lt;/bt&gt;</w:t>
+      </w:r>
+    </w:p>
+    <w:p/>
+    <w:p>
+      <w:r>
+        <w:t xml:space="preserve"/>
+      </w:r>
+    </w:p>
+    <w:p/>
+    <w:p>
+      <w:r>
+        <w:t>Frost Falls</w:t>
+      </w:r>
+    </w:p>
+    <w:p/>
+    <w:p>
+      <w:r>
+        <w:t>Livro 2</w:t>
+      </w:r>
+    </w:p>
+    <w:p/>
+    <w:p/>
+    <w:p>
+      <w:r>
+        <w:t>Lisa Bouchard</w:t>
+      </w:r>
+    </w:p>
+    <w:p>
+      <w:r>
+        <w:t>Copyright 2026 por Lisa Bouchard.</w:t>
+      </w:r>
+    </w:p>
+    <w:p/>
+    <w:p>
+      <w:r>
+        <w:t>Segunda Edição</w:t>
+      </w:r>
+    </w:p>
+    <w:p/>
+    <w:p>
+      <w:r>
+        <w:t>Todos os direitos reservados.</w:t>
+      </w:r>
+    </w:p>
+    <w:p/>
+    <w:p>
+      <w:r>
+        <w:t>Nenhuma parte desta publicação pode ser reproduzida, distribuída ou transmitida de nenhuma forma ou por nenhum meio, incluindo fotocópia, gravação ou outros métodos eletrônicos ou mecânicos, sem a permissão prévia por escrito da editora, exceto conforme permitido pela lei de direitos autorais dos Estados Unidos.</w:t>
+      </w:r>
+    </w:p>
+    <w:p/>
+    <w:p>
+      <w:r>
+        <w:t>A história, todos os nomes, personagens e incidentes retratados nesta produção são fictícios. Nenhuma identificação com pessoas reais (vivas ou falecidas), lugares, edifícios e produtos é pretendida ou deve ser inferida.</w:t>
+      </w:r>
+    </w:p>
+    <w:p>
+      <w:r>
+        <w:t>Livros desta Série</w:t>
+      </w:r>
+    </w:p>
+    <w:p>
+      <w:r>
+        <w:t xml:space="preserve">&lt;bt&gt;Frost and Found&lt;/bt&gt;</w:t>
+      </w:r>
+    </w:p>
+    <w:p>
+      <w:r>
+        <w:t xml:space="preserve">&lt;bt&gt;Inn Trouble&lt;/bt&gt;</w:t>
+      </w:r>
+    </w:p>
+    <w:p>
+      <w:r>
+        <w:t>Sumário</w:t>
+      </w:r>
+    </w:p>
+    <w:p>
+      <w:r>
+        <w:t>Sobre este Livro</w:t>
+      </w:r>
+    </w:p>
+    <w:p>
+      <w:r>
+        <w:t>Capítulo 31</w:t>
+      </w:r>
+    </w:p>
+    <w:p/>
+    <w:p>
+      <w:r>
+        <w:t xml:space="preserve">O Que Vem a Seguir?</w:t>
+      </w:r>
+    </w:p>
+    <w:p>
+      <w:r>
+        <w:t xml:space="preserve">Trecho de </w:t>
+      </w:r>
+      <w:r>
+        <w:t>&lt;bt&gt;</w:t>
+      </w:r>
+      <w:r>
+        <w:t>Flour Play</w:t>
+      </w:r>
+      <w:r>
+        <w:t>&lt;/bt&gt;</w:t>
+      </w:r>
+    </w:p>
+    <w:p>
+      <w:r>
+        <w:t>Sobre Este Livro</w:t>
+      </w:r>
+    </w:p>
+    <w:p>
+      <w:r>
+        <w:t>A Winter Wonderland Inn já aqueceu metade de Frost Falls em algum momento. Fiona Okafor a administra do mesmo modo que sua família a administra há cem anos, e hoje de manhã ela abotoou o cardigã errado e não consegue parar de olhar para a porta.</w:t>
+      </w:r>
+    </w:p>
+    <w:p>
+      <w:r>
+        <w:t xml:space="preserve">O bilhete exige meio milhão de dólares. Ele sabe o que sua bisavó tirou dos Blackburn em 1924, e a loja a duas cidades daqui onde ela o vendeu, e nomeia a pedra no coração do broche — detalhes que existem exatamente em um baú trancado no sótão de Fiona e em outro lugar na cidade.</w:t>
+      </w:r>
+    </w:p>
+    <w:p>
+      <w:r>
+        <w:t xml:space="preserve">Jessica Claus começa pelo lugar de onde o conhecimento poderia ter vindo, em vez daquele para o qual a cidade gostaria que ele levasse. Um ferreiro a quem deviam vinte dólares e que se recusou a dar uma resposta direta. Um estranho distribuindo cartões sobre um broche desaparecido para quem quiser aceitá-los. Um historiador dormindo em uma cama de campanha ao lado de uma caldeira que ele não tem condições de consertar.</w:t>
+      </w:r>
+    </w:p>
+    <w:p>
+      <w:r>
+        <w:t>Alguém leu um segredo de cem anos à luz de uma lamparina e decidiu vendê-lo. Provar isso custará a Jessica a semana mais calorosa que a cidade teve em anos — e o perdão, ela está aprendendo aqui, não é a mesma coisa que esquecer.</w:t>
+      </w:r>
+    </w:p>
+    <w:p>
+      <w:r>
         <w:t>Capítulo 1</w:t>
       </w:r>
     </w:p>
     <w:p/>
     <w:p>
       <w:r>
-        <w:t>Problema na Pousada</w:t>
-      </w:r>
-    </w:p>
-    <w:p/>
-    <w:p>
-      <w:r>
-        <w:t>Frost Falls</w:t>
-      </w:r>
-    </w:p>
-    <w:p/>
-    <w:p>
-      <w:r>
-        <w:t>Livro 2</w:t>
-      </w:r>
-    </w:p>
-    <w:p/>
-    <w:p/>
-    <w:p>
-      <w:r>
-        <w:t>Lisa Bouchard</w:t>
-      </w:r>
-    </w:p>
-    <w:p>
-      <w:r>
-        <w:t>Copyright 2026 por Lisa Bouchard.</w:t>
-      </w:r>
-    </w:p>
-    <w:p/>
-    <w:p>
-      <w:r>
-        <w:t>Segunda Edição</w:t>
-      </w:r>
-    </w:p>
-    <w:p/>
-    <w:p>
-      <w:r>
-        <w:t>Todos os direitos reservados.</w:t>
-      </w:r>
-    </w:p>
-    <w:p/>
-    <w:p>
-      <w:r>
-        <w:t>Nenhuma parte desta publicação pode ser reproduzida, distribuída ou transmitida de nenhuma forma ou por nenhum meio, incluindo fotocópia, gravação ou outros métodos eletrônicos ou mecânicos, sem a permissão prévia por escrito da editora, exceto conforme permitido pela lei de direitos autorais dos Estados Unidos.</w:t>
-      </w:r>
-    </w:p>
-    <w:p/>
-    <w:p>
-      <w:r>
-        <w:t>A história, todos os nomes, personagens e incidentes retratados nesta produção são fictícios. Nenhuma identificação com pessoas reais (vivas ou falecidas), lugares, edifícios e produtos é pretendida ou deve ser inferida.</w:t>
-      </w:r>
-    </w:p>
-    <w:p>
-      <w:r>
-        <w:t>Livros desta Série</w:t>
-      </w:r>
-    </w:p>
-    <w:p>
-      <w:r>
-        <w:t>Frost and Found</w:t>
-      </w:r>
-    </w:p>
-    <w:p>
-      <w:r>
-        <w:t>Inn Trouble</w:t>
-      </w:r>
-    </w:p>
-    <w:p>
-      <w:r>
-        <w:t>Sumário</w:t>
-      </w:r>
-    </w:p>
-    <w:p>
-      <w:r>
-        <w:t>Sobre este Livro</w:t>
-      </w:r>
-    </w:p>
-    <w:p>
-      <w:r>
-        <w:t>Capítulo 31</w:t>
-      </w:r>
-    </w:p>
-    <w:p/>
-    <w:p>
-      <w:r>
-        <w:t>O Que Vem A Seguir?</w:t>
-      </w:r>
-    </w:p>
-    <w:p>
-      <w:r>
-        <w:t xml:space="preserve">Trecho de </w:t>
-      </w:r>
-      <w:r>
-        <w:t>&lt;bt&gt;</w:t>
-      </w:r>
-      <w:r>
-        <w:t>Flour Play</w:t>
-      </w:r>
-      <w:r>
-        <w:t>&lt;/bt&gt;</w:t>
-      </w:r>
-    </w:p>
-    <w:p>
-      <w:r>
-        <w:t>Sobre Este Livro</w:t>
-      </w:r>
-    </w:p>
-    <w:p>
-      <w:r>
-        <w:t>A Winter Wonderland Inn já aqueceu metade de Frost Falls em algum momento. Fiona Okafor a administra do mesmo modo que sua família a administra há cem anos, e hoje de manhã ela abotoou o cardigã errado e não consegue parar de olhar para a porta.</w:t>
-      </w:r>
-    </w:p>
-    <w:p>
-      <w:r>
-        <w:t>O bilhete exige meio milhão de dólares. Ele sabe o que sua bisavó tirou dos Blackburn em 1924, e a loja a duas cidades daqui onde ela o vendeu, e menciona a safira no coração do broche — detalhes que existem exatamente em um baú trancado no sótão de Fiona e em outro lugar na cidade.</w:t>
-      </w:r>
-    </w:p>
-    <w:p>
-      <w:r>
-        <w:t>Jessica Claus começa pelo lugar de onde o conhecimento poderia ter vindo, em vez daquele para o qual a cidade gostaria que ele levasse. Um ferreiro devia vinte dólares e recusou uma resposta direta. Um estranho distribuindo cartões sobre um broche desaparecido para quem quiser aceitá-los. Um historiador dormindo em uma cama de campanha ao lado de uma caldeira que ele não tem condições de consertar.</w:t>
-      </w:r>
-    </w:p>
-    <w:p>
-      <w:r>
-        <w:t>Alguém leu um segredo de cem anos à luz de uma lamparina e decidiu vendê-lo. Provar isso custará a Jessica a semana mais calorosa que a cidade teve em anos — e o perdão, ela está aprendendo aqui, não é a mesma coisa que esquecer.</w:t>
-      </w:r>
-    </w:p>
-    <w:p>
-      <w:r>
-        <w:t>Capítulo 1</w:t>
-      </w:r>
-    </w:p>
-    <w:p/>
-    <w:p>
-      <w:r>
         <w:t>A torta ainda estava morna quando a coloquei na cesta — morna a ponto de o vapor embaçar o vidro da janela fria da cozinha —, e o cômodo inteiro cheirava a canela, maçãs e ao açúcar mascavo que eu deixara passar um tom do ponto dourado porque Fiona gostava dele assim. Ela me dissera uma vez que a mãe queimava o açúcar de propósito, bem no limite, onde ele deixa de ser doce e começa a virar algo mais profundo. O cheiro daquilo, dizia ela, era o cheiro de ser pequena e estar segura numa cozinha quente num dia frio. Eu fazia assim para ela desde então.</w:t>
       </w:r>
     </w:p>
@@ -162,13 +162,13 @@
     <w:p/>
     <w:p>
       <w:r>
-        <w:t>Ela piou uma vez, o pio curto e agudo que significava pressa, sacudiu as penas da cauda e saiu waddled para a varanda assim que abri a porta, como se tivesse sido ela a esperar por mim e não o contrário.</w:t>
-      </w:r>
-    </w:p>
-    <w:p/>
-    <w:p>
-      <w:r>
-        <w:t>A manhã era meio outono e meio algo mais frio. Essa foi a primeira coisa que notei ao descer os degraus da varanda com a cesta no braço. Os bordos ao longo da Evergreen Avenue haviam derrubado a maior parte de seu ouro durante o fim de semana, e o que restava caía em pequenas rajadas secas sempre que o vento mudava, deslizando rapidamente pelo pavimento e amontoando-se nas sarjetas. Sob o cheiro de folhas secas do final do outono, havia um toque limpo e gélido no ar que eu conhecia há muito tempo. Neve. Talvez não hoje, talvez não amanhã. Mas a caminho. Já caíra neve, na semana em que achamos o cachorro de Martha, dez centímetros dela, mas uma sequência de dias amenos a fizera sumir de novo, e ninguém na cidade estava pronto para acreditar no inverno ainda. Havia luzes laranjas nas vitrines das lojas e abóboras em cada varanda, e todos que eu conhecia estavam ocupados com o festival de Halloween.</w:t>
+        <w:t xml:space="preserve">Ela piou uma vez, o pio curto e agudo que significava pressa, sacudiu as penas da cauda e saiu gingando para a varanda assim que abri a porta, como se tivesse sido ela a esperar por mim e não o contrário.</w:t>
+      </w:r>
+    </w:p>
+    <w:p/>
+    <w:p>
+      <w:r>
+        <w:t xml:space="preserve">A manhã era meio outono e meio algo mais frio. Essa foi a primeira coisa que notei ao descer os degraus da varanda com a cesta no braço. Os bordos ao longo da Avenida Evergreen haviam derrubado a maior parte de seu ouro durante o fim de semana, e o que restava caía em pequenas rajadas secas sempre que o vento mudava, deslizando rapidamente pelo pavimento e amontoando-se nas sarjetas. Sob o cheiro de folhas secas do final do outono, havia um toque limpo e gélido no ar que eu conhecia há muito tempo. Neve. Talvez não hoje, talvez não amanhã. Mas a caminho. Já caíra neve, na semana em que achamos o cachorro de Martha, dez centímetros dela, mas uma sequência de dias amenos a fizera sumir de novo, e ninguém na cidade estava pronto para acreditar no inverno ainda. Havia luzes laranjas nas vitrines das lojas e abóboras em cada varanda, e todos que eu conhecia estavam ocupados com o festival de Halloween.</w:t>
       </w:r>
     </w:p>
     <w:p/>
@@ -186,7 +186,7 @@
     <w:p/>
     <w:p>
       <w:r>
-        <w:t>A Winter Wonderland Inn ficava onde a Evergreen Avenue se alargava em direção ao gramado da praça, uma casa alta de empenas pintada no tom cinza-esverdeado suave de um céu de inverno, com uma varanda que abraçava dois de seus lados como um braço lançado sobre os ombros de um amigo. Parecia ter nascido ali em vez de ter sido construída. Fiona pendurara uma guirlanda na porta da entrada, e parei no pé da escadaria para admirá-la, como fazia toda vez que passava. Era um círculo gordo de sempre-verde, denso e escuro, entremeado por uma fita dourada larga e cravejado de pinhas que ela mesma dourara, com um único raminho de abrideira para dar o toque laranja da estação.</w:t>
+        <w:t xml:space="preserve">A Winter Wonderland Inn ficava onde a Avenida Evergreen se alargava em direção à praça, uma casa alta de empenas pintada no tom cinza-esverdeado suave de um céu de inverno, com uma varanda que abraçava dois de seus lados como um braço lançado sobre os ombros de um amigo. Parecia ter nascido ali em vez de ter sido construída. Fiona pendurara uma guirlanda na porta da entrada, e parei no pé da escadaria para admirá-la, como fazia toda vez que passava. Era um círculo gordo de sempre-verde, denso e escuro, entremeado por uma fita dourada larga e cravejado de pinhas que ela mesma dourara, com um único raminho de doce-amarga para dar o toque laranja da estação.</w:t>
       </w:r>
     </w:p>
     <w:p/>
@@ -210,7 +210,7 @@
     <w:p/>
     <w:p>
       <w:r>
-        <w:t>O saguão estava quente com o calor bom e profundo de uma lareira que estava acesa desde antes do amanhecer. Cheirava a café e fumaça de madeira sobrepostos ao cheiro mais antigo da própria casa, cera de abelha e madeira velha. Os hóspedes sentavam-se nas poltronas baixas, um casal junto à janela com um mapa aberto entre eles, uma mulher mais velha perto da lareira com um livro de bolso, e o cômodo exibia o murmúrio tranquilo de um lugar onde as pessoas se sentem à vontade. Havia um cheiro novo por baixo de tudo aquilo naquela manhã, no entanto, agudo e um tanto metálico, que a princípio não consegui identificar. Quando olhei em volta, compreendi. O trabalho de metal de Sam Patel estava em toda parte para onde eu olhava. Ele fizera os suportes de lâmpada ao longo das paredes, a alta tela de proteção na lareira e uma fileira de estrelas de ferro preto ao longo da lareira para o festival, e o cômodo da frente inteiro adotara o aroma fraco e limpo da forja, misturado ao ar como o cheiro de pão numa cozinha.</w:t>
+        <w:t xml:space="preserve">O saguão estava quente com o calor bom e profundo de uma lareira que estava acesa desde antes do amanhecer. Cheirava a café e fumaça de madeira sobrepostos ao cheiro mais antigo da própria casa, cera de abelha e madeira velha. Os hóspedes sentavam-se nas poltronas baixas, um casal junto à janela com um mapa aberto entre eles, uma mulher mais velha perto da lareira com um livro de bolso, e o cômodo exibia o murmúrio tranquilo de um lugar onde as pessoas se sentem à vontade. Havia um cheiro novo por baixo de tudo aquilo naquela manhã, no entanto, agudo e um tanto metálico, que a princípio não consegui identificar. Quando olhei em volta, compreendi. O trabalho de metal de Sam Patel estava em toda parte para onde eu olhava. Ele fizera os suportes de lâmpada ao longo das paredes, a alta tela de proteção na lareira e uma fileira de estrelas de ferro preto ao longo da cornija da lareira para o festival, e o cômodo da frente inteiro adotara o aroma fraco e limpo da forja, misturado ao ar como o cheiro de pão numa cozinha.</w:t>
       </w:r>
     </w:p>
     <w:p/>
@@ -228,7 +228,7 @@
     <w:p/>
     <w:p>
       <w:r>
-        <w:t>— Jéssica. — Até a voz dela estava errada, fraca onde deveria ser calorosa. — Não precisava.</w:t>
+        <w:t xml:space="preserve">— Jessica. — Até a voz dela estava errada, fraca onde deveria ser calorosa. — Não precisava.</w:t>
       </w:r>
     </w:p>
     <w:p/>
@@ -306,7 +306,7 @@
     <w:p/>
     <w:p>
       <w:r>
-        <w:t>Era Sam Patel desta vez, entrando de costas com um caixote de ferro nos braços, os suportes de varanda tinindo abafados uns contra os outros enquanto ele se virava e os depositava perto do balcão com um gemido. Sam era um homem grandalhão e cuidadoso, com fuligem entranhada tão fundo nas dobras dos nós dos dedos que eu duvidava que o sabão pudesse alcançá-la, e normalmente exibia a calma despreocupada de um artífice. Não restava nada disso agora. Ele atravessou o salão até Fiona com o maxilar travado.</w:t>
+        <w:t xml:space="preserve">Era Sam Patel desta vez, entrando de costas com um caixote de ferro nos braços, os suportes de varanda tinindo abafados uns contra os outros enquanto ele se virava e os depositava perto do balcão com um grunhido. Sam era um homem grandalhão e cuidadoso, com fuligem entranhada tão fundo nas dobras dos nós dos dedos que eu duvidava que o sabão pudesse alcançá-la, e normalmente exibia a calma despreocupada de um artífice. Não restava nada disso agora. Ele atravessou o salão até Fiona com o maxilar travado.</w:t>
       </w:r>
     </w:p>
     <w:p/>
@@ -366,13 +366,13 @@
     <w:p/>
     <w:p>
       <w:r>
-        <w:t>— Jéssica Claus. — O aperto dele foi firme, rápido e seco, o aperto de mãos de quem cumprimenta muita gente.</w:t>
-      </w:r>
-    </w:p>
-    <w:p/>
-    <w:p>
-      <w:r>
-        <w:t>— Claus. — Ele sorriu, e era um bom sorriso, fácil e treinado, mas eu confiava nele tanto quanto conseguiria arremessar a tela da lareira. — Então a senhora é a famosa Sra. Claus. Que absolutamente maravilhoso. Eu tinha ouvido falar, é claro, a gente sempre ouve, mas não acreditava bem até agora. — Ele inclinou-se um nadinha, confidencial: — Diga-me. As famílias antigas por aqui, os Blackburn e o resto, as coisas deles ainda andam pela cidade? Heranças, móveis, joias, esse tipo de coisa? Estou rastreando uma peça, por acaso. Um broche.</w:t>
+        <w:t xml:space="preserve">— Jessica Claus. — O aperto dele foi firme, rápido e seco, o aperto de mãos de quem cumprimenta muita gente.</w:t>
+      </w:r>
+    </w:p>
+    <w:p/>
+    <w:p>
+      <w:r>
+        <w:t xml:space="preserve">— Claus. — Ele sorriu, e era um bom sorriso, fácil e treinado, mas eu confiava nele tanto quanto conseguiria arremessar a tela da lareira. — Então a senhora é a famosa Sra. Claus. Que coisa maravilhosa. Eu tinha ouvido falar, é claro, a gente sempre ouve, mas não acreditava bem até agora. — Ele inclinou-se um nadinha, confidencial: — Diga-me. As famílias antigas por aqui, os Blackburn e o resto, as coisas deles ainda andam pela cidade? Heranças, móveis, joias, esse tipo de coisa? Estou rastreando uma peça, por acaso. Um broche.</w:t>
       </w:r>
     </w:p>
     <w:p/>
@@ -432,19 +432,19 @@
     <w:p/>
     <w:p>
       <w:r>
-        <w:t>Ela me lançou um olhar de profunda e ancestral traição. Então, como não estava acima de um pouco de maldade, empurrou a mesinha com o ombro ao passar. Todo o arranjo de cristal balançou. Meia dúzia de hóspedes prenderam a respiração ao mesmo tempo, a senhora mais velha perto da lareira quase se levantou da cadeira, e a tigela acomodou-se de volta no lugar. Consegui tirar nós duas pela porta da frente e levar-nos à varanda antes que meu vergonhoso pinguim pudesse terminar o que começara.</w:t>
-      </w:r>
-    </w:p>
-    <w:p/>
-    <w:p>
-      <w:r>
-        <w:t>Lá fora, o frio foi um alívio após a preocupação sufocante e morna do saguão. Fiquei um momento no parapeito da varanda e deixei que ele me limpasse a mente. Lá embaixo, no gramado da praça, homens em escadas esticavam as luzes do festival entre os postes de iluminação, chamando uns aos outros. Um cachorro latia em algum lugar na direção do parque, e o trem emitiu seu apito distante ao entrar na estação. Tudo aquilo era tão comum que o mal-estar no rosto de Fiona pareceu por um instante algo que eu havia imaginado.</w:t>
-      </w:r>
-    </w:p>
-    <w:p/>
-    <w:p>
-      <w:r>
-        <w:t>Desci os degraus e, quando me virei lá embaixo para olhar a estalagem de novo, o fio mais próximo de luzes laranjas do festival ao longo dos beirais piscou.</w:t>
+        <w:t xml:space="preserve">Ela me lançou um olhar de profunda e ancestral traição. Então, como não se furtava a uma pequena maldade, empurrou a mesinha com o ombro ao passar. Todo o arranjo de cristal balançou. Meia dúzia de hóspedes prenderam a respiração ao mesmo tempo, a senhora mais velha perto da lareira quase se levantou da cadeira, e a tigela acomodou-se de volta no lugar. Consegui tirar nós duas pela porta da frente e levar-nos à varanda antes que meu vergonhoso pinguim pudesse terminar o que começara.</w:t>
+      </w:r>
+    </w:p>
+    <w:p/>
+    <w:p>
+      <w:r>
+        <w:t xml:space="preserve">Lá fora, o frio foi um alívio após a preocupação sufocante e morna do saguão. Fiquei um momento no parapeito da varanda e deixei que ele me limpasse a mente. Lá embaixo, na praça, homens em escadas esticavam as luzes do festival entre os postes de iluminação, chamando uns aos outros. Um cachorro latia em algum lugar na direção do parque, e o trem emitiu seu apito distante ao entrar na estação. Tudo aquilo era tão comum que o mal-estar no rosto de Fiona pareceu por um instante algo que eu havia imaginado.</w:t>
+      </w:r>
+    </w:p>
+    <w:p/>
+    <w:p>
+      <w:r>
+        <w:t xml:space="preserve">Desci os degraus e, quando me virei lá embaixo para olhar a pousada de novo, o fio mais próximo de luzes laranjas do festival ao longo dos beirais piscou.</w:t>
       </w:r>
     </w:p>
     <w:p/>
@@ -474,7 +474,7 @@
     <w:p/>
     <w:p>
       <w:r>
-        <w:t>Não era nada. Um fio solto. Uma peça do frio em olhos cansados. Repeti isso a mim mesma durante todo o caminho de volta pela Evergreen Avenue, passando pela padaria onde o pão da manhã perfurava o quarteirão inteiro, passando pelo gramado com suas luzes semipenduradas, passando pelo esqueleto leitor de jornal do Gazette. Um fio solto. Só isso.</w:t>
+        <w:t xml:space="preserve">Não era nada. Um fio solto. Um truque do frio em olhos cansados. Repeti isso a mim mesma durante todo o caminho de volta pela Avenida Evergreen, passando pela padaria onde o pão da manhã perfumava o quarteirão inteiro, passando pela praça com suas luzes semipenduradas, passando pelo esqueleto leitor de jornal do Gazette. Um fio solto. Só isso.</w:t>
       </w:r>
     </w:p>
     <w:p/>
@@ -498,7 +498,7 @@
     <w:p/>
     <w:p>
       <w:r>
-        <w:t>Ela piou, impenitente. Fomos para casa na manhã fria e dourada, e não me virei para olhar os beirais da estalagem, embora parte de mim quisesse ver se as luzes ali ainda estavam laranjas ou se tinham voltado a ser discretamente douradas enquanto eu estava de costas.</w:t>
+        <w:t xml:space="preserve">Ela piou, impenitente. Fomos para casa na manhã fria e dourada, e não me virei para olhar os beirais da pousada, embora parte de mim quisesse ver se as luzes ali ainda estavam laranjas ou se tinham voltado a ser discretamente douradas enquanto eu estava de costas.</w:t>
       </w:r>
     </w:p>
     <w:p>
@@ -527,7 +527,7 @@
     <w:p/>
     <w:p>
       <w:r>
-        <w:t>— Jéssica? — A voz de Fiona estava fina e retesada como um arame. Por baixo dela, dava para ouvir sua respiração errada, rápida e curta. — Você poderia vir? Até a pousada. Agora, se puder dar um jeito. Por favor.</w:t>
+        <w:t xml:space="preserve">— Jessica? — A voz de Fiona estava fina e retesada como um arame. Por baixo dela, dava para ouvir sua respiração errada, rápida e curta. — Você poderia vir? Até a pousada. Agora, se puder dar um jeito. Por favor.</w:t>
       </w:r>
     </w:p>
     <w:p/>
@@ -539,7 +539,7 @@
     <w:p/>
     <w:p>
       <w:r>
-        <w:t>— Não. Não, nada disso. Eu só... — Um suspiro. — Não posso falar pelo telefone. Por favor, Jéssica. Preciso de você. Preciso de uma amiga.</w:t>
+        <w:t xml:space="preserve">— Não. Não, nada disso. Eu só... — Um suspiro. — Não posso falar pelo telefone. Por favor, Jessica. Preciso de você. Preciso de uma amiga.</w:t>
       </w:r>
     </w:p>
     <w:p/>
@@ -581,7 +581,7 @@
     <w:p/>
     <w:p>
       <w:r>
-        <w:t xml:space="preserve">Fiona apareceu por uma porta lateral antes que eu chegasse à metade do caminho, com o rosto abatido e pálido, o cardigã abotoado direito hoje, mas todo o resto nela parecia errado. Ela segurou meu braço com a mão fria e me puxou para a salinha de estar que ficava ao lado do saguão, aquela que ela reservava para conversas particulares e chá da tarde com amigos. Ela fechou a porta atrás de nós, e os sons abafados da pousada acordando desapareceram. O relógio de fuso no canto fazia </w:t>
+        <w:t xml:space="preserve">Fiona apareceu por uma porta lateral antes que eu chegasse à metade do caminho, com o rosto abatido e pálido, o cardigã abotoado direito hoje, mas todo o resto nela parecia errado. Ela segurou meu braço com a mão fria e me puxou para a salinha de estar que ficava ao lado do saguão, aquela que ela reservava para conversas particulares e chá da tarde com amigos. Ela fechou a porta atrás de nós, e os sons abafados da pousada acordando desapareceram. O relógio de pé no canto fazia </w:t>
       </w:r>
       <w:r>
         <w:rPr>
@@ -632,7 +632,7 @@
     <w:p/>
     <w:p>
       <w:r>
-        <w:t xml:space="preserve">Li tudo duas vezes. O relógio de fuso fazia </w:t>
+        <w:t xml:space="preserve">Li tudo duas vezes. O relógio de pé fazia </w:t>
       </w:r>
       <w:r>
         <w:rPr>
@@ -665,13 +665,13 @@
     <w:p/>
     <w:p>
       <w:r>
-        <w:t>— Esta é sua bisavó? — perguntei. — Constança?</w:t>
-      </w:r>
-    </w:p>
-    <w:p/>
-    <w:p>
-      <w:r>
-        <w:t>— Não. — A voz de Fiona falhou. — Não, essa é uma Blackburn. Uma das antigas Blackburn, da época em que eles tinham todo o dinheiro do condado. Eu nem sei o nome dela. — Ela tocou a borda amarronzada da fotografia. — Constança guardou aquilo todos aqueles anos. Acho que foi o broche que ela não conseguiu largar, não a mulher. Mas o broche que ela está usando. — Ela pressionou a mão espalmada contra o peito, como se doesse ali. — O broche é nosso, Jéssica. É isso que eles estão usando contra mim. Aquele broche.</w:t>
+        <w:t xml:space="preserve">— Esta é sua bisavó? — perguntei. — Constance?</w:t>
+      </w:r>
+    </w:p>
+    <w:p/>
+    <w:p>
+      <w:r>
+        <w:t xml:space="preserve">— Não. — A voz de Fiona falhou. — Não, essa é uma Blackburn. Uma das antigas Blackburn, da época em que eles tinham todo o dinheiro do condado. Eu nem sei o nome dela. — Ela tocou a borda amarronzada da fotografia. — Constance guardou aquilo todos aqueles anos. Acho que foi o broche que ela não conseguiu largar, não a mulher. Mas o broche que ela está usando. — Ela pressionou a mão espalmada contra o peito, como se doesse ali. — O broche é nosso, Jessica. É isso que eles estão usando contra mim. Aquele broche.</w:t>
       </w:r>
     </w:p>
     <w:p/>
@@ -683,7 +683,7 @@
     <w:p/>
     <w:p>
       <w:r>
-        <w:t>— Em 1924, minha bisavó, Constança Okafor, trabalhava como empregada para os Blackburn — disse ela. — Ela era jovem. Dezenove, vinte anos talvez. Eles eram a família mais rica de Frost Falls na época, os mais ricos num raio de cinquenta quilômetros, e ela limpava os quartos deles, acendia as lareiras e tirava o pó das coisas, inclusive daqueles broches, dia após dia. — Ela puxou o ar num suspiro trêmulo. — E num inverno, Constança o levou. Ela o roubou, Jéssica. Aquele broche, direto da penteadeira ou de dentro do porta-joias, não sei exatamente como. E ela o tirou daquela casa e nunca mais voltou.</w:t>
+        <w:t xml:space="preserve">— Em 1924, minha bisavó, Constance Okafor, trabalhava como empregada para os Blackburn — disse ela. — Ela era jovem. Dezenove, vinte anos talvez. Eles eram a família mais rica de Frost Falls na época, os mais ricos num raio de cinquenta quilômetros, e ela limpava os quartos deles, acendia as lareiras e tirava o pó das coisas, inclusive aquele broche, dia após dia. — Ela puxou o ar num suspiro trêmulo. — E num inverno, Constance o levou. Ela o roubou, Jessica. Aquele broche, direto da penteadeira ou de dentro do porta-joias, não sei exatamente como. E ela o tirou daquela casa e nunca mais voltou.</w:t>
       </w:r>
     </w:p>
     <w:p/>
@@ -740,7 +740,7 @@
     <w:p/>
     <w:p>
       <w:r>
-        <w:t>— Mas você não percebe? — Ela balançou a cabeça, angustiada. — Não importa o que é verdade a meu respeito. Só importa o que eles podem dizer. Se isso vazar, arruína tudo. O nome da pousada. O nome da minha família. Cem anos de trabalho, perdidos por causa de uma garota que nunca conheci e de algo que nunca fiz. — Ela apontou para o bilhete. — E agora alguém sabe. Alguém sabe, Jéssica, e eu não entendo como, porque aquele baú fica trancado no sótão e eu sou a única pessoa viva que já o abriu. A única. Então, como?</w:t>
+        <w:t xml:space="preserve">— Mas você não percebe? — Ela balançou a cabeça, angustiada. — Não importa o que é verdade a meu respeito. Só importa o que eles podem dizer. Se isso vazar, arruína tudo. O nome da pousada. O nome da minha família. Cem anos de trabalho, perdidos por causa de uma garota que nunca conheci e de algo que nunca fiz. — Ela apontou para o bilhete. — E agora alguém sabe. Alguém sabe, Jessica, e eu não entendo como, porque aquele baú fica trancado no sótão e eu sou a única pessoa viva que já o abriu. A única. Então, como?</w:t>
       </w:r>
     </w:p>
     <w:p/>
@@ -752,7 +752,7 @@
     <w:p/>
     <w:p>
       <w:r>
-        <w:t>Peguei o bilhete de volta e o li outra vez, com mais cuidado desta vez, e ao aproximá-lo para ler a caligrafia apertada, um cheiro emanou do papel. Fraco, mas presente. Átrio, um tanto metálico, com algo mineral por baixo. Eu o reconhecia de algum lugar recente e não conseguia, de jeito nenhum, me lembrar de onde.</w:t>
+        <w:t xml:space="preserve">Peguei o bilhete de volta e o li outra vez, com mais cuidado desta vez, e ao aproximá-lo para ler a caligrafia apertada, um cheiro emanou do papel. Fraco, mas presente. Penetrante, um tanto metálico, com algo mineral por baixo. Eu o reconhecia de algum lugar recente e não conseguia, de jeito nenhum, me lembrar de onde.</w:t>
       </w:r>
     </w:p>
     <w:p/>
@@ -794,7 +794,7 @@
     <w:p/>
     <w:p>
       <w:r>
-        <w:t>— Na Sociedade Histórica. — Ela disse isso quase num sussurro. — Theo tem caixas com coisas dos Blackburn. Ele as tem há anos. Ele passa os dias e as noites naquele arquivo se preparando para a exposição. — A mão dela foi tatear o peito de novo. — Ah, mas Jéssica. Não. Não o Theo. Não vou acreditar que o Theo faria isso. Ele leva chocolate quente para as crianças. Ele chorou na leitura do dia dos fundadores dois anos atrás. Não o Theo.</w:t>
+        <w:t xml:space="preserve">— Na Sociedade Histórica. — Ela disse isso quase num sussurro. — Theo tem caixas com coisas dos Blackburn. Ele as tem há anos. Ele passa os dias e as noites naquele arquivo se preparando para a exposição. — A mão dela foi tatear o peito de novo. — Ah, mas Jessica. Não. Não o Theo. Não vou acreditar que o Theo faria isso. Ele leva chocolate quente para as crianças. Ele chorou na leitura do dia dos fundadores dois anos atrás. Não o Theo.</w:t>
       </w:r>
     </w:p>
     <w:p/>
@@ -806,7 +806,7 @@
     <w:p/>
     <w:p>
       <w:r>
-        <w:t>— Leve-os. — Ela soltou um suspiro que quase foi uma risada, daquele tipo esgotado que não tem mais graça nenhuma. — Leve-os e, por favor, Jéssica, por favor, faça isso parar. Tenho passado todas as noites acordada fazendo contas no escuro. Eu não tenho isso. Quinhentos mil dólares. Não tenho um décimo disso. Tenho uma pousada cheia de amor, uma pilha de contas na gaveta do escritório e a boa semana dos Worthington. É só o que tenho neste mundo.</w:t>
+        <w:t xml:space="preserve">— Leve-os. — Ela soltou um suspiro que quase foi uma risada, daquele tipo esgotado que não tem mais graça nenhuma. — Leve-os e, por favor, Jessica, por favor, faça isso parar. Tenho passado todas as noites acordada fazendo contas no escuro. Eu não tenho isso. Quinhentos mil dólares. Não tenho um décimo disso. Tenho uma pousada cheia de amor, uma pilha de contas na gaveta do escritório e a boa semana dos Worthington. É só o que tenho neste mundo.</w:t>
       </w:r>
     </w:p>
     <w:p/>
@@ -830,7 +830,7 @@
     <w:p/>
     <w:p>
       <w:r>
-        <w:t>— Vamos dar jeito nisso — eu disse, e falei com a convicção do mundo inteiro. Meti o bilhete e a fotografia com cuidado no bolso interno do meu casaco, junto ao coração. — Ouviu o que eu disse? Você não vai mais carregar isso sozinha. Nem por mais um dia sequer. Custe o que custar, seja quem for que descubra ser, agora você tem uma amiga nisso, e eu sou muito teimosa, e tenho mais tempo e paciência do que qualquer pessoa que você conheça.</w:t>
+        <w:t xml:space="preserve">— Vamos dar jeito nisso — eu disse, e falei com a convicção do mundo inteiro. Meti o bilhete e a fotografia com cuidado no bolso interno do meu casaco, junto ao coração. — Ouviu o que eu disse? Você não vai mais carregar isso sozinha. Nem por mais um dia sequer. Custe o que custar, seja quem for, agora você tem uma amiga nisso, e eu sou muito teimosa, e tenho mais tempo e paciência do que qualquer pessoa que você conheça.</w:t>
       </w:r>
     </w:p>
     <w:p/>
@@ -863,13 +863,13 @@
     <w:p/>
     <w:p>
       <w:r>
-        <w:t>— Pip — eu disse, descendo os degraus brilhantes de geada. — Vamos à Sociedade Histórica. Hoje não. Quero pensar primeiro e falar com Nick. Mas logo. Vamos lá para ficar entre as caixas, e vamos descobrir quem has lido aquilo.</w:t>
-      </w:r>
-    </w:p>
-    <w:p/>
-    <w:p>
-      <w:r>
-        <w:t>Ela grasnou e pôs-se a marchar ao meu lado. Voltamos para casa pela cidade que acordava, e mantive a mão firmemente apoiada sobre o bilhete o caminho todo, sem olhar para as luzes do festival ao longo dos beirais.</w:t>
+        <w:t xml:space="preserve">— Pip — eu disse, descendo os degraus brilhantes de geada. — Vamos à Sociedade Histórica. Hoje não. Quero pensar primeiro e falar com Nick. Mas logo. Vamos lá para ficar entre as caixas, e vamos descobrir quem anda lendo aquelas caixas.</w:t>
+      </w:r>
+    </w:p>
+    <w:p/>
+    <w:p>
+      <w:r>
+        <w:t xml:space="preserve">Ela piou e pôs-se a marchar ao meu lado. Voltamos para casa pela cidade que acordava, e mantive a mão firmemente apoiada sobre o bilhete o caminho todo, sem olhar para as luzes do festival ao longo dos beirais.</w:t>
       </w:r>
     </w:p>
     <w:p>
@@ -886,13 +886,13 @@
     <w:p/>
     <w:p>
       <w:r>
-        <w:t>Nick conseguia me ler do outro lado do cômodo. Entrei batendo o frio das minhas botas, e ele deu uma olhada no meu rosto e não fez uma única pergunta. Conseguiu duas tigelas de algo com cevada, cenouras e o final dos alhos-porós do outono, colocou-as na mesa da cozinha e puxou minha cadeira. Esperou até que eu desse três colheradas antes de erguer sequer uma sobrancelha.</w:t>
-      </w:r>
-    </w:p>
-    <w:p/>
-    <w:p>
-      <w:r>
-        <w:t>Então eu contei a ele. Tudo, enquanto a sopa fumegava e Pip cochilava perto do fogão com uma nadadeira sobre os olhos. O telefonema. A salinha com o relógio barulhento. O bilhete, a fita vermelha e o dinheiro sob os degraus. A fotografia da mulher sem nome da família Blackburn com o broche no pescoço. Constance Okafor, com dezenas de anos ou vinte em um inverno rigoroso, o roubo, a casa de penhores duas cidades adiante em Ridgeline, a pousada comprada com o dinheiro. E o baú trancado no sótão que ninguém havia aberto além da própria Fiona.</w:t>
+        <w:t xml:space="preserve">Nick conseguia me ler do outro lado do cômodo. Entrei batendo o frio das minhas botas, e ele deu uma olhada no meu rosto e não fez uma única pergunta. Serviu duas tigelas de algo com cevada, cenouras e o final dos alhos-porós do outono, colocou-as na mesa da cozinha e puxou minha cadeira. Esperou até que eu desse três colheradas antes de erguer sequer uma sobrancelha.</w:t>
+      </w:r>
+    </w:p>
+    <w:p/>
+    <w:p>
+      <w:r>
+        <w:t xml:space="preserve">Então eu contei a ele. Tudo, enquanto a sopa fumegava e Pip cochilava perto do fogão com uma nadadeira sobre os olhos. O telefonema. A salinha com o relógio barulhento. O bilhete, a fita vermelha e o dinheiro sob os degraus. A fotografia da mulher sem nome da família Blackburn com o broche no pescoço. Constance Okafor, com dezenove ou vinte anos em um inverno rigoroso, o roubo, a casa de penhores duas cidades adiante em Ridgeline, a pousada comprada com o dinheiro. E o baú trancado no sótão que ninguém havia aberto além da própria Fiona.</w:t>
       </w:r>
     </w:p>
     <w:p/>
@@ -940,7 +940,7 @@
     <w:p/>
     <w:p>
       <w:r>
-        <w:t>— Theo Hussein — disse ele —, é um dos homens mais gentis de Frost Falls. Você sabe disso tão bem quanto eu. Ele quase chorou quando o deixamos fotografar o trenó antigo da oficina para a coleção dele. Ele traz achocolatado para a hora da leitura das crianças aos sábados, do bom, com os marshmallows pequenos, tirando do próprio bolso, porque diz que as crianças de Frost Falls devem crescer sabendo de onde vêm. — Ele olhou para mim. — Não estou dizendo isso para discutir com você. Estou dizendo porque é verdade, e porque você vai precisar manter isso como verdade até o fim de seja lá o que for isso, ou vai fazer as coisas malfeitas.</w:t>
+        <w:t xml:space="preserve">— Theo Hussein — disse ele —, é um dos homens mais gentis de Frost Falls. Você sabe disso tão bem quanto eu. Ele quase chorou quando o deixamos fotografar o trenó antigo da oficina para a coleção dele. Ele traz chocolate quente para a hora da leitura das crianças aos sábados, do bom, com os marshmallows pequenos, tirando do próprio bolso, porque diz que as crianças de Frost Falls devem crescer sabendo de onde vêm. — Ele olhou para mim. — Não estou dizendo isso para discutir com você. Estou dizendo porque é verdade, e porque você vai precisar manter isso como verdade até o fim de seja lá o que for isso, ou vai fazer as coisas malfeitas.</w:t>
       </w:r>
     </w:p>
     <w:p/>
@@ -1030,13 +1030,13 @@
     <w:p/>
     <w:p>
       <w:r>
-        <w:t>Aquela noite, antes de deitar, fui à janela, como sempre fazia, para olhar a cidade se acomodando para a noite. Nossa chalé ficava um pouco afastado do resto, subindo o caminho, com o pasto e o formato escuro da oficina logo além, e então a cidade logo abaixo. A cidade estava iluminada.</w:t>
-      </w:r>
-    </w:p>
-    <w:p/>
-    <w:p>
-      <w:r>
-        <w:t>As luzes do festival ao longo dos telhados distantes, os cordões que os homens haviam pendurado entre os postes de luz no gramado, brilhavam em tom dourado em vez de laranja, um dourado profundo e constante, cada fio delas, do gramado até a estação, até onde minha vista alcançava.</w:t>
+        <w:t xml:space="preserve">Aquela noite, antes de deitar, fui à janela, como sempre fazia, para olhar a cidade se acomodando para a noite. Nosso chalé ficava um pouco afastado do resto, subindo o caminho, com o pasto e o formato escuro da oficina logo além, e então a cidade logo abaixo. A cidade estava iluminada.</w:t>
+      </w:r>
+    </w:p>
+    <w:p/>
+    <w:p>
+      <w:r>
+        <w:t xml:space="preserve">As luzes do festival ao longo dos telhados distantes, os cordões que os homens haviam pendurado entre os postes de luz na praça, brilhavam em tom dourado em vez de laranja, um dourado profundo e constante, cada fio delas, da praça até a estação, até onde minha vista alcançava.</w:t>
       </w:r>
     </w:p>
     <w:p/>
@@ -1114,7 +1114,7 @@
     <w:p/>
     <w:p>
       <w:r>
-        <w:t>Ficamos ali mais um pouco, observando a cidade dourada, e depois subimos para deitar. Fiquei acordada um bom tempo no escuro, segurando duas coisas ao mesmo tempo. Em algum lugar lá embaixo em Frost Falls, uma pessoa estivera entre as caixas dos Blackburn e encontrara um jeito de fechar a mão ao redor do pescoço de uma boa mulher por meio milhão de dólares. E lá além do pasto meu marido estava construindo uma surpresa cujo nome ele não dizia, enquanto as luzes se tornavam douradas por conta própria e a magia que havíamos trazido conosco caía na escuridão à cata de um lugar para pousar.</w:t>
+        <w:t xml:space="preserve">Ficamos ali mais um pouco, observando a cidade dourada, e depois subimos para deitar. Fiquei acordada um bom tempo no escuro, segurando duas coisas ao mesmo tempo. Em algum lugar lá embaixo em Frost Falls, uma pessoa estivera entre as caixas dos Blackburn e encontrara um jeito de fechar a mão ao redor do pescoço de uma boa mulher por meio milhão de dólares. E lá além do pasto meu marido estava construindo uma surpresa cujo nome ele não dizia, enquanto as luzes se tornavam douradas por conta própria e a magia que havíamos trazido conosco saía pela escuridão à cata de um lugar para pousar.</w:t>
       </w:r>
     </w:p>
     <w:p/>
@@ -1137,10 +1137,10 @@
         <w:rPr>
           <w:i/>
         </w:rPr>
-        <w:t>FROST FALLS THROUGH THE YEARS</w:t>
-      </w:r>
-      <w:r>
-        <w:t>, com o último S espremido no final onde tinham calculado mal o espaçamento. Alguém mais — Greta, da padaria, pelo cheiro — havia montado uma mesa com cidra e biscoitos de gengibre logo na entrada, e o vapor quente e perfumado de especiarias chegava até a porta.</w:t>
+        <w:t xml:space="preserve">FROST FALLS ATRAVÉS DOS ANOS</w:t>
+      </w:r>
+      <w:r>
+        <w:t xml:space="preserve">, com o último S espremido no final onde tinham calculado mal o espaçamento. Alguém mais — Greta, da padaria, pelo cheiro — havia montado uma mesa com suco de maçã quente e biscoitos de gengibre logo na entrada, e o vapor quente e perfumado de especiarias chegava até a porta.</w:t>
       </w:r>
     </w:p>
     <w:p>
@@ -1150,7 +1150,7 @@
     </w:p>
     <w:p>
       <w:r>
-        <w:t>Lá dentro, todas as paredes haviam sido dedicadas à exposição. As paredes que geralmente exibiam mapas desbotados e um horário de trens de 1911 agora ostentavam cartas emolduradas, fotografias e escrituras amareladas. Cada uma estava rotulada com uma letra pequena, caprichada e inclinada que reconheci antes de ler uma única palavra, porque eu a vira nos cartões da hora de leitura das crianças e nas pequenas placas das vitrines do museu. A letra de Theo. Ele rotulava tudo. Ele teria rotulado a cidra se alguém o permitisse.</w:t>
+        <w:t xml:space="preserve">Lá dentro, todas as paredes haviam sido dedicadas à exposição. As paredes que geralmente exibiam mapas desbotados e um horário de trens de 1911 agora ostentavam cartas emolduradas, fotografias e escrituras amareladas. Cada uma estava rotulada com uma letra pequena, caprichada e inclinada que reconheci antes de ler uma única palavra, porque eu a vira nos cartões da hora de leitura das crianças e nas pequenas placas das vitrines do museu. A letra de Theo. Ele rotulava tudo. Ele teria rotulado o suco de maçã se alguém o permitisse.</w:t>
       </w:r>
     </w:p>
     <w:p>
@@ -1170,7 +1170,7 @@
     </w:p>
     <w:p>
       <w:r>
-        <w:t>— Jéssica! Você veio. — Ele atravessou o espaço até mim e segurou minhas duas mãos com as duas dele. As dele estavam frias, e eu senti o leve tremor nelas. — Não é incrível? Olhe para isso. Duzentos anos desta cidade, todos sob o mesmo teto, enfim. Continuo caminhando por aqui sem acreditar que consegui realizar. — Ele se inclinou, baixando a voz como se confidenciasse um grande segredo. — Entre, entre. Vou dizer algumas palavras assim que todos estiverem reunidos, e então você precisa ver tudo. Cada pedacinho. Digo sério. Quero que alguém realmente leia as legendas. As pessoas passam pelas legendas sem dar atenção.</w:t>
+        <w:t xml:space="preserve">— Jessica! Você veio. — Ele atravessou o espaço até mim e segurou minhas duas mãos com as duas dele. As dele estavam frias, e eu senti o leve tremor nelas. — Não é incrível? Olhe para isso. Duzentos anos desta cidade, todos sob o mesmo teto, enfim. Continuo caminhando por aqui sem acreditar que consegui realizar. — Ele se inclinou, baixando a voz como se confidenciasse um grande segredo. — Entre, entre. Vou dizer algumas palavras assim que todos estiverem reunidos, e então você precisa ver tudo. Cada pedacinho. Digo sério. Quero que alguém realmente leia as legendas. As pessoas passam pelas legendas sem dar atenção.</w:t>
       </w:r>
     </w:p>
     <w:p>
@@ -1231,7 +1231,7 @@
     </w:p>
     <w:p>
       <w:r>
-        <w:t>— Estou sempre atrás do meu broche. É o meu trabalho. — Ele se endireitou e enfiou o bloco de notas debaixo do braço. — Um homem veio falar comigo na mesa de cidra agora mesmo e me disse que os Blackburn já possuíram metade da Maple Street. Sabia disso? As pessoas adoram contar o que as famílias ricas possuíram. Nunca sabem dizer o que as famílias ricas fizeram com as pessoas que trabalhavam para elas. Essa parte não entra nos documentos da família. — Ele fez um gesto de cabeça em direção ao vidro. — Engraçado, não? Vinte anos de cartas e nem uma única escrita por uma empregada.</w:t>
+        <w:t xml:space="preserve">— Estou sempre atrás do meu broche. É o meu trabalho. — Ele se endireitou e enfiou o bloco de notas debaixo do braço. — Um homem veio falar comigo na mesa do suco de maçã agora mesmo e me disse que os Blackburn já possuíram metade da Maple Street. Sabia disso? As pessoas adoram contar o que as famílias ricas possuíram. Nunca sabem dizer o que as famílias ricas fizeram com as pessoas que trabalhavam para elas. Essa parte não entra nos documentos da família. — Ele fez um gesto de cabeça em direção ao vidro. — Engraçado, não? Vinte anos de cartas e nem uma única escrita por uma empregada.</w:t>
       </w:r>
     </w:p>
     <w:p>
@@ -1261,12 +1261,12 @@
     </w:p>
     <w:p>
       <w:r>
-        <w:t>Theo abaixou a cabeça, satisfeito, e passou a convidar todos para a cidra.</w:t>
-      </w:r>
-    </w:p>
-    <w:p>
-      <w:r>
-        <w:t>Eu não ri. Fiquei parada no meio da sala quente e risonha e senti o frio subir por dentro de mim, porque as cartas mais interessantes dos Blackburn, aquelas que diriam que um broche sumiu e onde ele foi parar, haviam se extraviado. E, dobrada no bolso interno do meu casaco, estava uma carta de chantagem que sabia exatamente o que aquelas cartas diziam.</w:t>
+        <w:t xml:space="preserve">Theo abaixou a cabeça, satisfeito, e passou a convidar todos para o suco de maçã.</w:t>
+      </w:r>
+    </w:p>
+    <w:p>
+      <w:r>
+        <w:t xml:space="preserve">Eu não ri. Fiquei parada no meio da sala quente e risonha e senti o frio subir por dentro de mim, porque as cartas mais interessantes dos Blackburn, aquelas que diriam que um broche sumiu e onde ele foi parar, haviam se extraviado. E, dobrado no bolso interno do meu casaco, estava um bilhete de chantagem que sabia exatamente o que aquelas cartas diziam.</w:t>
       </w:r>
     </w:p>
     <w:p>
@@ -1276,7 +1276,7 @@
     </w:p>
     <w:p>
       <w:r>
-        <w:t>O papel das vitrines era antigo, marrom, quebradiço nas dobras. Mas, na recepção, ao lado da caixa plana de Vera, havia uma pilha de papel timbrado da Sociedade, o estoque em branco que eles usavam para as etiquetas e os papéis de carta, na cor creme, um pouco mais pesado do que o papel comum, com uma textura levemente marcada em relevo, finas linhas paralelas que só se percebiam se o segurasse contra a luz ou se tivesse um motivo para procurar.</w:t>
+        <w:t xml:space="preserve">O papel das vitrines era antigo, marrom, quebradiço nas dobras. Mas, na recepção, ao lado da caixa plana de Vera, havia uma pilha de papel timbrado da Sociedade, o papel em branco que eles usavam para as etiquetas e os papéis de carta, na cor creme, um pouco mais pesado do que o papel comum, com uma textura levemente marcada em relevo, finas linhas paralelas que só se percebiam se o segurasse contra a luz ou se tivesse um motivo para procurar.</w:t>
       </w:r>
     </w:p>
     <w:p>
@@ -1286,7 +1286,7 @@
     </w:p>
     <w:p>
       <w:r>
-        <w:t>Não toquei na pilha. Nem diminuí o passo ao passar por ela. Apenas olhei, uma vez, mantive o rosto sereno e segui em direção à cidra como se papel fosse a última coisa no mundo em minha mente.</w:t>
+        <w:t xml:space="preserve">Não toquei na pilha. Nem diminuí o passo ao passar por ela. Apenas olhei, uma vez, mantive o rosto sereno e segui em direção ao suco de maçã como se papel fosse a última coisa no mundo em minha mente.</w:t>
       </w:r>
     </w:p>
     <w:p>
@@ -1296,7 +1296,7 @@
     </w:p>
     <w:p>
       <w:r>
-        <w:t>— Onde foi que você arrumou isso? — eu disse, e me agachuei para pegar, mas ela dançou bem fora do meu alcance, orgulhosa como uma duquesa em uma coroação. Fita vermelha. De toda a fita em um prédio enfeitado com dourado e laranja, ela fora justamente encontrar a única fita vermelha. Consegui tirá-la dela no fim, com cuidado, e a segurei na mão, uma espiral brilhante de cetim vermelho, o exato vermelho que a nota havia mandado Fiona pendurar em sua guirlanda, para que o chantagista soubesse que o dinheiro estava esperando debaixo da escada.</w:t>
+        <w:t xml:space="preserve">— Onde foi que você arrumou isso? — eu disse, e me agachei para pegar, mas ela dançou bem fora do meu alcance, orgulhosa como uma duquesa em uma coroação. Fita vermelha. De toda a fita em um prédio enfeitado com dourado e laranja, ela fora justamente encontrar a única fita vermelha. Consegui tirá-la dela no fim, com cuidado, e a segurei na mão, uma espiral brilhante de cetim vermelho, o exato vermelho que o bilhete havia mandado Fiona pendurar em sua guirlanda, para que o chantagista soubesse que o dinheiro estava esperando debaixo dos degraus.</w:t>
       </w:r>
     </w:p>
     <w:p>
@@ -1306,7 +1306,7 @@
     </w:p>
     <w:p>
       <w:r>
-        <w:t>Mas eu a dobrei e guardei no bolso do casaco mesmo assim, ao lado da nota. Endireitei o corpo e olhei para a sala quente e cheia de gente uma última vez. Para Theo, agachado agora junto à mesa de cidra, contando a um garotinho sobre a fundação da cidade com todo o seu coração cansado, com os olhos do menino arregalados. Para Vera, junto à mesa, ajeitando sua caixa de papéis por mais um quarto de polegada. Para Neil Carter, perto do vidro, escrevendo algo em seu bloco de notas. E para a pilha de papelaria cor creme ao lado do cotovelo de Vera, captando a luz.</w:t>
+        <w:t xml:space="preserve">Mas eu a dobrei e guardei no bolso do casaco mesmo assim, ao lado do bilhete. Endireitei o corpo e olhei para a sala quente e cheia de gente uma última vez. Para Theo, agachado agora junto à mesa do suco de maçã, contando a um garotinho sobre a fundação da cidade com todo o seu coração cansado, com os olhos do menino arregalados. Para Vera, junto à mesa, ajeitando sua caixa de papéis por mais meio centímetro. Para Neil Carter, perto do vidro, escrevendo algo em seu bloco de notas. E para a pilha de papelaria cor creme ao lado do cotovelo de Vera, captando a luz.</w:t>
       </w:r>
     </w:p>
     <w:p>
@@ -1316,7 +1316,7 @@
     </w:p>
     <w:p>
       <w:r>
-        <w:t>O que eu tinha de descobrir agora era quem estivera ali no silêncio, depois que as portas foram trancadas e as caixas ficaram sem vigilância, lendo um segredo de cem anos à luz de uma lâmpada e decidindo vendê-lo.</w:t>
+        <w:t xml:space="preserve">O que eu tinha de descobrir agora era quem estivera ali no silêncio, depois que as portas foram trancadas e as caixas ficaram sem vigilância, lendo um segredo de cem anos à luz de uma lamparina e decidindo vendê-lo.</w:t>
       </w:r>
     </w:p>
     <w:p>
@@ -1336,7 +1336,7 @@
         <w:t>Yarn Tales</w:t>
       </w:r>
       <w:r>
-        <w:t xml:space="preserve"> ficava na esquina da Evergreen com a Maple, com a vitrine cheia de meadas de lã organizadas por cor como uma caixa de tinta aberta. Lá dentro era aconchegante e penumbroso; cheirava a lã e à camomila que a Olivia sempre mantinha em infusão no fogareiro elétrico atrás do balcão. O grupo tinha puxado as cadeiras para perto da frente naquela tarde, na luz aquosa de outubro que vinha da janela, e estavam todas lá. A Olivia estava no meio, é claro, porque era a loja dela, a camomila dela e, de algum modo, sempre a conversa dela; a Dot ao lado dela, robusta e grisalha, seca como uma bolacha; a Claire com sua rapidez de repórter, já três carreiras à frente de todo mundo; a Ivy, que ria das coisas antes de elas terem graça de verdade; a Martha, erguida na boa cadeira com os tornozelos cruzados; e a Ellie, a dócil Ellie, franzindo a testa por causa de um ponto solto.</w:t>
+        <w:t xml:space="preserve"> ficava na esquina da Evergreen com a Maple, com a vitrine cheia de meadas de lã organizadas por cor como uma caixa de tinta aberta. Lá dentro era aconchegante e penumbroso; cheirava a lã e à camomila que a Olivia sempre mantinha em infusão no fogareiro elétrico atrás do balcão. O círculo tinha puxado as cadeiras para perto da frente naquela tarde, na luz aquosa de outubro que vinha da janela, e estavam todas lá. A Olivia estava no meio, é claro, porque era a loja dela, a camomila dela e, de algum modo, sempre a conversa dela; a Dot ao lado dela, robusta e grisalha, seca como uma bolacha; a Claire com sua rapidez de repórter, já três carreiras à frente de todo mundo; a Ivy, que ria das coisas antes de elas terem graça de verdade; a Martha, erguida na boa cadeira com os tornozelos cruzados; e a Ellie, a dócil Ellie, franzindo a testa por causa de um ponto solto.</w:t>
       </w:r>
     </w:p>
     <w:p>
@@ -1405,7 +1405,7 @@
     </w:p>
     <w:p>
       <w:r>
-        <w:t>— Passei pela exposição ontem — disse a Olivia. — É realmente linda, todas aquelas cartas antigas. Mas, nossa, que homem coitado. Você o viu, Jessica? Ele está com a cara do diabo.</w:t>
+        <w:t xml:space="preserve">— Passei pela exposição ontem — disse a Olivia. — É realmente linda, todas aquelas cartas antigas. Mas, nossa, que homem coitado. Você o viu, Jessica? Ele está um verdadeiro trapo.</w:t>
       </w:r>
     </w:p>
     <w:p>
@@ -1459,7 +1459,7 @@
     </w:p>
     <w:p>
       <w:r>
-        <w:t>Saber o segredo veio dos jornais diz onde se deve ficar, dissera o Nick. Não quem. Muitas e muitas pessoas em Frost Falls tinham pena do Theo. Metade da cidade teria chorado ao saber quão grave era a situação. Ter pena de um homem, mesmo sendo o homem mais desesperado da cidade, não é a mesma coisa que chantagear um amigo por dinheiro, e eu não deixaria uma coisa se fundir à outra na minha cabeça sem algo mais do que aritmética e um mau pressentimento. Então continuei tricotando, mantive o punho fechado e segurei a desconfiança de leve, como a uma brasa, pronta para soltá-la.</w:t>
+        <w:t xml:space="preserve">Saber que o segredo veio dos papéis diz onde se posicionar, dissera o Nick. Não quem. Muitas e muitas pessoas em Frost Falls tinham pena do Theo. Metade da cidade teria chorado ao saber quão grave era a situação. Ter pena de um homem, mesmo sendo o homem mais desesperado da cidade, não é a mesma coisa que chantagear um amigo por dinheiro, e eu não deixaria uma coisa se fundir à outra na minha cabeça sem algo mais do que aritmética e um mau pressentimento. Então continuei tricotando, mantive o punho aberto e segurei a desconfiança de leve, como a uma brasa, pronta para soltá-la.</w:t>
       </w:r>
     </w:p>
     <w:p>
@@ -1488,7 +1488,7 @@
     </w:p>
     <w:p>
       <w:r>
-        <w:t>A conversa seguiu depois disso, para as luvas, para o novo bebê da filha da Ivy, e para saber se uma neve em primeiro de outubro significava um inverno rigoroso ou ameno, o que ninguém decidiu. Deixei a conversa correr. Ao meu lado, a Martha emudecera sobre o trabalho. Daí a pouco, ela inclinou-se um pouco para mim e disse baixinho, só para nós duas: — E como anda a nossa Fiona? Ouvi dizer que ela não está muito bem.</w:t>
+        <w:t xml:space="preserve">A conversa seguiu depois disso, para as luvas, para o novo bebê da filha da Ivy, e para saber se uma primeira neve em outubro significava um inverno rigoroso ou ameno, o que ninguém decidiu. Deixei a conversa correr. Ao meu lado, a Martha emudecera sobre o trabalho. Daí a pouco, ela inclinou-se um pouco para mim e disse baixinho, só para nós duas: — E como anda a nossa Fiona? Ouvi dizer que ela não está muito bem.</w:t>
       </w:r>
     </w:p>
     <w:p>
@@ -1498,7 +1498,7 @@
     </w:p>
     <w:p>
       <w:r>
-        <w:t>— Hum. — A Martha não era tola de ninguém. Deixou o "hum" pairar por um momento, sem acreditar em mim e sem insistir. — Diga a ela que o círculo está aqui, se ela quiser a gente. Somos velhas, mas não inúteis. Não há problema nesta cidade pelo qual não tenhamos passado junto com alguém. — Então ela colocou as agulhas de lado de novo, estendeu a mão e pousou a mão enrugada, firme e antiga sobre o meu joelho. — E você, Jessica. Você está com aquele olhar. Aquele que teve há algumas semanas, por causa da criança Redfern, quando você não quis deixar o assunto morrer e o resto de nós achou que devia. Você está carregando alguma coisa.</w:t>
+        <w:t xml:space="preserve">— Hum. — A Martha não era boba. Deixou o "hum" pairar por um momento, sem acreditar em mim e sem insistir. — Diga a ela que o círculo está aqui, se ela quiser a gente. Somos velhas, mas não inúteis. Não há problema nesta cidade pelo qual não tenhamos passado junto com alguém. — Então ela colocou as agulhas de lado de novo, estendeu a mão e pousou a mão enrugada, firme e antiga sobre o meu joelho. — E você, Jessica. Você está com aquele olhar. Aquele que teve há algumas semanas, por causa da criança Redfern, quando você não quis deixar o assunto morrer e o resto de nós achou que devia. Você está carregando alguma coisa.</w:t>
       </w:r>
     </w:p>
     <w:p>
@@ -1528,12 +1528,12 @@
     </w:p>
     <w:p>
       <w:r>
-        <w:t>Quando a Pip e eu saímos, uma hora depois, a luz havia minguado para a cor de chá fraco, e os homens estavam de volta ao gramado esticando as últimas luzes do festival entre os postes de luz, chamando uns aos outros no frio. Parei na esquina e os observei por um momento, os novos fios subindo escuros, e pensei em dinheiro.</w:t>
-      </w:r>
-    </w:p>
-    <w:p>
-      <w:r>
-        <w:t>Quinhentos mil dólares, exigidos de uma mulher que não tinha a décima parte disso, por alguém que sabia exatamente como uma fortuna podia ser conjurada a partir de um velho segredo. Um prédio cheio da memória da cidade ficando às escuras por falta de uma fração dessa mesma soma. E um homem bom, de rosto grisalho, que ficara sem nenhuma porta honesta onde bater.</w:t>
+        <w:t xml:space="preserve">Quando a Pip e eu saímos, uma hora depois, a luz havia minguado para a cor de chá fraco, e os homens estavam de volta à praça esticando as últimas luzes do festival entre os postes de luz, chamando uns aos outros no frio. Parei na esquina e os observei por um momento, os novos fios subindo escuros, e pensei em dinheiro.</w:t>
+      </w:r>
+    </w:p>
+    <w:p>
+      <w:r>
+        <w:t xml:space="preserve">Quinhentos mil dólares, exigidos de uma mulher que não tinha a décima parte disso, por alguém que sabia exatamente como uma fortuna podia ser conjurada a partir de um velho segredo. Um prédio cheio da memória da cidade ficando às escuras por falta de uma fração dessa mesma soma. E um homem bom, de rosto acinzentado, que ficara sem nenhuma porta honesta onde bater.</w:t>
       </w:r>
     </w:p>
     <w:p>
@@ -1543,7 +1543,7 @@
     </w:p>
     <w:p>
       <w:r>
-        <w:t>Mas eu havia vivido muito tempo, e o desejo nunca mudara o que era verdade. Então segurei o desejo em uma mão e a aritmética fria na outra. Eu contaria ao Nick o que o círculo me dissera, e manteria meu punho fechado.</w:t>
+        <w:t xml:space="preserve">Mas eu havia vivido muito tempo, e o desejo nunca mudara o que era verdade. Então segurei o desejo em uma mão e a aritmética fria na outra. Eu contaria ao Nick o que o círculo me dissera, e manteria meu punho aberto.</w:t>
       </w:r>
     </w:p>
     <w:p>
@@ -1560,7 +1560,7 @@
     <w:p/>
     <w:p>
       <w:r>
-        <w:t>O gramado era o local onde o festival aconteceria, a grande praça ao sul de Evergreen que se estendia desde a praça principal, com o memorial de guerra perto do topo e o grande olmo no extremo oposto. A cidade inteira tinha comparecido para enfeitá-la. Havia mesas de cavalete para serem transportadas e dispostas em fileiras, um palco para ser montado no extremo norte, e o que parecia ser mil pequenas morangas para serem arranjadas em algo que supostamente deveria parecer casual. Na verdade, o comitê passaria uma hora inteira mexericando em cima. Eu havia ido apenas para entregar as primeiras doze luvas do círculo ao comitê do festival, e, noventa segundos após chegar, entregaram-me um caixote de abóboras para torta com um homem que eu não conhecia, dizendo: "Coloque aquilo ali na frente do palco, faz favor? Cuidado com a mole." As coisas funcionavam assim naquela cidade, e eu não me importava nem um pouco. Não havia como pensar com um caixote de abóboras nos braços, e isso me convinha.</w:t>
+        <w:t xml:space="preserve">A praça era o local onde o festival aconteceria, o grande gramado ao sul da Evergreen que descia desde a praça principal, com o memorial de guerra perto do topo e o grande olmo no extremo oposto. A cidade inteira tinha comparecido para enfeitá-la. Havia mesas de cavalete para serem transportadas e dispostas em fileiras, um palco para ser montado no extremo norte, e o que parecia ser mil pequenas morangas para serem arranjadas em algo que supostamente deveria parecer casual. Na verdade, o comitê passaria uma hora inteira mexendo e remexendo naquilo. Eu havia ido apenas para entregar as primeiras doze luvas do círculo ao comitê do festival, e, noventa segundos após chegar, um homem que eu não conhecia me entregou um caixote de abóboras para torta, dizendo: "Coloque aquilo ali na frente do palco, faz favor? Cuidado com a mole." As coisas funcionavam assim naquela cidade, e eu não me importava nem um pouco. Não havia como pensar com um caixote de abóboras nos braços, e isso me convinha.</w:t>
       </w:r>
     </w:p>
     <w:p/>
@@ -1583,7 +1583,7 @@
     <w:p/>
     <w:p>
       <w:r>
-        <w:t>— Oh, Pip, não. — Eu a tirei de lá pela cintura. Ela emergiu com sementes penduradas no bico, polpa de abóbora no queixo e nem uma partícula de vergonha em todo o corpo. — Sinto muito, Emma. Ela não tem modos nenhuns. Nenhuns. Nós já tentamos.</w:t>
+        <w:t xml:space="preserve">— Oh, Pip, não. — Eu a tirei de lá pela cintura. Ela emergiu com sementes penduradas no bico, polpa de abóbora no queixo e nem uma partícula de vergonha em todo o corpo. — Sinto muito, Emma. Ela não tem modos. Nenhum. Nós já tentamos.</w:t>
       </w:r>
     </w:p>
     <w:p/>
@@ -1595,7 +1595,7 @@
     <w:p/>
     <w:p>
       <w:r>
-        <w:t>O riso saiu dela brilhante e surpreso, uma risada verdadeira, daquelas que escapam de uma criança antes que ela decida se deve deixá-las sair, e aquilo me fez mais bem do que uma semana de sono, porque houvera um longo período, após a morte de sua mãe, em que Emma Redfern não ria. A doença de Sarah Redfern levara quase um ano, e depois disso Emma havia vagado por uma cidade que não sabia como alcançá-la, um pequeno fantasma cinzento de menina. Ela tinha pegado o cachorrinho de Martha no início deste mês, pegado-o, escondido-o e guardado-o, movida por um luto grande demais para caber dentro de uma menina de oito anos. A cidade inteira tinha saído à procura. Eu havia achado as duas no final, a menina e o cachorro juntos num velho casebre, e aquela descoberta tinha sido o começo do retorno de Emma a si mesma. Agora ela passeava com o cachorro três tardes por semana, um arranjo que Martha inventara do nada para dar a uma criança solitária um motivo para se levantar e um ser quentinho pelo qual ser responsável, e funcionara, por vias tortas, sem que ninguém nunca dissesse em voz alta para que servia.</w:t>
+        <w:t xml:space="preserve">O riso saiu dela brilhante e surpreso, uma risada verdadeira, daquelas que escapam de uma criança antes que ela decida se deve deixá-las sair, e aquilo me fez mais bem do que uma semana de sono, porque houvera um longo período, após a morte de sua mãe, em que Emma Redfern não ria. A doença de Sarah Redfern levara quase um ano, e depois disso Emma havia vagado por uma cidade que não sabia como alcançá-la, um pequeno fantasma cinzento de menina. Ela tinha pegado o cachorrinho de Martha no início deste mês, pegado, escondido e guardado consigo, movida por um luto grande demais para caber dentro de uma menina de oito anos. A cidade inteira tinha saído à procura. Eu havia achado os dois no final, a menina e o cachorro juntos num velho casebre, e aquela descoberta tinha sido o começo do retorno de Emma a si mesma. Agora ela passeava com o cachorro três tardes por semana, um arranjo que Martha inventara do nada para dar a uma criança solitária um motivo para se levantar e um ser quentinho pelo qual ser responsável, e funcionara, por vias tortas, sem que ninguém nunca dissesse em voz alta para que servia.</w:t>
       </w:r>
     </w:p>
     <w:p/>
@@ -1655,7 +1655,7 @@
     <w:p/>
     <w:p>
       <w:r>
-        <w:t>— Como você está, Mark? — perguntei-lhe baixinho, na vez seguinte em que passamos um pelo outro, enquanto Emma negociava uma paz frágil entre Snowball e uma abóbora que a havia ofendido.</w:t>
+        <w:t xml:space="preserve">— Como você está, Mark? — perguntei-lhe baixinho, na vez seguinte em que passamos um pelo outro, enquanto Emma negociava uma paz frágil entre Snowball e uma moranga que o havia ofendido.</w:t>
       </w:r>
     </w:p>
     <w:p/>
@@ -1684,7 +1684,7 @@
     <w:p/>
     <w:p>
       <w:r>
-        <w:t>As luvas ainda estavam na minha bolsa. Fui procurar quem quer que estivesse gerindo o comitê e encontrei a chefe de polícia. Noriko Tanaka estava no meio do gramado usando uma parka e um chapéu de lã, com uma prancheta numa mão e uma caneca térmica na outra, mandando as pessoas para onde eram necessárias. Ela era uma mulher compacta de cerca de cinquenta anos, com cabelos grisalhos nas têmporas e um caderno gasto saindo do bolso do casaco. Olivia me dissera que ela havia voltado para casa depois de vinte anos na polícia estadual para comandar um departamento de seis pessoas, e que ninguém em Frost Falls jamais a ouvira elevar a voz.</w:t>
+        <w:t xml:space="preserve">As luvas ainda estavam na minha bolsa. Fui procurar quem quer que estivesse gerindo o comitê e encontrei a chefe de polícia. Noriko Tanaka estava no meio da praça usando uma parka e um chapéu de lã, com uma prancheta numa mão e uma caneca térmica na outra, mandando as pessoas para onde eram necessárias. Ela era uma mulher compacta de cerca de cinquenta anos, com cabelos grisalhos nas têmporas e um caderno gasto saindo do bolso do casaco. Olivia me dissera que ela havia voltado para casa depois de vinte anos na polícia estadual para comandar um departamento de seis pessoas, e que ninguém em Frost Falls jamais a ouvira elevar a voz.</w:t>
       </w:r>
     </w:p>
     <w:p/>
@@ -1731,7 +1731,7 @@
     <w:p/>
     <w:p>
       <w:r>
-        <w:t>Fui ver. Do meio da polpa de laranja úmida, na última semana de outubro, brotara um ramo de azevinho: três folhas escuras e brilhantes, de bordas afiadas e inconfundíveis, e entre elas três bagas vermelhas redondas como gotas de sangue, crescendo a partir de uma abóbora de Halloween arruinada na hora desde que Pip a rasgara.</w:t>
+        <w:t xml:space="preserve">Fui ver. Do meio da polpa de laranja úmida, na última semana de outubro, brotara um ramo de azevinho: três folhas escuras e brilhantes, de bordas afiadas e inconfundíveis, e entre elas três bagas vermelhas redondas como gotas de sangue, crescendo a partir de uma abóbora de Halloween arruinada na hora que se passara desde que Pip a rasgara.</w:t>
       </w:r>
     </w:p>
     <w:p/>
@@ -1743,7 +1743,7 @@
     <w:p/>
     <w:p>
       <w:r>
-        <w:t>— Foi você quem fez isso? — sussurrou Emma, e não havia medo algum nela, apenas um espanto contido e radiante. — É uma coisa de Natal-Claus? Você fez o Natal brotar de dentro de uma abóbora?</w:t>
+        <w:t xml:space="preserve">— Foi a senhora quem fez isso? — sussurrou Emma, e não havia medo algum nela, apenas um espanto contido e radiante. — É uma coisa de Natal-Claus? A senhora fez o Natal brotar de dentro de uma abóbora?</w:t>
       </w:r>
     </w:p>
     <w:p/>
@@ -1783,13 +1783,13 @@
     <w:p/>
     <w:p>
       <w:r>
-        <w:t>O que quer que estivesse despertando em Frost Falls, havia brotado ali, de uma abóbora arruinada na beira do gramado, e não no meio do palco onde o comitê andava atarefado.</w:t>
-      </w:r>
-    </w:p>
-    <w:p/>
-    <w:p>
-      <w:r>
-        <w:t>Eu deveria estar preocupada, e uma pequena parte cautelosa de mim estava. Mas o restinho de mim se agachava na grama fria com uma menina em processo de cura, um ramo de azevinho impossível, um cachorro de chapéu de chifres e um pinguim com abóbora no queixo, e, contra tudo o que eu sabia sobre ser sensata, eu estava feliz.</w:t>
+        <w:t xml:space="preserve">O que quer que estivesse despertando em Frost Falls, havia brotado ali, de uma abóbora arruinada na beira da praça, e não no meio do palco onde o comitê andava atarefado.</w:t>
+      </w:r>
+    </w:p>
+    <w:p/>
+    <w:p>
+      <w:r>
+        <w:t xml:space="preserve">Eu deveria estar preocupada, e uma pequena parte cautelosa de mim estava. Mas o resto de mim se agachava na grama fria com uma menina em processo de cura, um ramo de azevinho impossível, um cachorro de chapéu de chifres e um pinguim com abóbora no queixo, e, contra tudo o que eu sabia sobre ser sensata, eu estava feliz.</w:t>
       </w:r>
     </w:p>
     <w:p/>
@@ -1813,7 +1813,7 @@
     <w:p/>
     <w:p>
       <w:r>
-        <w:t>E recolhi meu pássaro sem vergonha e de queixo de abóbora para casa, atravessando o frio que se avizinhava.</w:t>
+        <w:t xml:space="preserve">E recolhi meu pássaro sem vergonha e de queixo de abóbora e fui para casa, atravessando o frio que se avizinhava.</w:t>
       </w:r>
     </w:p>
     <w:p>
@@ -1869,7 +1869,7 @@
     </w:p>
     <w:p>
       <w:r>
-        <w:t>— Ela manteve a pousada por quarenta anos — continuou Fiona. — Sabia disso? Quarenta anos. Minha bisavó. Ela casou tarde, teve minha avó tarde, e o tempo todo administrou esta casa e alimentou cada alma que chegava com frio. Há uma história que minha avó contava, que num inverno de gripe braba a Constance acolheu três famílias que não tinham para onde ir. Ela os alimentou com sua dispensa até a primavera, nunca cobrou um centavo e jamais falou sobre isso. Essa é a mulher que ela se tornou. É isso o que ela construiu sobre a ruína do que fez. — A voz de Fiona engrossou. — E eu tenho tanta vergonha dela. Tanto medo dela. Quando a verdade é que ela é a pessoa mais corajosa com quem tenho parentesco, e ela fez tudo isto, todo esse aconchego, a partir de um inverno terrível e desesperador, e eu tenho o privilégio de viver nele, e a pior coisa que tive que fazer na vida foi contar cadeiras.</w:t>
+        <w:t xml:space="preserve">— Ela manteve a pousada por quarenta anos — continuou Fiona. — Sabia disso? Quarenta anos. Minha bisavó. Ela casou tarde, teve minha avó tarde, e o tempo todo administrou esta casa e alimentou cada alma que chegava com frio. Há uma história que minha avó contava, que num inverno de gripe braba a Constance acolheu três famílias que não tinham para onde ir. Ela as alimentou com o que havia na sua despensa até a primavera, nunca cobrou um centavo e jamais falou sobre isso. Essa é a mulher que ela se tornou. É isso o que ela construiu sobre a ruína do que fez. — A voz de Fiona engrossou. — E eu tenho tanta vergonha dela. Tanto medo dela. Quando a verdade é que ela é a pessoa mais corajosa com quem tenho parentesco, e ela fez tudo isto, todo esse aconchego, a partir de um inverno terrível e desesperador, e eu tenho o privilégio de viver nele, e a pior coisa que tive que fazer na vida foi contar cadeiras.</w:t>
       </w:r>
     </w:p>
     <w:p>
@@ -1879,7 +1879,7 @@
     </w:p>
     <w:p>
       <w:r>
-        <w:t>— Você é mais corajosa do que pensa — falei por fim. — Você carregou o segredo dela sozinha todos esses anos e nunca deixou que isso a endurecesse. A pousada ainda é aconchegante, Fiona. Depois de cem anos, um baú trancado e uma carta de chantagem, ainda é a casa mais calorosa da cidade. Isso não é pouca coisa. Isso é a essência de tudo o que ela construiu, mantida viva por você.</w:t>
+        <w:t xml:space="preserve">— Você é mais corajosa do que pensa — falei por fim. — Você carregou o segredo dela sozinha todos esses anos e nunca deixou que isso a endurecesse. A pousada ainda é aconchegante, Fiona. Depois de cem anos, um baú trancado e um bilhete de chantagem, ainda é a casa mais calorosa da cidade. Isso não é pouca coisa. Isso é a essência de tudo o que ela construiu, mantida viva por você.</w:t>
       </w:r>
     </w:p>
     <w:p>
@@ -1904,7 +1904,7 @@
     </w:p>
     <w:p>
       <w:r>
-        <w:t>Isso arrancou dela uma risada de verdade, aquela risada profunda que chega de uma vez só, a risada de que eu estava sentindo falta, e me fez tanto bem ouvi-la quanto a sopa fizera a ela. Voltamos para as cadeiras juntas. Eu contava enquanto ela consertava as bambas, e Pip supervisionava do pedaço quente de sol. Por uma hora, a pousada voltou a ser apenas uma pousada, aconchegante e movimentada, preparando-se para um festival. O mais que acontecesse, aquilo valia a pena ser protegido: o calor que uma garota amedrontada fizera do nada e transmitira ao longo de cem anos para outra mulher contando cadeiras.</w:t>
+        <w:t xml:space="preserve">Isso arrancou dela uma risada de verdade, aquela risada profunda que chega de uma vez só, a risada de que eu estava sentindo falta, e me fez tanto bem ouvi-la quanto a sopa fizera a ela. Voltamos para as cadeiras juntas. Eu contava enquanto ela consertava as bambas, e Pip supervisionava do pedaço quente de sol. Por uma hora, a pousada voltou a ser apenas uma pousada, aconchegante e movimentada, preparando-se para um festival. O que mais acontecesse, aquilo valia a pena ser protegido: o calor que uma garota amedrontada fizera do nada e transmitira ao longo de cem anos para outra mulher contando cadeiras.</w:t>
       </w:r>
     </w:p>
     <w:p>
@@ -1926,7 +1926,7 @@
     <w:p/>
     <w:p>
       <w:r>
-        <w:t>Foi por isso que eu tinha ido. Eu havia levado a nota de chantagem ao nariz uma dúzia de vezes desde que a Fiona me entregara, tentando identificar aquele leve resquício metálico grudado no papel, e na noite anterior, deitada sem conseguir dormir enquanto ouvia a respiração do Nick, eu havia matado a charada. Era isso. Carvão, ferro quente e um toque mineral por baixo, o sopro inteiro de uma forja em funcionamento. Eu tinha ido lá para ter certeza.</w:t>
+        <w:t xml:space="preserve">Foi por isso que eu tinha ido. Eu havia levado o bilhete de chantagem ao nariz uma dúzia de vezes desde que a Fiona me entregara, tentando identificar aquele leve resquício metálico grudado no papel, e na noite anterior, deitada sem conseguir dormir enquanto ouvia a respiração do Nick, eu havia matado a charada. Era isso. Carvão, ferro quente e um toque mineral por baixo, o sopro inteiro de uma forja em funcionamento. Eu tinha ido lá para ter certeza.</w:t>
       </w:r>
     </w:p>
     <w:p/>
@@ -1974,13 +1974,13 @@
     <w:p/>
     <w:p>
       <w:r>
-        <w:t>E, enquanto eu o admirava, respirei o ar da forja e lá estava ele, inconfundível, o exato cheiro que grudava em uma folha de papel creme dobrada no meu casaco. Estava na nota e estava ali. E me forcei a ir devagar, forcei-me a segurar o carvão na mão aberta sem fechar o punho, porque um cheiro não é uma confissão. Sam Patel havia sido, por tudo o que diziam, irrepreensível com a cidade inteira por dez anos, e eu tinha ido olhar, não para julgar.</w:t>
-      </w:r>
-    </w:p>
-    <w:p/>
-    <w:p>
-      <w:r>
-        <w:t>— Você fez a pousada — comentei, despreocupada, virando o suporte. — Toda aquela serralheria no saguão da Fiona. As estrelas na lareira, os suportes de lâmpada, a tela protetora.</w:t>
+        <w:t xml:space="preserve">E, enquanto eu o admirava, respirei o ar da forja e lá estava ele, inconfundível, o exato cheiro que grudava em uma folha de papel creme dobrada no meu casaco. Estava no bilhete e estava ali. E me forcei a ir devagar, forcei-me a segurar o carvão na mão aberta sem fechar o punho, porque um cheiro não é uma confissão. Sam Patel havia sido, por tudo o que diziam, irrepreensível com a cidade inteira por dez anos, e eu tinha ido olhar, não para julgar.</w:t>
+      </w:r>
+    </w:p>
+    <w:p/>
+    <w:p>
+      <w:r>
+        <w:t xml:space="preserve">— O senhor fez a pousada — comentei, despreocupada, virando o suporte. — Toda aquela serralheria no saguão da Fiona. As estrelas na cornija da lareira, os suportes de lâmpada, a tela protetora.</w:t>
       </w:r>
     </w:p>
     <w:p/>
@@ -2010,7 +2010,7 @@
     <w:p/>
     <w:p>
       <w:r>
-        <w:t>E, no entanto, o cheiro estava ali, e o cheiro estava na nota. Eu não conseguia fazer essas duas coisas verdadeiras deixarem de ser verdadeiras só porque eu decidira que gostava do homem.</w:t>
+        <w:t xml:space="preserve">E, no entanto, o cheiro estava ali, e o cheiro estava no bilhete. Eu não conseguia fazer essas duas coisas verdadeiras deixarem de ser verdadeiras só porque eu decidira que gostava do homem.</w:t>
       </w:r>
     </w:p>
     <w:p/>
@@ -2028,13 +2028,13 @@
     <w:p/>
     <w:p>
       <w:r>
-        <w:t>E isso, mais do que qualquer outra coisa, desfez o resto da minha suspeita, quase por completo, porque um homem executando uma extorsão não ficaria em sua própria forja com o coração na mão perguntando se a mulher que ele estava esvaindo bem. Mas quase não é a mesma coisa que ter certeza, e mantive minha posição, perguntando aquilo pelo qual eu meio que tinha ido sob o disfarce do cheiro.</w:t>
-      </w:r>
-    </w:p>
-    <w:p/>
-    <w:p>
-      <w:r>
-        <w:t>— Esse problema antigo dela, se é que é um problema — falei, o mais leve que pude. — Você sabe alguma coisa sobre os primeiros dias da pousada? Como a família da Fiona passou a ser dona daquilo, muito antigamente? Alguma história antiga passada adiante?</w:t>
+        <w:t xml:space="preserve">E isso, mais do que qualquer outra coisa, desfez o resto da minha suspeita, quase por completo, porque um homem executando uma extorsão não ficaria em sua própria forja com o coração na mão perguntando se a mulher que ele estava extorquindo estava bem. Mas quase não é a mesma coisa que ter certeza, e mantive minha posição, perguntando aquilo pelo qual eu meio que tinha ido sob o disfarce do cheiro.</w:t>
+      </w:r>
+    </w:p>
+    <w:p/>
+    <w:p>
+      <w:r>
+        <w:t xml:space="preserve">— Esse problema antigo dela, se é que é um problema — falei, o mais leve que pude. — O senhor sabe alguma coisa sobre os primeiros dias da pousada? Como a família da Fiona passou a ser dona daquilo, muito antigamente? Alguma história antiga passada adiante?</w:t>
       </w:r>
     </w:p>
     <w:p/>
@@ -2076,19 +2076,19 @@
     <w:p/>
     <w:p>
       <w:r>
-        <w:t>Não disse nada disso em voz alta. Mas aquilo se transformou em uma pergunta que valia muito mais do que o cheiro em si. A nota cheirava a forja. Mas será que cheirava a forja porque Sam Patel se inclinara sobre ela com uma caneta, ou porque estivera em algum lugar onde havia ferro de Sam Patel?</w:t>
-      </w:r>
-    </w:p>
-    <w:p/>
-    <w:p>
-      <w:r>
-        <w:t>— Obrigada, Sam — falei, pagando pelo suporte, e a gratidão era por muito mais do que o objeto. — Pelo trabalho. E por perguntar por ela de coração. Vou contar a ela que você fez isso. Gentilmente.</w:t>
-      </w:r>
-    </w:p>
-    <w:p/>
-    <w:p>
-      <w:r>
-        <w:t>— Faça isso. — Ele assentiu com a cabeça, uma vez, solenemente. — E diga a ela que os vinte dólares estão rasgados. Diga que eu nunca mais quero ouvir falar nisso. Diga a ela para olhar para mim da próxima vez que me ver, é só isso que eu quero disso, apenas os olhos dela por um segundo para eu saber que estamos bem.</w:t>
+        <w:t xml:space="preserve">Não disse nada disso em voz alta. Mas aquilo se transformou em uma pergunta que valia muito mais do que o cheiro em si. O bilhete cheirava a forja. Mas será que cheirava a forja porque Sam Patel se inclinara sobre ele com uma caneta, ou porque estivera em algum lugar onde havia ferro de Sam Patel?</w:t>
+      </w:r>
+    </w:p>
+    <w:p/>
+    <w:p>
+      <w:r>
+        <w:t xml:space="preserve">— Obrigada, Sam — falei, pagando pelo suporte, e a gratidão era por muito mais do que o objeto. — Pelo trabalho. E por perguntar por ela de coração. Vou contar a ela que o senhor fez isso. Gentilmente.</w:t>
+      </w:r>
+    </w:p>
+    <w:p/>
+    <w:p>
+      <w:r>
+        <w:t xml:space="preserve">— Faça isso. — Ele assentiu com a cabeça, uma vez, solenemente. — E diga a ela que os vinte dólares estão rasgados. Diga que eu nunca mais quero ouvir falar nisso. Diga a ela para olhar para mim da próxima vez que me vir, é só isso que eu quero disso, apenas os olhos dela por um segundo para eu saber que estamos bem.</w:t>
       </w:r>
     </w:p>
     <w:p/>
@@ -2100,7 +2100,7 @@
     <w:p/>
     <w:p>
       <w:r>
-        <w:t>Eu fora à forja achando que talvez estivesse caminhando direto para uma resposta. Fui embora com uma pergunta melhor, o cheiro de carvão impregnado na lã do meu casaco, e a suspeita crescente de que o cheiro na nota indicava apenas onde ela estivera.</w:t>
+        <w:t xml:space="preserve">Eu fora à forja achando que talvez estivesse caminhando direto para uma resposta. Fui embora com uma pergunta melhor, o cheiro de carvão impregnado na lã do meu casaco, e a suspeita crescente de que o cheiro no bilhete indicava apenas onde ele estivera.</w:t>
       </w:r>
     </w:p>
     <w:p/>
@@ -2123,25 +2123,25 @@
     <w:p/>
     <w:p>
       <w:r>
-        <w:t>Eu pretendia passar a manhã na biblioteca pública, calmamente, inteirando-me sobre os Blackburns. Encontrei Neil lá antes de mim, instalado na grande mesa de carvalho perto das janelas altas, com três caixas de arquivo dos registros da cidade abertas à sua frente e uma quarta sendo trazida pela Sra. Johnson, que a colocou com o cuidado contrariado de uma bibliotecária que já havia decidido que um frequentador ia lhe dar dor de cabeça. Ele segurava uma lupa em uma mão. Estava com óculos de leitura empurrados para o alto da cabeça e os óculos normais no nariz. Ergueu os olhos no instante em que passei pela porta, como se estivesse esperando por um amigo, e me chamou com um gesto.</w:t>
-      </w:r>
-    </w:p>
-    <w:p/>
-    <w:p>
-      <w:r>
-        <w:t>— Sra. Claus! Venha ver isto, vai gostar. — Ele virou uma página quebradiça de livro-razão na minha direção quando me aproximei. — Mil oitocentos e noventa e um. Os Blackburns bancaram metade do dinheiro para a igreja na praça. Sabia disso? Metade. Generosos, os antigos, quando lhes convinha ser vistos. — Ele balançou a cabeça com o que parecia ser admiração sincera. — Eu adoro uma família fundadora. Toda aquela ambição bruta e devoradora na primeira geração, coalhando em respeitabilidade até a terceira, e na quarta já se esqueceram de que um dia devoraram o que quer que fosse. É a mesma história em toda cidadezinha em que já pisei.</w:t>
-      </w:r>
-    </w:p>
-    <w:p/>
-    <w:p>
-      <w:r>
-        <w:t>— O senhor se interessa muito pelos Blackburns — eu disse, puxando a cadeira em frente a ele para me sentar.</w:t>
-      </w:r>
-    </w:p>
-    <w:p/>
-    <w:p>
-      <w:r>
-        <w:t>— Sou pago para isso. — Ele disse isso com alegria, o que me deteve, pois eu já estava preparada para uma esquiva. — Pesquisa de espólio. Esse é o meu ganha-pão, Sra. Claus. Quando o último membro de uma linhagem de dinheiro antigo morre, ele deixa um emaranhado para trás, um nó de quem era dono do quê, quem devia o quê, para onde foi alguma coisa de valor, e alguém tem de sentar nas bibliotecas e desatar esse nó, e esse alguém sou eu. — Ele abriu as mãos sobre as caixas. — No momento, estou desatando um nó dos Blackburns. Havia uma joia na família, antigamente. Um broche. Dos bons. Safira no centro, trabalho em ourivesaria por toda a volta, uma peça legítima, que valia muito naquela época e vale uma pequena fortuna agora. — Ele pegou a lupa e a colocou de volta na mesa, e, debaixo dela, Pip fixou um olho no aro de latão. — E ele sumiu sem deixar rastro dos registros da família por volta de 1924. Simplesmente parou de ser mencionado. E os advogados da família gostariam muito de saber para onde foi, porque há um espólio que não pode ser devidamente encerrado até que alguém consiga anotar o fim que levou esse broche.</w:t>
+        <w:t xml:space="preserve">Eu pretendia passar a manhã na biblioteca pública, calmamente, inteirando-me sobre os Blackburn. Encontrei Neil lá antes de mim, instalado na grande mesa de carvalho perto das janelas altas, com três caixas de arquivo dos registros da cidade abertas à sua frente e uma quarta sendo trazida pela Sra. Johnson, que a colocou com o cuidado contrariado de uma bibliotecária que já havia decidido que um frequentador ia lhe dar dor de cabeça. Ele segurava uma lupa em uma mão. Estava com óculos de leitura empurrados para o alto da cabeça e os óculos normais no nariz. Ergueu os olhos no instante em que passei pela porta, como se estivesse esperando por um amigo, e me chamou com um gesto.</w:t>
+      </w:r>
+    </w:p>
+    <w:p/>
+    <w:p>
+      <w:r>
+        <w:t xml:space="preserve">— Sra. Claus! Venha ver isto, vai gostar. — Ele virou uma página quebradiça de livro-razão na minha direção quando me aproximei. — Mil oitocentos e noventa e um. Os Blackburn bancaram metade do dinheiro para a igreja na praça. Sabia disso? Metade. Generosos, os antigos, quando lhes convinha ser vistos. — Ele balançou a cabeça com o que parecia ser admiração sincera. — Eu adoro uma família fundadora. Toda aquela ambição bruta e devoradora na primeira geração, coalhando em respeitabilidade até a terceira, e na quarta já se esqueceram de que um dia devoraram o que quer que fosse. É a mesma história em toda cidadezinha em que já pisei.</w:t>
+      </w:r>
+    </w:p>
+    <w:p/>
+    <w:p>
+      <w:r>
+        <w:t xml:space="preserve">— O senhor se interessa muito pelos Blackburn — eu disse, puxando a cadeira em frente a ele para me sentar.</w:t>
+      </w:r>
+    </w:p>
+    <w:p/>
+    <w:p>
+      <w:r>
+        <w:t xml:space="preserve">— Sou pago para isso. — Ele disse isso com alegria, o que me deteve, pois eu já estava preparada para uma esquiva. — Pesquisa de espólio. Esse é o meu ganha-pão, Sra. Claus. Quando o último membro de uma linhagem de dinheiro antigo morre, ele deixa um emaranhado para trás, um nó de quem era dono do quê, quem devia o quê, para onde foi alguma coisa de valor, e alguém tem de sentar nas bibliotecas e desatar esse nó, e esse alguém sou eu. — Ele abriu as mãos sobre as caixas. — No momento, estou desatando um nó dos Blackburn. Havia uma joia na família, antigamente. Um broche. Dos bons. Safira no centro, trabalho em ourivesaria por toda a volta, uma peça legítima, que valia muito naquela época e vale uma pequena fortuna agora. — Ele pegou a lupa e a colocou de volta na mesa, e, debaixo dela, Pip fixou um olho no aro de latão. — E ele sumiu sem deixar rastro dos registros da família por volta de 1924. Simplesmente parou de ser mencionado. E os advogados da família gostariam muito de saber para onde foi, porque há um espólio que não pode ser devidamente encerrado até que alguém consiga anotar o fim que levou esse broche.</w:t>
       </w:r>
     </w:p>
     <w:p/>
@@ -2159,13 +2159,13 @@
     <w:p/>
     <w:p>
       <w:r>
-        <w:t>— O fim da linha, ainda não. Perto, porém. — Ele bateu de leve na lateral de uma caixa. — Sei que saiu da mansão dos Blackburns no inverno de vinte e quatro. Sei que não saiu por nenhuma das portas oficiais. Nenhuma venda registrada, nenhum presente, nenhum legado, nada posto no papel, o que, pela minha experiência, significa que saiu pela porta errada. Roubo, quase com certeza, embora seja cem anos tarde demais para fazer qualquer coisa a respeito. — Ele recostou-se na cadeira. — Depois que sai da casa, o rastro esfria aqui e esquenta de novo, tênue, duas cidades adiante. Uma casa de penhores em Ridgeline. Eles mantinham registros horríveis, essas velhas lojas, mas guardavam alguns, e há o diário de um balconista que sobreviveu, e estou tentando cruzar uma data dele com o inverno em que o broche desapareceu. Aí terei todo o arco da história, da mansão à casa de penhores, e poderei escrever minha linha, fechar meu arquivo e ir para casa.</w:t>
-      </w:r>
-    </w:p>
-    <w:p/>
-    <w:p>
-      <w:r>
-        <w:t>Meu pulso acelerou, forte e rápido, e mantive o rosto impassível acima daquela agitação. Ele sabia de Ridgeline. Sabia da casa de penhores. Abordara o assunto inteiro pelo lado dos Blackburns, o lado legítimo, o lado dos advogados do espólio, e rastreara a peça quase até a porta de Constance Okafor pelo lado oposto.</w:t>
+        <w:t xml:space="preserve">— O fim da linha, ainda não. Perto, porém. — Ele bateu de leve na lateral de uma caixa. — Sei que saiu da mansão dos Blackburn no inverno de vinte e quatro. Sei que não saiu por nenhuma das portas oficiais. Nenhuma venda registrada, nenhum presente, nenhum legado, nada posto no papel, o que, pela minha experiência, significa que saiu pela porta errada. Roubo, quase com certeza, embora seja cem anos tarde demais para fazer qualquer coisa a respeito. — Ele recostou-se na cadeira. — Depois que sai da casa, o rastro esfria aqui e esquenta de novo, tênue, duas cidades adiante. Uma casa de penhores em Ridgeline. Eles mantinham registros horríveis, essas velhas lojas, mas guardavam alguns, e há o diário de um balconista que sobreviveu, e estou tentando cruzar uma data dele com o inverno em que o broche desapareceu. Aí terei todo o arco da história, da mansão à casa de penhores, e poderei escrever minha linha, fechar meu arquivo e ir para casa.</w:t>
+      </w:r>
+    </w:p>
+    <w:p/>
+    <w:p>
+      <w:r>
+        <w:t xml:space="preserve">Meu pulso acelerou, forte e rápido, e mantive o rosto impassível acima daquela agitação. Ele sabia de Ridgeline. Sabia da casa de penhores. Abordara o assunto inteiro pelo lado dos Blackburn, o lado legítimo, o lado dos advogados do espólio, e rastreara a peça quase até a porta de Constance Okafor pelo lado oposto.</w:t>
       </w:r>
     </w:p>
     <w:p/>
@@ -2183,7 +2183,7 @@
     <w:p/>
     <w:p>
       <w:r>
-        <w:t>Olhei para cái o cartão. Neil Carter, dizia, e abaixo disso o nome de uma firma e um número de telefone com um código de área de dois estados de distância.</w:t>
+        <w:t xml:space="preserve">Olhei para o cartão. Neil Carter, dizia, e abaixo disso o nome de uma firma e um número de telefone com um código de área de dois estados de distância.</w:t>
       </w:r>
     </w:p>
     <w:p/>
@@ -2195,7 +2195,7 @@
     <w:p/>
     <w:p>
       <w:r>
-        <w:t>Quem quer que tivesse escrito aquele bilhete agia nas sombras. Todo o seu poder, cada migalha dele, vinha de não ser visto. Escrevera com uma letra que não era a sua. Dissera a uma mulher que pendurasse uma fita vermelha na guirlanda para que ele nunca precisasse mostrar o rosto ao vir cobrar. E ali, do outro lado da mesa de uma biblioteca no cômodo mais iluminado da cidade, estava Neil Carter, distribuindo cartões como um político em campanha, dizendo à bibliotecária, ao prefeito, à Sra. Claus e a quem quer que parasse para ouvir que estava caçando um broche dos Blackburns que saíra da cidade pela porta errada em 1924.</w:t>
+        <w:t xml:space="preserve">Quem quer que tivesse escrito aquele bilhete agia nas sombras. Todo o seu poder, cada migalha dele, vinha de não ser visto. Escrevera com uma letra que não era a sua. Dissera a uma mulher que pendurasse uma fita vermelha na guirlanda para que ele nunca precisasse mostrar o rosto ao vir cobrar. E ali, do outro lado da mesa de uma biblioteca no cômodo mais iluminado da cidade, estava Neil Carter, distribuindo cartões como um político em campanha, dizendo à bibliotecária, ao prefeito, à Sra. Claus e a quem quer que parasse para ouvir que estava caçando um broche dos Blackburn que saíra da cidade pela porta errada em 1924.</w:t>
       </w:r>
     </w:p>
     <w:p/>
@@ -2237,7 +2237,7 @@
     <w:p/>
     <w:p>
       <w:r>
-        <w:t>— Sei de muita coisa que o senhor não sabe — eu disse agradavelmente —, sobre tricô e sobre os hábitos alimentares de pinguins. No que tange a brooches, receio não lhe servir para nada.</w:t>
+        <w:t xml:space="preserve">— Sei de muita coisa que o senhor não sabe — eu disse agradavelmente —, sobre tricô e sobre os hábitos alimentares de pinguins. No que tange a broches, receio não lhe servir para nada.</w:t>
       </w:r>
     </w:p>
     <w:p/>
@@ -2249,7 +2249,7 @@
     <w:p/>
     <w:p>
       <w:r>
-        <w:t>Eu tinha ido à biblioteca para ler sobre os Blackburns e encontrara em vez disso um homem tão barulhento e tão descaradamente curioso a respeito do broche que quase se desculpava por completo pela pura intensidade do seu apetite por ele. Quase. Eu ainda não estava pronta para descartá-lo de vez. Mas quanto mais tempo eu passava com ele, menos Neil Carter parecia um homem trabalhando nas sombras.</w:t>
+        <w:t xml:space="preserve">Eu tinha ido à biblioteca para ler sobre os Blackburn e encontrara em vez disso um homem tão barulhento e tão descaradamente curioso a respeito do broche que quase se inocentava por completo pela pura intensidade do seu apetite por ele. Quase. Eu ainda não estava pronta para descartá-lo de vez. Mas quanto mais tempo eu passava com ele, menos Neil Carter parecia um homem trabalhando nas sombras.</w:t>
       </w:r>
     </w:p>
     <w:p/>
@@ -2266,27 +2266,27 @@
     <w:p/>
     <w:p>
       <w:r>
-        <w:t>Voltei da biblioteca para casa e encontrei uma rena no jardim da frente comendo os últimos couves do Nick, e um pequeno elfo muito estressado com aquilo.</w:t>
-      </w:r>
-    </w:p>
-    <w:p>
-      <w:r>
-        <w:t>— Senhora Claus! — Bram contornou a esquina da cabana a trote, torcendo o gorro entre as mãos. Bram era o elfo que viera para o sul conosco, o capataz da oficina remanejada, dedicado, cheio de manias e construído com as proporções gerais de uma batata preocupada, e estava no ápice da aflição agora. — É a Dançarina. Ela escapou de novo. Terceira vez esta semana, senhora Claus, a terceira. E eu juro por cada botão que tenho que aquela tranca estava passada quando saí, passada e testada, e agora ela está aí comendo os couves bons e não se deixa guiar, e eu não estou gostando nada disso, faço questão de dizer.</w:t>
-      </w:r>
-    </w:p>
-    <w:p>
-      <w:r>
-        <w:t>— Boa tarde para você também, Bram — eu disse, e coloquei minha cesta no chão dentro da porta da cozinha. Lá fora no jardim, Dançarina ergueu a cabeça enorme do canteiro de couves, olhou para mim com interesse moderado e voltou aos couves. — Ora. Por que você não está gostando disso?</w:t>
-      </w:r>
-    </w:p>
-    <w:p>
-      <w:r>
-        <w:t>— Porque ela não escapou. — Ele baixou a voz. — Quero dizer, ela escapou, é claro, ali está ela nos couves, eu tenho olhos na cara. Mas o portão foi trancado depois. Trancado por trás dela, pelo lado de fora, com ela parada bem na frente dele. Três vezes agora eu venho aqui e encontro o portão bem fechado e uma rena do lado errado dele, e a senhora me diga, senhora Claus, como um animal consegue acionar uma tranca do lado em que não está, e eu vou lhe dizer a mesma coisa que continuo dizendo ao jovem Fenn, que é o de que há algo estranho rolando nesta cidade, algo estranho.</w:t>
-      </w:r>
-    </w:p>
-    <w:p>
-      <w:r>
-        <w:t>Ele tinha razão, é claro, embora eu não tenha dito isso. Fui para o jardim frio e coloquei a mão espalmada sobre o ombro quente da Dançarina. Ela deixou, e encostou-se um pouco nela. Ela não se deixaria guiar nem um centímetro por Bram, mas eu a levei de volta pelo caminho em direção ao piquete sem nenhum problema. O portão estava aberto e comum. Eu a conduzi por ele e o tranquei. Nós três ficamos parados olhando para a tranca. Ela continuou trancada. Dançarina passou o focinho por cima da cerca e soltou um longo suspiro morno para Bram e para mim.</w:t>
+        <w:t xml:space="preserve">Voltei da biblioteca para casa e encontrei uma rena no jardim da frente comendo as últimas couves do Nick, e um pequeno elfo muito estressado com aquilo.</w:t>
+      </w:r>
+    </w:p>
+    <w:p>
+      <w:r>
+        <w:t xml:space="preserve">— Sra. Claus! — Bram contornou a esquina do chalé a trote, torcendo o gorro entre as mãos. Bram era o elfo que viera para o sul conosco, o capataz da oficina remanejada, dedicado, cheio de manias e construído com as proporções gerais de uma batata preocupada, e estava no ápice da aflição agora. — É a Dancer. Ela escapou de novo. Terceira vez esta semana, Sra. Claus, a terceira. E eu juro por cada botão que tenho que aquela tranca estava passada quando saí, passada e testada, e agora ela está aí comendo as couves boas e não se deixa guiar, e eu não estou gostando nada disso, faço questão de dizer.</w:t>
+      </w:r>
+    </w:p>
+    <w:p>
+      <w:r>
+        <w:t xml:space="preserve">— Boa tarde para você também, Bram — eu disse, e coloquei minha cesta no chão dentro da porta da cozinha. Lá fora no jardim, Dancer ergueu a cabeça enorme do canteiro de couves, olhou para mim com interesse moderado e voltou às couves. — Ora. Por que você não está gostando disso?</w:t>
+      </w:r>
+    </w:p>
+    <w:p>
+      <w:r>
+        <w:t xml:space="preserve">— Porque ela não escapou. — Ele baixou a voz. — Quero dizer, ela escapou, é claro, ali está ela nas couves, eu tenho olhos na cara. Mas o portão foi trancado depois. Trancado por trás dela, pelo lado de fora, com ela parada bem na frente dele. Três vezes agora eu venho aqui e encontro o portão bem fechado e uma rena do lado errado dele, e você me diga, Sra. Claus, como um animal consegue acionar uma tranca do lado em que não está, e eu vou lhe dizer a mesma coisa que continuo dizendo ao jovem Fenn, ou seja, que há algo estranho rolando nesta cidade, algo estranho.</w:t>
+      </w:r>
+    </w:p>
+    <w:p>
+      <w:r>
+        <w:t xml:space="preserve">Ele tinha razão, é claro, embora eu não tenha dito isso. Fui para o jardim frio e coloquei a mão espalmada sobre o ombro quente da Dancer. Ela deixou, e encostou-se um pouco nela. Ela não se deixaria guiar nem um centímetro por Bram, mas eu a levei de volta pelo caminho em direção ao piquete sem nenhum problema. O portão estava aberto e comum. Eu a conduzi por ele e o tranquei. Nós três ficamos parados olhando para a tranca. Ela continuou trancada. Dancer passou o focinho por cima da cerca e soltou um longo suspiro morno para Bram e para mim.</w:t>
       </w:r>
     </w:p>
     <w:p>
@@ -2301,7 +2301,7 @@
     </w:p>
     <w:p>
       <w:r>
-        <w:t>— Na oficina. Onde mais? — Bram fungou, ofendido de novo. — Não me deixa entrar. Não deixa o Fenn entrar. Construindo sabe-se lá o quê atrás de uma porta trancada a todas as horas e cantarolando sozinho. Eu sou capataz daquela oficina há duzentos anos, senhora Claus, duzentos, e agora sou mantido do lado de fora da metade dela como um estranho vindo ler o hidrômetro. — Ele se conteve e acrescentou, apressado: — Não que eu seja intrometido. Eu jamais seria intrometido. É só que uma oficina quer um capataz que saiba o que há dentro dela, só isso, é uma questão de dignidade profissional.</w:t>
+        <w:t xml:space="preserve">— Na oficina. Onde mais? — Bram fungou, ofendido de novo. — Não me deixa entrar. Não deixa o Fenn entrar. Construindo sabe-se lá o quê atrás de uma porta trancada a todas as horas e cantarolando sozinho. Eu sou capataz daquela oficina há duzentos anos, Sra. Claus, duzentos, e agora sou mantido do lado de fora da metade dela como um estranho vindo ler o hidrômetro. — Ele se conteve e acrescentou, apressado: — Não que eu seja intrometido. Eu jamais seria intrometido. É só que uma oficina quer um capataz que saiba o que há dentro dela, só isso, é uma questão de dignidade profissional.</w:t>
       </w:r>
     </w:p>
     <w:p>
@@ -2311,7 +2311,7 @@
     </w:p>
     <w:p>
       <w:r>
-        <w:t>A oficina brilhava nas frestas. Essa foi a primeira coisa, e me deteve no caminho. Cada fresta ao redor da porta trancada, cada brecha nas antigas paredes de tábuas, vazava uma luz dourada e quente, o exato dourado em que as luzes do festival haviam se transformado, e quando encostuei minha mão espalmada contra a porta, a madeira dela estava quente como um pão fresco. De dentro vinha o zumbido baixo e sem melodia de Nick e, por baixo do zumbido, um som para o qual eu não tinha nome. Um som como o de uma lareira se acomodando para a noite. Um som como o de algo grande respirando devagar no sono.</w:t>
+        <w:t xml:space="preserve">A oficina brilhava nas frestas. Essa foi a primeira coisa, e me deteve no caminho. Cada fresta ao redor da porta trancada, cada brecha nas antigas paredes de tábuas, vazava uma luz dourada e quente, o exato dourado em que as luzes do festival haviam se transformado, e quando encostei minha mão espalmada contra a porta, a madeira dela estava quente como um pão fresco. De dentro vinha o zumbido baixo e sem melodia de Nick e, por baixo do zumbido, um som para o qual eu não tinha nome. Um som como o de uma lareira se acomodando para a noite. Um som como o de algo grande respirando devagar no sono.</w:t>
       </w:r>
     </w:p>
     <w:p>
@@ -2326,7 +2326,7 @@
     </w:p>
     <w:p>
       <w:r>
-        <w:t>— A tranca — ele repetiu, e o contentamento diminuiu um tom, tornando-se algo mais sério. — Ela está atraindo as renas. Elas sentem antes de qualquer um de nós. Sempre sentiram, desde a primeira. — Ele saiu e puxou a porta para trás de si, e enquanto se afastava dela as frestas douradas se atenuaram. — Caminhe comigo. Vou lhe contar o que puder, que não é muito, porque eu mesmo ainda não sei muito. Mas você conquistou o que eu tenho.</w:t>
+        <w:t xml:space="preserve">— A tranca — ele repetiu, e o contentamento diminuiu um tom, tornando-se algo mais sério. — Aquilo está atraindo as renas. Elas sentem antes de qualquer um de nós. Sempre sentiram, desde a primeira. — Ele saiu e puxou a porta para trás de si, e enquanto se afastava dela as frestas douradas se atenuaram. — Caminhe comigo. Vou lhe contar o que puder, que não é muito, porque eu mesmo ainda não sei muito. Mas você conquistou o que eu tenho.</w:t>
       </w:r>
     </w:p>
     <w:p>
@@ -2356,7 +2356,7 @@
     </w:p>
     <w:p>
       <w:r>
-        <w:t>Ele ficou quieto por um momento, nosso hálito embaçando o crepúsculo. — É um lugar para ela se assentar — disse ele por fim, baixinho. — É só o que vou dizer, e até isso é mais do que devia, porque não está terminada, e não sei se vai aguentar. Estou tentando construir a coisa que ela está caçando, Jess. Uma lareira. Para que pare de ir de porta em porta no escuro e venha para casa e deite-se. — Ele apertou minha mão. — Não conte a ninguém. Não porque seja um segredo a ser guardado a sete chaves. Mas porque não quero dizer em voz alta antes de saber que vai funcionar.</w:t>
+        <w:t xml:space="preserve">Ele ficou quieto por um momento, nosso hálito embaçando o crepúsculo. — É um lugar para ela se assentar — disse ele por fim, baixinho. — É só o que vou dizer, e até isso é mais do que devia, porque não está terminado, e não sei se vai aguentar. Estou tentando construir a coisa que ela está caçando, Jess. Uma lareira. Para que pare de ir de porta em porta no escuro e venha para casa e deite-se. — Ele apertou minha mão. — Não conte a ninguém. Não porque seja um segredo a ser guardado a sete chaves. Mas porque não quero dizer em voz alta antes de saber que vai funcionar.</w:t>
       </w:r>
     </w:p>
     <w:p>
@@ -2366,7 +2366,7 @@
     </w:p>
     <w:p>
       <w:r>
-        <w:t>Pip vinha farejando ao longo da travessa inferior da cerca do piquete o tempo todo. Eu tinha o bilhete no bolso do casaco, e agora ela fez o que passara a fazer sempre que ele estava por perto. Ela veio até o bolso, pressionou o bico contra a parte externa dele e ficou imóvel, a imobilidade em que caía quando pegava um cheiro e tinha certeza dele. Depois virou-se e afastou-se de mim com grande propósito, subindo direto pelo caminho até a porta da cozinha, e esperou ali até que eu a abrisse. Ela atravessou o piso e parou na cesta onde eu havia colocado o suporte de luz que trouxera para casa da forja naquela manhã. Sentou-se ao lado da cesta, olhou para trás na minha direção e piou, uma vez, aguda e certa como um dedo apontando.</w:t>
+        <w:t xml:space="preserve">Pip vinha farejando ao longo da travessa inferior da cerca do piquete o tempo todo. Eu tinha o bilhete no bolso do casaco, e agora ela fez o que passara a fazer sempre que ele estava por perto. Ela veio até o bolso, pressionou o bico contra a parte externa dele e ficou imóvel, a imobilidade em que caía quando pegava um cheiro e tinha certeza dele. Depois virou-se e afastou-se de mim com grande propósito, subindo direto pelo caminho até a porta da cozinha, e esperou ali até que eu a abrisse. Ela atravessou o piso e parou na cesta onde eu havia colocado o suporte de vela que trouxera para casa da forja naquela manhã. Sentou-se ao lado da cesta, olhou para trás na minha direção e piou, uma vez, aguda e certa como um dedo apontando.</w:t>
       </w:r>
     </w:p>
     <w:p>
@@ -2397,19 +2397,19 @@
     <w:p/>
     <w:p>
       <w:r>
-        <w:t>A Prefeitura era um prédio de tijolos cheio de floreios na cabeceira da praça, com uma torre de relógio que adiantava quatro minutos havia tanto tempo que ninguém se lembrava de quando começara. Fui até lá na segunda-feira com Pip, por dois motivos, um deles real e o outro nem tanto. O motivo real era incluir o nome do grupo na lista de voluntários do festival e perguntar, em nome de ninguém além da própria cidade, se Frost Falls poderia arranjar um pouco de dinheiro para a Sociedade Histórica antes que o telhado viesse abaixo de vez. O motivo menos real era dar uma olhada, direito e de perto, em Vera Reed.</w:t>
-      </w:r>
-    </w:p>
-    <w:p/>
-    <w:p>
-      <w:r>
-        <w:t>O saguão estava repleto de retratos de antigos prefeitos, emoldurados em dourado e com ares autossuficientes; uma quantidade notável deles eram Blackburns, ostentando o mesmo nariz comprido dos Blackburn herdado parede abaixo como se fosse uma herança de família. No fundo do saguão, a porta do prefeito atual estava aberta. Sentado atrás de uma escrivaninha ampla e limpa que não continha nada além de um telefone e um mata-borrão de couro estava o próprio prefeito Blackburn, um homem cinzento e polido que havia herdado o nariz, o cargo e, pelo que qualquer um na cidade soubesse dizer, pouquíssimo além disso.</w:t>
-      </w:r>
-    </w:p>
-    <w:p/>
-    <w:p>
-      <w:r>
-        <w:t>Vera sentava-se na escrivaninha do lado de fora da dele, e ela era o motivo de o lugar funcionar minimamente. Todo mundo sabia disso e ninguém dizia. Ela tinha os arquivos e as chaves. O prefeito tinha o nariz e o aperto de mão. Ela ergueu os olhos quando entrei, e o sorriso que encontrei foi correto e desgastado.</w:t>
+        <w:t xml:space="preserve">A Prefeitura era um prédio de tijolos cheio de floreios na cabeceira da praça, com uma torre de relógio que adiantava quatro minutos havia tanto tempo que ninguém se lembrava de quando começara. Fui até lá na segunda-feira com Pip, por dois motivos, um deles real e o outro nem tanto. O motivo real era incluir o nome do círculo na lista de voluntários do festival e perguntar, em nome de ninguém além da própria cidade, se Frost Falls poderia arranjar um pouco de dinheiro para a Sociedade Histórica antes que o telhado viesse abaixo de vez. O motivo menos real era dar uma olhada, direito e de perto, em Vera Reed.</w:t>
+      </w:r>
+    </w:p>
+    <w:p/>
+    <w:p>
+      <w:r>
+        <w:t xml:space="preserve">O saguão estava repleto de retratos de antigos prefeitos, emoldurados em dourado e com ares autossuficientes; uma quantidade notável deles eram Blackburn, ostentando o mesmo nariz comprido dos Blackburn herdado parede abaixo como se fosse a prataria da família. No fundo do saguão, a porta do prefeito atual estava aberta. Sentado atrás de uma escrivaninha ampla e limpa que não continha nada além de um telefone e um mata-borrão de couro estava o próprio prefeito Blackburn, um homem cinzento e polido que havia herdado o nariz, o cargo e, pelo que qualquer um na cidade soubesse dizer, pouquíssimo além disso.</w:t>
+      </w:r>
+    </w:p>
+    <w:p/>
+    <w:p>
+      <w:r>
+        <w:t xml:space="preserve">Vera sentava-se na escrivaninha do lado de fora da dele, e ela era o motivo de o lugar funcionar minimamente. Todo mundo sabia disso e ninguém dizia. Ela tinha os arquivos e as chaves. O prefeito tinha o nariz e o aperto de mão. Ela ergueu os olhos quando entrei, e o sorriso que ela encontrou foi correto e desgastado.</w:t>
       </w:r>
     </w:p>
     <w:p/>
@@ -2427,7 +2427,7 @@
     <w:p/>
     <w:p>
       <w:r>
-        <w:t>Ele tinha um minuto, e concedeu-mo de trás de sua escrivaninha limpa sem se dar ao trabalho de se levantar. Argumentei a favor da Sociedade da melhor maneira que soube. O telhado deixando a água entrar nas salas dos fundos. A caldeira dando os últimos suspiros no inverno. Dois séculos de memória da cidade caindo lentamente em ruínas por falta de uma fração do que a cidade gastaria em um único fim de semana de festival. Fiz isso de forma calorosa e fui breve. Claire me contara que histórias tristes não abrem o bolso de ninguém, e eu estava tentando algo mais firme e difícil de dispensar do que a tristeza.</w:t>
+        <w:t xml:space="preserve">Ele tinha um minuto, e me concedeu esse minuto de trás de sua escrivaninha limpa sem se dar ao trabalho de se levantar. Argumentei a favor da Sociedade da melhor maneira que soube. O telhado deixando a água entrar nas salas dos fundos. A caldeira dando os últimos suspiros no inverno. Dois séculos de memória da cidade caindo lentamente em ruínas por falta de uma fração do que a cidade gastaria em um único fim de semana de festival. Fiz isso de forma calorosa e fui breve. Claire me contara que histórias tristes não abrem o bolso de ninguém, e eu estava tentando algo mais firme e difícil de dispensar do que a tristeza.</w:t>
       </w:r>
     </w:p>
     <w:p/>
@@ -2439,7 +2439,7 @@
     <w:p/>
     <w:p>
       <w:r>
-        <w:t>— É uma causa nobre — disse ele, quando terminei. — Theo faz um ótimo trabalho, à maneira dele. Mas o orçamento da cidade é o orçamento da cidade, Sra. Claus, e a história, me desculpe dizer, não limpa as estradas em fevereiro nem mantém as luzes das ruas acesas. A Sociedade sempre se sustentou com as próprias pernas. Tenho certeza de que eles vão dar um jeito, sempre deram. — Ele produziu um sorriso, o sorriso de um homem que decidira ter sido generoso apenas por ouvir. — Talvez o seu festival se revele uma excelente pequena arrecadação de fundos para eles. As pessoas ficam sentimentosas nesta época do ano.</w:t>
+        <w:t xml:space="preserve">— É uma causa nobre — disse ele, quando terminei. — Theo faz um ótimo trabalho, à maneira dele. Mas o orçamento da cidade é o orçamento da cidade, Sra. Claus, e a história, me desculpe dizer, não limpa as estradas em fevereiro nem mantém as luzes das ruas acesas. A Sociedade sempre se sustentou com as próprias pernas. Tenho certeza de que eles vão dar um jeito, sempre deram. — Ele produziu um sorriso, o sorriso de um homem que decidira ter sido generoso apenas por ouvir. — Talvez o seu festival se revele uma excelente pequena arrecadação de fundos para eles. As pessoas ficam sentimentais nesta época do ano.</w:t>
       </w:r>
     </w:p>
     <w:p/>
@@ -2457,13 +2457,13 @@
     <w:p/>
     <w:p>
       <w:r>
-        <w:t xml:space="preserve">Ela estava com a lista do festival pronta e alinhada sobre o mata-borrão. Enquanto deslizava a caneta por ela, acrescentando o grupo com sua letra miúda e uniforme, deixei meus olhos correrem pela escrivaninha dela, de maneira despreocupada e ociosa, como uma mulher esperando enquanto uma funcionária terminava. Era uma maravilha de organização, aquela escrivaninha. Pastas rotuladas dispostas em um suporte. Um calendário de parede comprido, quadriculado e cheio de anotações. E atrás dela, do chão ao teto, uma parede de gavetas de arquivo, cada uma com uma pequena moldura de latão na frente contendo um cartão datilografado. </w:t>
+        <w:t xml:space="preserve">Ela estava com a lista do festival pronta e alinhada sobre o mata-borrão. Enquanto deslizava a caneta por ela, acrescentando o círculo com sua letra miúda e uniforme, deixei meus olhos correrem pela escrivaninha dela, de maneira despreocupada e ociosa, como uma mulher esperando enquanto uma funcionária terminava. Era uma maravilha de organização, aquela escrivaninha. Pastas rotuladas dispostas em um suporte. Um calendário de parede comprido, quadriculado e cheio de anotações. E atrás dela, do chão ao teto, uma parede de gavetas de arquivo, cada uma com uma pequena moldura de latão na frente contendo um cartão datilografado. </w:t>
       </w:r>
       <w:r>
         <w:rPr>
           <w:i/>
         </w:rPr>
-        <w:t>DEEDS. PERMITS. TAX ROLLS. PROPERTY RECORDS, 1900–1950.</w:t>
+        <w:t xml:space="preserve">ESCRITURAS. ALVARÁS. CADASTROS FISCAIS. REGISTROS DE PROPRIEDADE, 1900–1950.</w:t>
       </w:r>
       <w:r>
         <w:t xml:space="preserve"> Toda a memória de papel sobre quem possuía o quê em Frost Falls, um século inteiro disso, guardada nas costas daquela única mulher cansada, e as chaves de tudo aquilo no chaveiro em sua cintura.</w:t>
@@ -2478,7 +2478,7 @@
     <w:p/>
     <w:p>
       <w:r>
-        <w:t>— Você guarda os registros de propriedade — comentei, leve, como quem apenas puxa conversa para preencher o silêncio arranhado pela caneta. — Desde antigamente. Isso deve ser útil para as pessoas. Aposto que metade da cidade vem procurar você quando quer saber quem construiu a casa deles, ou para onde foi a terra da avó.</w:t>
+        <w:t xml:space="preserve">— A senhora guarda os registros de propriedade — comentei, leve, como quem apenas puxa conversa para preencher o silêncio arranhado pela caneta. — Desde antigamente. Isso deve ser útil para as pessoas. Aposto que metade da cidade vem procurar a senhora quando quer saber quem construiu a casa deles, ou para onde foi a terra da avó.</w:t>
       </w:r>
     </w:p>
     <w:p/>
@@ -2496,7 +2496,7 @@
     <w:p/>
     <w:p>
       <w:r>
-        <w:t>— Só pergunto porque uma amiga minha andou matutando sobre as famílias antigas ultimamente. Os Blackburns. De onde veio o dinheiro dos primeiros tempos, os dias de fundação. Eu disse a ela que você saberia melhor do que ninguém onde procurar tal coisa.</w:t>
+        <w:t xml:space="preserve">— Só pergunto porque uma amiga minha andou matutando sobre as famílias antigas ultimamente. Os Blackburn. De onde veio o dinheiro dos primeiros tempos, os dias de fundação. Eu disse a ela que a senhora saberia melhor do que ninguém onde procurar tal coisa.</w:t>
       </w:r>
     </w:p>
     <w:p/>
@@ -2514,13 +2514,13 @@
     <w:p/>
     <w:p>
       <w:r>
-        <w:t>— Eu não sei de nada sobre os Blackburns — disse ela, o que era uma coisa estranha de se dizer com um Blackburn sentado a dois metros de distância atrás da porta aberta dele e escrituras dos Blackburn enchendo as gavetas atrás dela. — Isso é departamento do Theo. A Sociedade Histórica. Eu só guardo os registros. Eu não os leio. — Ela empurrou a lista do festival sobre o mata-borrão na minha direção. — Pronto. O grupo foi incluído. Havia mais alguma coisa?</w:t>
-      </w:r>
-    </w:p>
-    <w:p/>
-    <w:p>
-      <w:r>
-        <w:t>Foi resposta demais para uma pergunta tão pequena e ociosa, e veio rápido demais. A mão dela não estava totalmente firme ao empurrar a lista. Eu passara uma vida longa aprendendo a diferença entre uma pessoa que não sabe de uma coisa e uma pessoa que deseja desesperadamente que você pare de perguntar sobre ela. Vera Reed estava desejando que eu parasse. Sobre os Blackburns. Sobre os registros que ela guardava e jurava nunca ler.</w:t>
+        <w:t xml:space="preserve">— Eu não sei de nada sobre os Blackburn — disse ela, o que era uma coisa estranha de se dizer com um Blackburn sentado a dois metros de distância atrás da porta aberta dele e escrituras dos Blackburn enchendo as gavetas atrás dela. — Isso é departamento do Theo. A Sociedade Histórica. Eu só guardo os registros. Eu não os leio. — Ela empurrou a lista do festival sobre o mata-borrão na minha direção. — Pronto. O círculo foi incluído. Havia mais alguma coisa?</w:t>
+      </w:r>
+    </w:p>
+    <w:p/>
+    <w:p>
+      <w:r>
+        <w:t xml:space="preserve">Foi resposta demais para uma pergunta tão pequena e ociosa, e veio rápido demais. A mão dela não estava totalmente firme ao empurrar a lista. Eu passara uma vida longa aprendendo a diferença entre uma pessoa que não sabe de uma coisa e uma pessoa que deseja desesperadamente que você pare de perguntar sobre ela. Vera Reed estava desejando que eu parasse. Sobre os Blackburn. Sobre os registros que ela guardava e jurava nunca ler.</w:t>
       </w:r>
     </w:p>
     <w:p/>
@@ -2532,7 +2532,7 @@
     <w:p/>
     <w:p>
       <w:r>
-        <w:t>— É só isso — falei. — Obrigada, Vera. Você parece esgotada, se me permite dizer. Eles exigem demais de você neste lugar.</w:t>
+        <w:t xml:space="preserve">— É só isso — falei. — Obrigada, Vera. A senhora parece esgotada, se me permite dizer. Exigem demais da senhora neste lugar.</w:t>
       </w:r>
     </w:p>
     <w:p/>
@@ -2562,16 +2562,16 @@
     <w:p/>
     <w:p>
       <w:r>
-        <w:t xml:space="preserve">Uma mulher com problemas financeiros pesando sobre os ombros. Uma mulher com as chaves de cem anos de quem possuía o quê, com a escritura do </w:t>
-      </w:r>
-      <w:r>
-        <w:t>&lt;bt&gt;</w:t>
+        <w:t xml:space="preserve">Uma mulher com problemas financeiros pesando sobre os ombros. Uma mulher com as chaves de cem anos de quem possuía o quê, com a escritura da </w:t>
+      </w:r>
+      <w:r>
+        <w:t xml:space="preserve"/>
       </w:r>
       <w:r>
         <w:t>Winter Wonderland Inn</w:t>
       </w:r>
       <w:r>
-        <w:t>&lt;/bt&gt;</w:t>
+        <w:t xml:space="preserve"/>
       </w:r>
       <w:r>
         <w:t xml:space="preserve"> em algum lugar naquelas mesmas gavetas, e tudo o que a cidade havia registrado em 1924, quando um broche desapareceu de uma mansão, caso algo tivesse sido registrado de fato. Uma mulher que havia enrijecido ao ouvir as palavras registros de propriedade e se tornado falante demais no instante em que eu dissera o nome Blackburn, para depois me dizer, com os arquivos bem atrás de suas costas, que ela nunca os lia.</w:t>
@@ -2622,22 +2622,22 @@
     </w:p>
     <w:p>
       <w:r>
-        <w:t>A verba da prefeitura, cortada em um terço. O telhado, orçado em uma quantia que fez um dos velhinhos estremecer. A caldeira, condenada pelo técnico que fora examiná-la e que dissera, segundo Theo, estar surpresa por ter aguentado o inverno passado. O fundo patrimonial, o pouco que restava dele, esvaziado por dois anos consecutivos para manter as luzes acesas, e quase esgotado. As anuidades dos sócios, que cobriam, disse Theo, olhando para o papel e não para a sala, "aproximadamente o custo do café."</w:t>
-      </w:r>
-    </w:p>
-    <w:p>
-      <w:r>
-        <w:t>— Então — disse uma das senhoras idosas, a Sra. Pelletier, que costumava organizar as fotografias, quando ele terminou —, o que o senhor está nos dizendo, Theo, é que podemos manter as portas abertas até o ano novo. E depois disso, não.</w:t>
-      </w:r>
-    </w:p>
-    <w:p>
-      <w:r>
-        <w:t>— É o que a aritmética indica. — Theo tirou os óculos e pressionou os dedos contra a ponta do nariz e, por um instante, a voz controlada vacilou. — Eu recorri a toda parte. Quero que todos saibam disso. A cada subsídio, a cada fundação, a cada fundo em três estados. Tenho uma pasta cheia de negativas. Eu poderia forrar esta sala com elas, e pelo menos assim a sala estaria seca. — Alguns riram, aquele riso triste e impotente de quem está no fim das linhas. — A cidade não vai ajudar. Eu mesmo fui falar com o prefeito na primavera passada, e a Sra. Claus aqui presente foi novamente esta manhã, e ele diz a mesma coisa de sempre. A história não limpa as ruas de neve. — Ele colocou os óculos sobre os papéis. — Não sei mais o que tentar. Tentei ser sensato. Tentei despertar comiseração. Não tenho vergonha de dizer que tentei suscitar comiseração, por escrito, a uma fundação na cidade grande, e eles me mandaram uma cartinha muito educada dizendo que não.</w:t>
-      </w:r>
-    </w:p>
-    <w:p>
-      <w:r>
-        <w:t>Eu o observei enquanto ele falava. Vi um homem afogando-se à luz do dia, numa sala fria, diante das pessoas que amavam aquilo que ele amava, e dizendo isso em voz alta, com a água já batendo no queixo. Eu tinha ido àquela reunião ainda nutrindo a esperança meio tonta de que o homem de quem eu suspeitava pudesse, de alguma forma, ser outro que não este. Não era. Era exatamente este. Um homem bom no absoluto fim da corda, vendo a Sociedade à qual dedicara a vida afundar por falta de dinheiro, enquanto a mancha se espalhava pelo teto e o balde de zinco recolhia a chuva.</w:t>
+        <w:t xml:space="preserve">A verba da prefeitura, cortada em um terço. O telhado, orçado em uma quantia que fez um dos velhinhos estremecer. A caldeira, condenada pelo técnico que fora examiná-la e que dissera, segundo Theo, estar surpreso por ela ter aguentado o inverno passado. O fundo patrimonial, o pouco que restava dele, esvaziado por dois anos consecutivos para manter as luzes acesas, e quase esgotado. As anuidades dos sócios, que cobriam, disse Theo, olhando para o papel e não para a sala, "aproximadamente o custo do café."</w:t>
+      </w:r>
+    </w:p>
+    <w:p>
+      <w:r>
+        <w:t xml:space="preserve">— Então — disse uma das senhoras idosas, a Sra. Pelletier, que organizara as fotografias, quando ele terminou —, o que o senhor está nos dizendo, Theo, é que podemos manter as portas abertas até o ano novo. E depois disso, não.</w:t>
+      </w:r>
+    </w:p>
+    <w:p>
+      <w:r>
+        <w:t xml:space="preserve">— É o que a aritmética indica. — Theo tirou os óculos e pressionou os dedos contra a ponta do nariz e, por um instante, a voz controlada vacilou. — Eu recorri a toda parte. Quero que todos saibam disso. A cada subsídio, a cada fundação, a cada fundo em três estados. Tenho uma pasta cheia de negativas. Eu poderia forrar esta sala com elas, e pelo menos assim a sala estaria seca. — Alguns riram, aquele riso triste e impotente de quem está no fim da linha. — A cidade não vai ajudar. Eu mesmo fui falar com o prefeito na primavera passada, e a Sra. Claus aqui presente foi novamente esta manhã, e ele diz a mesma coisa de sempre. A história não limpa as ruas de neve. — Ele colocou os óculos sobre os papéis. — Não sei mais o que tentar. Tentei ser sensato. Tentei despertar comiseração. Não tenho vergonha de dizer que tentei suscitar comiseração, por escrito, a uma fundação na cidade grande, e eles me mandaram uma cartinha muito educada dizendo que não.</w:t>
+      </w:r>
+    </w:p>
+    <w:p>
+      <w:r>
+        <w:t xml:space="preserve">Eu o observei enquanto ele falava. Vi um homem afogando-se à luz do dia, numa sala fria, diante das pessoas que amavam aquilo que ele amava, e dizendo isso em voz alta, com a água já batendo no queixo. Eu tinha ido àquela reunião ainda meio que esperando que o homem de quem eu suspeitava pudesse, de alguma forma, ser outro que não este. Não era. Era exatamente este. Um homem bom no absoluto fim da corda, vendo a Sociedade à qual dedicara a vida afundar por falta de dinheiro, enquanto a mancha se espalhava pelo teto e o balde de zinco recolhia a chuva.</w:t>
       </w:r>
     </w:p>
     <w:p>
@@ -2678,12 +2678,12 @@
     <w:p/>
     <w:p>
       <w:r>
-        <w:t>A Frost Fitness era o estabelecimento mais novo na Evergreen Avenue, puro vidro e luz forte e clara, com o ranger da borracha limpa sob os pés. Jamal Washington havia se jogado de cabeça no festival, como fazia em tudo. Pendurara flocos de neve de papel prateado no teto e passara luzes brancas ao redor de cada espelho, de modo que o lugar inteiro reluzia como o interior de um globo de neve agitado. Um sistema de som em algum lugar tocava uma música com uma batida que a gente sentia no chão. Ele estava na recepção quando entrei, e seu rosto se abriu naquele sorriso largo e caloroso que era metade do motivo de o negócio ir tão bem.</w:t>
-      </w:r>
-    </w:p>
-    <w:p>
-      <w:r>
-        <w:t>— Senhora Claus! E Pip! — Ele deu a volta no balcão e agachou-se para cumprimentar o pinguim, que tolerou o gesto com o ar de uma realeza em visita. — Eu nunca pensei que diria isso, mas um pinguim é exatamente o associado que estava me faltando. Feito para o frio. Nadador nato. As pessoas vivem me dizendo que eu deveria instalar uma piscina, e eu vivo respondendo que não tenho espaço, mas para a Pip eu daria um jeito.</w:t>
+        <w:t xml:space="preserve">A Frost Fitness era o estabelecimento mais novo na Avenida Evergreen, puro vidro e luz forte e clara, com o ranger da borracha limpa sob os pés. Jamal Washington havia se jogado de cabeça no festival, como fazia em tudo. Pendurara flocos de neve de papel prateado no teto e passara luzes brancas ao redor de cada espelho, de modo que o lugar inteiro reluzia como o interior de um globo de neve agitado. Um sistema de som em algum lugar tocava uma música com uma batida que a gente sentia no chão. Ele estava na recepção quando entrei, e seu rosto se abriu naquele sorriso largo e caloroso que era metade do motivo de o negócio ir tão bem.</w:t>
+      </w:r>
+    </w:p>
+    <w:p>
+      <w:r>
+        <w:t xml:space="preserve">— Sra. Claus! E Pip! — Ele deu a volta no balcão e agachou-se para cumprimentar o pinguim, que tolerou o gesto com o ar de uma realeza em visita. — Eu nunca pensei que diria isso, mas um pinguim é exatamente o associado que estava me faltando. Feito para o frio. Nadador nato. As pessoas vivem me dizendo que eu deveria instalar uma piscina, e eu vivo respondendo que não tenho espaço, mas para a Pip eu daria um jeito.</w:t>
       </w:r>
     </w:p>
     <w:p>
@@ -2703,7 +2703,7 @@
     </w:p>
     <w:p>
       <w:r>
-        <w:t>Portanto, investiguei, de sossego e devagar, como fizera com Sam.</w:t>
+        <w:t xml:space="preserve">Portanto, investiguei, de esguelha e devagar, como fizera com Sam.</w:t>
       </w:r>
     </w:p>
     <w:p>
@@ -2718,7 +2718,7 @@
     </w:p>
     <w:p>
       <w:r>
-        <w:t>— Devagar — admitiu ele. — O banco está em cima do empréstimo. Terceiro mês já. Toda vez que acho que chegamos lá, eles exigem mais um formulário, mais um número, mais um mês de extratos. — Ele desviou o olhar, fitando o piso novo e reluzente. — Não vou mentir para a senhora, senhora Claus, está difícil. Pus tudo o que tinha neste lugar. Tudo o que eu tinha e uma boa parte do que não tinha. Tem noites em que faço as contas e fico deitado sem conseguir pregar o olho.</w:t>
+        <w:t xml:space="preserve">— Devagar — admitiu ele. — O banco está em cima do empréstimo. Terceiro mês já. Toda vez que acho que chegamos lá, eles exigem mais um formulário, mais um número, mais um mês de extratos. — Ele desviou o olhar, fitando o piso novo e reluzente. — Não vou mentir para a senhora, Sra. Claus, está difícil. Pus tudo o que tinha neste lugar. Tudo o que eu tinha e uma boa parte do que não tinha. Tem noites em que faço as contas e fico deitado sem conseguir pregar o olho.</w:t>
       </w:r>
     </w:p>
     <w:p>
@@ -2728,12 +2728,12 @@
     </w:p>
     <w:p>
       <w:r>
-        <w:t>— É sim. — Ele soltou um suspiro longo e então, porque sua mãe aparentemente o havia criado para não reclamar sem apresentar um plano junto, endireitou os ombros. — Mas eis o que estou fazendo a respeito, já que perguntou, e prefiro lhe dizer francamente a deixar a senhora preocupada. Aceitei o contrato de segurança do festival. Pernoites, o fim de semana inteiro, vigiando as barracas, o palco e o equipamento para nada sumir no escuro. E adicionei as turmas mais cedo, treino funcional às cinco e meia, antes mesmo de o dia normal começar. — Ele deu de ombros, e o sorriso voltou mais verdadeiro desta vez. — A gente não resolve problema financeiro desejando que ele suma, senhora Claus. A gente resolve trabalhando mais horas do que o problema tem. É o único jeito que conheço e nunca me falhou até agora, só é demorado e dói.</w:t>
-      </w:r>
-    </w:p>
-    <w:p>
-      <w:r>
-        <w:t>Refleti sobre aquilo como fizera com os vinte dólares de Sam. Ali estava um homem atolado em dívidas, com todo motivo do mundo e toda oportunidade também. A resposta dele para isso era fazer vigília no festival da cidade a noite inteira por um trocado e ensinar avós a fazerem afundo às cinco e meia da manhã. Jamal estava trabalhando em três empregos para sair do buraco do jeito honesto, exaustivo e passo a passo, e isso não combinava com uma nota de extorsão de meio milhão de dólares. A matemática não fechava. Se Jamal Washington tivesse qualquer meio de conjurar essa quantia de dinheiro a partir de um segredo, ele não estaria acertando o despertador para as cinco.</w:t>
+        <w:t xml:space="preserve">— É sim. — Ele soltou um suspiro longo e então, porque sua mãe aparentemente o havia criado para não reclamar sem apresentar um plano junto, endireitou os ombros. — Mas eis o que estou fazendo a respeito, já que perguntou, e prefiro lhe dizer francamente a deixar a senhora preocupada. Aceitei o contrato de segurança do festival. Pernoites, o fim de semana inteiro, vigiando as barracas, o palco e o equipamento para nada sumir no escuro. E adicionei as turmas mais cedo, treino funcional às cinco e meia, antes mesmo de o dia normal começar. — Ele deu de ombros, e o sorriso voltou mais verdadeiro desta vez. — A gente não resolve problema financeiro desejando que ele suma, Sra. Claus. A gente resolve trabalhando mais horas do que o problema tem. É o único jeito que conheço e nunca me falhou até agora, só é demorado e dói.</w:t>
+      </w:r>
+    </w:p>
+    <w:p>
+      <w:r>
+        <w:t xml:space="preserve">Refleti sobre aquilo como fizera com os vinte dólares de Sam. Ali estava um homem atolado em dívidas, com todo motivo do mundo e toda oportunidade também. A resposta dele para isso era fazer vigília no festival da cidade a noite inteira por um trocado e ensinar avós a fazerem afundo às cinco e meia da manhã. Jamal estava trabalhando em três empregos para sair do buraco do jeito honesto, exaustivo e passo a passo, e isso não combinava com um bilhete de chantagem de meio milhão de dólares. A matemática não fechava. Se Jamal Washington tivesse qualquer meio de conjurar essa quantia de dinheiro a partir de um segredo, ele não estaria acertando o despertador para as cinco.</w:t>
       </w:r>
     </w:p>
     <w:p>
@@ -2743,12 +2743,12 @@
     </w:p>
     <w:p>
       <w:r>
-        <w:t>— Você ajudou o Theo com a exposição — falei. — Todos aqueles papéis antigos. Chegou a dar uma olhada em algo enquanto estava lá dentro? As coisas dos Blackburn, as cartas antigas?</w:t>
-      </w:r>
-    </w:p>
-    <w:p>
-      <w:r>
-        <w:t>— Olhar para elas? — Ele riu, pego de surpresa. — Senhora Claus, eu estava carregando vitrines de exposição de duas em duas e tentando não enfiar o pé numa cadeira de cem anos. Não li uma palavra sequer. Eu não saberia distinguir um Blackburn de uma amora silvestre. O Theo me entregava uma caixa e dizia "cuidado agora, cuidado, essa é preciosa", e eu levava a caixa preciosa para onde ele apontasse e voltava correndo para buscar a próxima caixa preciosa. — Ele balançou a cabeça, rindo da lembrança. — No fim da semana, eu estava tão acabado que teria assinado qualquer coisa só para ter permissão para sentar. Essa foi toda a minha carreira de historiador.</w:t>
+        <w:t xml:space="preserve">— O senhor ajudou o Theo com a exposição — falei. — Todos aqueles papéis antigos. Chegou a dar uma olhada em algo enquanto estava lá dentro? As coisas dos Blackburn, as cartas antigas?</w:t>
+      </w:r>
+    </w:p>
+    <w:p>
+      <w:r>
+        <w:t xml:space="preserve">— Olhar para elas? — Ele riu, pego de surpresa. — Sra. Claus, eu estava carregando vitrines de exposição de duas em duas e tentando não enfiar o pé numa cadeira de cem anos. Não li uma palavra sequer. Eu não saberia distinguir um Blackburn de uma amora silvestre. O Theo me entregava uma caixa e dizia "cuidado agora, cuidado, essa é preciosa", e eu levava a caixa preciosa para onde ele apontasse e voltava correndo para buscar a próxima caixa preciosa. — Ele balançou a cabeça, rindo da lembrança. — No fim da semana, eu estava tão acabado que teria assinado qualquer coisa só para ter permissão para sentar. Essa foi toda a minha carreira de historiador.</w:t>
       </w:r>
     </w:p>
     <w:p>
@@ -2758,7 +2758,7 @@
     </w:p>
     <w:p>
       <w:r>
-        <w:t>— Bem — falei —, você é um bom amigo para o Theo, emprestando toda essa força quando já estava com problemas próprios. Ele precisava muito disso, eu acho.</w:t>
+        <w:t xml:space="preserve">— Bem — falei —, o senhor é um bom amigo para o Theo, emprestando toda essa força quando já estava com problemas próprios. Ele precisava muito disso, eu acho.</w:t>
       </w:r>
     </w:p>
     <w:p>
@@ -2768,7 +2768,7 @@
     </w:p>
     <w:p>
       <w:r>
-        <w:t>— Você é a pessoa certa para quem pedir força — eu disse. — E bondade. Isso também conta.</w:t>
+        <w:t xml:space="preserve">— O senhor é a pessoa certa para quem pedir força — eu disse. — E bondade. Isso também conta.</w:t>
       </w:r>
     </w:p>
     <w:p>
@@ -2809,16 +2809,16 @@
         <w:t xml:space="preserve">Greta mantinha um grande globo de neve de vidro no balcão da </w:t>
       </w:r>
       <w:r>
-        <w:t>&lt;bt&gt;</w:t>
-      </w:r>
-      <w:r>
-        <w:t>The Holly Jolly Bakery</w:t>
-      </w:r>
-      <w:r>
-        <w:t>&lt;/bt&gt;</w:t>
-      </w:r>
-      <w:r>
-        <w:t>, uma lembrança para turistas com uma miniatura de cerâmica de Frost Falls dentro, verde com a prefeitura e tudo o mais. Naquela manhã, quando passei para comprar os rolinhos de canela de Nick, a neve lá dentro não sossegava. Rodopiava e rodopiava sem que nenhuma mão estivesse perto, uma mini-nevasca girando sem parar atrás do vidro. Greta havia jogado um pano de prato sobre metade dele, como se isso fosse ajudar, e vendia seus rolinhos ao lado com a alegria determinada de uma mulher que decidira não discutir o globo de neve.</w:t>
+        <w:t xml:space="preserve">padaria</w:t>
+      </w:r>
+      <w:r>
+        <w:t xml:space="preserve"> Holly Jolly</w:t>
+      </w:r>
+      <w:r>
+        <w:t xml:space="preserve"/>
+      </w:r>
+      <w:r>
+        <w:t xml:space="preserve">, uma lembrança para turistas com uma miniatura de cerâmica de Frost Falls dentro, com a praça, a prefeitura e tudo o mais. Naquela manhã, quando passei para comprar os rolinhos de canela de Nick, a neve lá dentro não sossegava. Rodopiava e rodopiava sem que nenhuma mão estivesse perto, uma mini-nevasca girando sem parar atrás do vidro. Greta havia jogado um pano de prato sobre metade dele, como se isso fosse ajudar, e vendia seus rolinhos ao lado com a alegria determinada de uma mulher que decidira não discutir o globo de neve.</w:t>
       </w:r>
     </w:p>
     <w:p/>
@@ -2848,7 +2848,7 @@
     <w:p/>
     <w:p>
       <w:r>
-        <w:t>Lá na praça, o problema era de Bram. Prancer havia escapado do cercado durante a noite e descido para a cidade, e estava parada no fundo da fonte, que a prefeitura desligava todo mês de outubro, com as patas submersas em folhas caídas. Ficava lá com a cabeça erguida, e não saía do lugar.</w:t>
+        <w:t xml:space="preserve">Lá na praça, o problema era de Bram. Prancer havia escapado do piquete durante a noite e descido para a cidade, e estava parada no fundo da fonte, que a prefeitura desligava todo mês de outubro, com as patas submersas em folhas caídas. Ficava lá com a cabeça erguida, e não saía do lugar.</w:t>
       </w:r>
     </w:p>
     <w:p/>
@@ -2866,7 +2866,7 @@
     <w:p/>
     <w:p>
       <w:r>
-        <w:t>Uma pequena multidão realmente se reunira, e estava encantada. Crianças haviam aparecido, como sempre acontece no instante em que há uma rena, e estavam subindo na borda da fonte para acariciá-la e gritando. Um homem que eu não conhecia estava fotografando Prancer para os netos, e o velho Sr. Kim, da oficina mecânica, trouxera uma cadeira de praia para a calçada para assistir a todo o espetáculo com a satisfação de quem assiste a um bom programa.</w:t>
+        <w:t xml:space="preserve">Uma pequena multidão realmente se reunira, e estava encantada. Crianças haviam aparecido, como sempre acontece no instante em que há uma rena, e estavam subindo na borda da fonte para acariciá-la e gritando. Um homem que eu não conhecia estava fotografando Prancer para os netos, e o velho Sr. Kim, da oficina mecânica, trouxera uma cadeira dobrável para a calçada para assistir a todo o espetáculo com a satisfação de quem assiste a um bom programa.</w:t>
       </w:r>
     </w:p>
     <w:p/>
@@ -2895,7 +2895,7 @@
     <w:p/>
     <w:p>
       <w:r>
-        <w:t>Ela ergueu a cabeça e olhou para mim. Por um longo momento depois disso, olhou rua acima em direção à cabana e à oficina logo atrás, do jeito que uma criatura faz quando sente o cheiro de algo melhor do que o que está na sua frente. Ela saiu da fonte, espalhando folhas sobre as botas de Bram, e arrancou vivas das crianças. Então partiu rua acima em um passo sem pressa, em direção a casa, com dignidade, e todos nós a vimos ir embora.</w:t>
+        <w:t xml:space="preserve">Ela ergueu a cabeça e olhou para mim. Por um longo momento depois disso, olhou rua acima em direção ao chalé e à oficina logo atrás, do jeito que uma criatura faz quando sente o cheiro de algo melhor do que o que está na sua frente. Ela saiu da fonte, espalhando folhas sobre as botas de Bram, e arrancou vivas das crianças. Então partiu rua acima em um passo sem pressa, em direção a casa, com dignidade, e todos nós a vimos ir embora.</w:t>
       </w:r>
     </w:p>
     <w:p/>
@@ -2968,7 +2968,7 @@
     </w:p>
     <w:p>
       <w:r>
-        <w:t>Ivy estava contando a história da fonte. Ela soube por Mr. Kim, que assistira a tudo da sua cadeira de praia. Na versão de Ivy, Prancer estava na fonte desde o amanhecer, e Bram tinha entrado atrás dela até a altura dos peitos.</w:t>
+        <w:t xml:space="preserve">Ivy estava contando a história da fonte. Ela soube pelo Sr. Kim, que assistira a tudo da sua cadeira dobrável. Na versão de Ivy, Prancer estava na fonte desde o amanhecer, e Bram tinha entrado atrás dela até as axilas.</w:t>
       </w:r>
     </w:p>
     <w:p>
@@ -2978,7 +2978,7 @@
     </w:p>
     <w:p>
       <w:r>
-        <w:t>— Não é assim que Mr. Kim conta. — Ivy deu risada, aquela risada grande e solta que preenchia a loja.</w:t>
+        <w:t xml:space="preserve">— Não é assim que o Sr. Kim conta. — Ivy deu risada, aquela risada grande e solta que preenchia a loja.</w:t>
       </w:r>
     </w:p>
     <w:p>
@@ -3088,7 +3088,7 @@
     </w:p>
     <w:p>
       <w:r>
-        <w:t>— Alguém viu a Fiona esta semana? Ela não apareceu em nenhuma reunião de comissão. É ela sempre quem cuida da mesa de tortas.</w:t>
+        <w:t xml:space="preserve">— Alguém viu a Fiona esta semana? Ela não apareceu em nenhuma reunião do comitê. É ela sempre quem cuida da mesa de tortas.</w:t>
       </w:r>
     </w:p>
     <w:p>
@@ -3118,7 +3118,7 @@
     </w:p>
     <w:p>
       <w:r>
-        <w:t>Trabalhamos até a luz sumir. Por volta das cinco horas, o barbante sobre o balcão vergava no meio, e restavam nove pares nos cestos. Ellie levou três pares para casa e Ivy levou dois. O último punho nas minhas agulhas trazia escrito MAXIMILIAN em verde e branco, e tuve de esticá-lo sobre o joelho para caber cada letra ao redor.</w:t>
+        <w:t xml:space="preserve">Trabalhamos até a luz sumir. Por volta das cinco horas, o barbante sobre o balcão vergava no meio, e restavam nove pares nos cestos. Ellie levou três pares para casa e Ivy levou dois. O último punho nas minhas agulhas trazia escrito MAXIMILIAN em verde e branco, e tive de esticá-lo sobre o joelho para caber cada letra ao redor.</w:t>
       </w:r>
     </w:p>
     <w:p>
@@ -3195,7 +3195,7 @@
     </w:p>
     <w:p>
       <w:r>
-        <w:t>Franzi a testa para o nome dele na página. — Esse é o que eu não consigo resolver. Ele sabe tudo o que o chantagista sabe. O broche, a pedra única, Ridgeline, tudo. Ele chegou a isso pelo lado dos Blackburn, o lado dos advogados do espólio, e rastreou quase até a porta da Constance. — Dei uma meia-volta lenta na minha xícara sobre a mesa. — Mas ele conta para todo mundo. Distribui cartões. Sentou-se na biblioteca pública e me contou tudo antes que eu sequer pudesse perguntar. Um chantagista se esconde, Nick. Todo o poder dele está em se esconder. E Neil Carter faz exatamente o oposto de se esconder, a cada hora do dia. Então ou ele não é o nosso homem de jeito nenhum, ou é o mais esperto de todos, fazendo tanto barulho honesto sobre o broche que ninguém na cidade daria bola duas vezes para o homem que mais fala dele. — Deixei um ponto de interrogação ao lado de Neil. — Não estou pronta para descartá-lo. Mas direi uma coisa. Ele sabe o segredo, chegou até ele de forma honesta, e nunca chegou perto da Fiona pedindo um centavo. Ele foi falar com ela em busca de respostas, à luz do dia, com um caderno na mão.</w:t>
+        <w:t xml:space="preserve">Franzi a testa para o nome dele na página. — Esse é o que eu não consigo resolver. Ele sabe tudo o que o chantagista sabe. O broche, a pedra única, Ridgeline, tudo. Ele chegou a isso pelo lado dos Blackburn, o lado dos advogados do espólio, e rastreou quase até a porta da Constance. — Dei uma meia-volta lenta na minha xícara sobre a mesa. — Mas ele conta para todo mundo. Distribui cartões. Sentou-se na biblioteca pública e me contou tudo antes que eu sequer pudesse perguntar. Um chantagista se esconde, Nick. Todo o poder dele está em se esconder. E Neil Carter faz exatamente o oposto de se esconder, a cada hora do dia. Então ou ele não é o nosso homem de jeito nenhum, ou é o mais esperto de todos, fazendo tanto barulho honesto sobre o broche que ninguém na cidade olharia duas vezes para o homem que mais fala dele. — Deixei um ponto de interrogação ao lado de Neil. — Não estou pronta para descartá-lo. Mas direi uma coisa. Ele sabe o segredo, chegou até ele de forma honesta, e nunca chegou perto da Fiona pedindo um centavo. Ele foi falar com ela em busca de respostas, à luz do dia, com um caderno na mão.</w:t>
       </w:r>
     </w:p>
     <w:p>
@@ -3220,12 +3220,12 @@
     </w:p>
     <w:p>
       <w:r>
-        <w:t>— Eu não quero que seja ninguém. — Apoiei as mãos espalmadas na mesa de cada lado da página. — Quero ter lido tudo errado. Quero que o Neil acabe sendo um vilão astuto para que seja um estranho que apareceu na cidade, e não um amigo que mora aqui há trinta anos. Mas querer não é evidência, Nick, nunca foi, e cada fato que descubro desenha o mesmo formato, e o formato tem o nome do Theo bem no meio. As cartas saíram do arquivo. O bilhete está escrito no papel do próprio arquivo. E o homem que dirige o arquivo está desesperado. Bateu em todas as portas honestas que existem e as encontrou todas fechadas na cara dele. — Balançuei a cabeça. — É um formato terrível. Continuo esperando que o próximo fato o despedace. E o próximo fato continua encaixando outra pedra nele.</w:t>
-      </w:r>
-    </w:p>
-    <w:p>
-      <w:r>
-        <w:t>— Então ponha à prova — disse Nick —, em vez de ficar aqui na cozinha com medo disso, o que nunca resolveu nada e nunca vai resolver. Vá dar uma olhada na única coisa que você ainda não examinou direito. As cartas em si, ou o lugar onde elas deveriam estar. — Ele estendeu a mão sobre a mesa e cobriu a minha, que estava fria, com a sua mão quente. — Theo poderia usar um par de mãos para botar aquele arquivo em ordem. Vá e ofereça-se. E, enquanto ajuda, descubra uma única coisa. Se as palavras daquele bilhete coincidem com as palavras das cartas que sumiram. Porque se coincidirem, Jess, então quem escreveu o bilhete não leu apenas os papéis dos Blackburn no geral. Tinha aquelas cartas exatas nas mãos. E há uma lista muito curta de pessoas em Frost Falls que poderiam dizer isso.</w:t>
+        <w:t xml:space="preserve">— Eu não quero que seja ninguém. — Apoiei as mãos espalmadas na mesa de cada lado da página. — Quero ter lido tudo errado. Quero que o Neil acabe sendo um vilão astuto para que seja um estranho que apareceu na cidade, e não um amigo que mora aqui há trinta anos. Mas querer não é evidência, Nick, nunca foi, e cada fato que descubro desenha o mesmo formato, e o formato tem o nome do Theo bem no meio. As cartas saíram do arquivo. O bilhete está escrito no papel do próprio arquivo. E o homem que dirige o arquivo está desesperado. Bateu em todas as portas honestas que existem e as encontrou todas fechadas na cara dele. — Balancei a cabeça. — É um formato terrível. Continuo esperando que o próximo fato o despedace. E o próximo fato continua encaixando outra pedra nele.</w:t>
+      </w:r>
+    </w:p>
+    <w:p>
+      <w:r>
+        <w:t xml:space="preserve">— Então ponha à prova — disse Nick —, em vez de ficar aqui na cozinha com medo disso, o que nunca resolveu nada e nunca vai resolver. Vá dar uma olhada na única coisa que você ainda não examinou direito. As cartas em si, ou o lugar onde elas deveriam estar. — Ele estendeu a mão sobre a mesa e cobriu a minha, que estava fria, com a sua mão quente. — Theo bem que precisaria de um par de mãos para botar aquele arquivo em ordem. Vá e ofereça-se. E, enquanto ajuda, descubra uma única coisa. Se as palavras daquele bilhete coincidem com as palavras das cartas que sumiram. Porque se coincidirem, Jess, então quem escreveu o bilhete não leu apenas os papéis dos Blackburn no geral. Tinha aquelas cartas exatas nas mãos. E há uma lista muito curta de pessoas em Frost Falls que poderiam dizer isso.</w:t>
       </w:r>
     </w:p>
     <w:p>
@@ -3235,7 +3235,7 @@
     </w:p>
     <w:p>
       <w:r>
-        <w:t>— Logo — eu disse. — Há duas pontas soltas para amarrar primeiro. Sam e o estranho. Quero ambos fora de cogitação com certeza, absolvidos de qualquer dúvida, antes de me permitir entrar naquele arquivo e olhar bem para o Theo. Devo isso a ele, não o condenar enquanto não restar mais ninguém para suspeitar. E então irei, olharei para das cartas e descobrirei se as palavras coincidem.</w:t>
+        <w:t xml:space="preserve">— Logo — eu disse. — Há duas pontas soltas para amarrar primeiro. Sam e o estranho. Quero ambos fora de cogitação com certeza, absolvidos de qualquer dúvida, antes de me permitir entrar naquele arquivo e olhar bem para o Theo. Devo isso a ele, não o condenar enquanto não restar mais ninguém para suspeitar. E então irei, olharei para as cartas e descobrirei se as palavras coincidem.</w:t>
       </w:r>
     </w:p>
     <w:p>
@@ -3262,7 +3262,7 @@
     <w:p/>
     <w:p>
       <w:r>
-        <w:t>Ele não estava na forja. Estava na pousada, em cima de uma escada no alpendre, pendurando o último dos suportes de ferro, com a boca cheia de parafusos e um nível equilibrado no corrimão. Desceu assim que me viu na calçada, ressabiado. Da última vez que havíamos conversado, eu o rondara sem dizer nada, e ele sentira isso, mesmo que não soubesse dar um nome.</w:t>
+        <w:t xml:space="preserve">Ele não estava na forja. Estava na pousada, em cima de uma escada na varanda, pendurando o último dos suportes de ferro, com a boca cheia de parafusos e um nível equilibrado no corrimão. Desceu assim que me viu na calçada, ressabiado. Da última vez que havíamos conversado, eu o rondara sem dizer nada, e ele sentira isso, mesmo que não soubesse dar um nome.</w:t>
       </w:r>
     </w:p>
     <w:p/>
@@ -3274,7 +3274,7 @@
     <w:p/>
     <w:p>
       <w:r>
-        <w:t>— Sam, eu te devo uma. — Eu matutara como fazer aquilo durante toda a caminhada até lá e decidira pela verdade, ou por tanta dela quanto me cabia revelar. Eu desconfiara daquele homem bom, e o único jeito honesto de consertar isso era confiar nele, dando-lhe em troca um pedaço da história. — Podemos dar uma voltada? Longe das janelas.</w:t>
+        <w:t xml:space="preserve">— Sam, eu lhe devo uma. — Eu matutara como fazer aquilo durante toda a caminhada até lá e decidira pela verdade, ou por tanta dela quanto me cabia revelar. Eu desconfiara daquele homem bom, e o único jeito honesto de consertar isso era confiar nele, dando-lhe em troca um pedaço da história. — Podemos dar uma volta? Longe das janelas.</w:t>
       </w:r>
     </w:p>
     <w:p/>
@@ -3286,7 +3286,7 @@
     <w:p/>
     <w:p>
       <w:r>
-        <w:t>Caminhamos até a extremidade sossegada do alpendre, fora do alcance de quem estivesse na recepção, onde o sol da manhã ainda não chegava e nosso hálito saía branquinho no ar. Contei a ele. Não tudo. Mas o contorno. Que a Fiona estava em apuros de verdade. Que alguém a estava chantageando por causa de um assunto antigo de família, algo de cem anos atrás e que não era culpa dela de jeito nenhum. Que era por isso que ela andava esquisita e pálida, por que não conseguia lhe pagar, por que não conseguia olhar nos olhos dele. Que ela estava assustada, Sam, e não fria. Nunca fria.</w:t>
+        <w:t xml:space="preserve">Caminhamos até a extremidade sossegada da varanda, fora do alcance de quem estivesse na recepção, onde o sol da manhã ainda não chegava e nosso hálito saía branquinho no ar. Contei a ele. Não tudo. Mas o contorno. Que a Fiona estava em apuros de verdade. Que alguém a estava chantageando por causa de um assunto antigo de família, algo de cem anos atrás e que não era culpa dela de jeito nenhum. Que era por isso que ela andava esquisita e pálida, por que não conseguia lhe pagar, por que não conseguia olhar nos olhos dele. Que ela estava assustada, Sam, e não fria. Nunca fria.</w:t>
       </w:r>
     </w:p>
     <w:p/>
@@ -3298,13 +3298,13 @@
     <w:p/>
     <w:p>
       <w:r>
-        <w:t>— Chantagem. — Ele disse a palavra em tom baixo, como se tivesse gosto ruim. — A Fiona. E eu passei três semanas plantado no alpendre dela emburrado por vinte dólares, enquanto ela carregava esse peso todo. — Ele apertou a palma de uma mão com força contra a testa, deixando ali uma mancha escura. — Diga a ela que está perdoado. Os vinte dólares, a encomenda inteira, cada centavo, diga que eu nunca mais quero ouvir falar nisso enquanto eu viver. Caramba. Eu piorei as coisas, não foi? Incomodando ela por dinheiro enquanto ela estava afundando. Eu piorei tudo e nem sabia.</w:t>
-      </w:r>
-    </w:p>
-    <w:p/>
-    <w:p>
-      <w:r>
-        <w:t>— Você não sabia — eu disse. — Como poderia? Essa é a única razão pela qual te contei agora.</w:t>
+        <w:t xml:space="preserve">— Chantagem. — Ele disse a palavra em tom baixo, como se tivesse gosto ruim. — A Fiona. E eu passei três semanas plantado na varanda dela emburrado por vinte dólares, enquanto ela carregava esse peso todo. — Ele apertou a palma de uma mão com força contra a testa, deixando ali uma mancha escura. — Diga a ela que está perdoado. Os vinte dólares, a encomenda inteira, cada centavo, diga que eu nunca mais quero ouvir falar nisso enquanto eu viver. Caramba. Eu piorei as coisas, não foi? Incomodando ela por dinheiro enquanto ela estava afundando. Eu piorei tudo e nem sabia.</w:t>
+      </w:r>
+    </w:p>
+    <w:p/>
+    <w:p>
+      <w:r>
+        <w:t xml:space="preserve">— O senhor não sabia — eu disse. — Como poderia? Essa é a única razão pela qual lhe contei agora.</w:t>
       </w:r>
     </w:p>
     <w:p/>
@@ -3316,25 +3316,25 @@
     <w:p/>
     <w:p>
       <w:r>
-        <w:t>E estava ali a última prova, embora eu tivesse ido para me desculpar e não para encontrar provas. Se o Sam Patel tivesse escrito aqueles bilhetes, ele não estaria no alpendre frio da Fiona com um nível na mão oferecendo, pálido, para me ajudar a pegá-lo. A ideia inteira ruía no instante em que você olhava para o rosto dele.</w:t>
-      </w:r>
-    </w:p>
-    <w:p/>
-    <w:p>
-      <w:r>
-        <w:t>O cheiro do bilhete nunca tinha sido do Sam. Era do trabalho dele. Um ferreiro acaba o ferro queimando óleo nele enquanto ainda está quente, e o ferro novo guarda aquele cheiro de fumaça por semanas. A recepção da Fiona estava cheia daquilo, o corrimão da escada, a grade da lareira, os suportes que estavam sendo instalados no alpendre, e o casaco e a bolsa de ferramentas do Sam ficavam pendurados perto da porta dela todo santo dia por três semanas. Qualquer papel que ficasse em cima daquela mesa pegava o cheiro. O bilhete também ficara lá. A pista que o colocara no topo da minha lista vinha me dizendo o tempo todo onde o bilhete estivera. Não quem o escrevera. Eu estivera lendo aquilo de trás para frente. Agora eu podia ler do jeito certo, e o jeito certo o absolvia por completo, de forma limpa.</w:t>
-      </w:r>
-    </w:p>
-    <w:p/>
-    <w:p>
-      <w:r>
-        <w:t>— Fique de olho na recepção — eu disse a ele, já que ele perguntara e merecia mais do que nunca uma resposta verdadeira. — O festival é neste fim de semana, e a pousada vai estar cheia de desconhecidos entrando e saindo o dia todo. Se alguém deixar alguma coisa em cima daquela mesa e sair depressa, no meio daquela confusão toda, você decora o rosto da pessoa para mim. Você tem olhos atentos e vai estar aqui em cima daquela escada de qualquer jeito. É só isso que eu quero. Não os impeça, não diga uma palavra, não dê na vista. Só memorize o rosto.</w:t>
-      </w:r>
-    </w:p>
-    <w:p/>
-    <w:p>
-      <w:r>
-        <w:t>— Isso eu posso fazer. — Ele apertou a minha mão, áspera como ferro e quente. — E Sra. Claus. Seja lá quanto custar para consertar isso. Se envolver dinheiro, se ela precisar de dinheiro para ficar segura, você diga a ela que os ferreiros de três condados me devem favores e eu vou cobrar cada um deles sem pensar duas vezes. Diga isso a ela também, quando for falar dos vinte dólares.</w:t>
+        <w:t xml:space="preserve">E estava ali a última prova, embora eu tivesse ido para me desculpar e não para encontrar provas. Se o Sam Patel tivesse escrito aqueles bilhetes, ele não estaria na varanda fria da Fiona com um nível na mão oferecendo, pálido, para me ajudar a pegar a si mesmo. A ideia inteira ruía no instante em que você olhava para o rosto dele.</w:t>
+      </w:r>
+    </w:p>
+    <w:p/>
+    <w:p>
+      <w:r>
+        <w:t xml:space="preserve">O cheiro do bilhete nunca tinha sido do Sam. Era do trabalho dele. Um ferreiro acaba o ferro queimando óleo nele enquanto ainda está quente, e o ferro novo guarda aquele cheiro de fumaça por semanas. A recepção da Fiona estava cheia daquilo, o corrimão da escada, a grade da lareira, os suportes que estavam sendo instalados na varanda, e o casaco e a bolsa de ferramentas do Sam ficavam pendurados perto da porta dela todo santo dia por três semanas. Qualquer papel que ficasse em cima daquela mesa pegava o cheiro. O bilhete também ficara lá. A pista que o colocara no topo da minha lista vinha me dizendo o tempo todo onde o bilhete estivera. Não quem o escrevera. Eu estivera lendo aquilo de trás para frente. Agora eu podia ler do jeito certo, e o jeito certo o absolvia por completo, de forma limpa.</w:t>
+      </w:r>
+    </w:p>
+    <w:p/>
+    <w:p>
+      <w:r>
+        <w:t xml:space="preserve">— Fique de olho na recepção — eu disse a ele, já que ele perguntara e merecia mais do que nunca uma resposta verdadeira. — O festival é neste fim de semana, e a pousada vai estar cheia de desconhecidos entrando e saindo o dia todo. Se alguém deixar alguma coisa em cima daquela mesa e sair depressa, no meio daquela confusão toda, o senhor decora o rosto da pessoa para mim. O senhor tem olhos atentos e vai estar aqui em cima daquela escada de qualquer jeito. É só isso que eu quero. Não os impeça, não diga uma palavra, não dê na vista. Só memorize o rosto.</w:t>
+      </w:r>
+    </w:p>
+    <w:p/>
+    <w:p>
+      <w:r>
+        <w:t xml:space="preserve">— Isso eu posso fazer. — Ele apertou a minha mão, áspera como ferro e quente. — E Sra. Claus. Seja lá quanto custar para consertar isso. Se envolver dinheiro, se ela precisar de dinheiro para ficar segura, a senhora diga a ela que os ferreiros de três condados me devem favores e eu vou cobrar cada um deles sem pensar duas vezes. Diga isso a ela também, quando for falar dos vinte dólares.</w:t>
       </w:r>
     </w:p>
     <w:p/>
@@ -3357,12 +3357,12 @@
     <w:p/>
     <w:p>
       <w:r>
-        <w:t>Claire me telefonou na quarta-feira à noite, radiante de si.</w:t>
-      </w:r>
-    </w:p>
-    <w:p>
-      <w:r>
-        <w:t>— Bem firme — disse ela, antes que eu sequer pudesse soltar um alô. — Uma firma antiga, a dois estados de distância, faz exatamente o que o seu homem diz que faz: inventário, testamentos e localização de espólios perdidos para advogados que têm mais dinheiro do que tempo. E há um espólio dos Blackburn, Jéssica, um de verdade, atual. O último da linhagem de Adelaide Blackburn morreu lá na cidade nesta primavera, sem filhos, sem testamento que preste, e deixou uma confusão dos diabos. Nosso prefeito é do lado dos primos, o lado que herdou o nariz e nenhum centavo. Ele não está metido nisso. O Carter consta nos registros da firma como o pesquisador que contrataram para passar tudo a limpo. Fiquei sabendo por uma funcionária que confirmou a história toda sem se dar conta de que estava confirmando o que quer que seja. Ele é exatamente, com toda a precisão, quem ele disse para você que era. Um bisbilhoteiro com licença e verba para despesas.</w:t>
+        <w:t xml:space="preserve">Claire me telefonou na quarta-feira à noite, muito satisfeita consigo mesma.</w:t>
+      </w:r>
+    </w:p>
+    <w:p>
+      <w:r>
+        <w:t xml:space="preserve">— A firma é de verdade — disse ela, antes que eu sequer pudesse soltar um alô. — Uma firma antiga, a dois estados de distância, faz exatamente o que o seu homem diz que faz: inventário, testamentos e localização de espólios perdidos para advogados que têm mais dinheiro do que tempo. E há um espólio dos Blackburn, Jessica, um de verdade, atual. O último da linhagem de Adelaide Blackburn morreu lá na cidade nesta primavera, sem filhos, sem testamento que preste, e deixou uma confusão dos diabos. Nosso prefeito é do lado dos primos, o lado que herdou o nariz e nenhum centavo. Ele não está metido nisso. O Carter consta nos registros da firma como o pesquisador que contrataram para passar tudo a limpo. Fiquei sabendo por uma funcionária que confirmou a história toda sem se dar conta de que estava confirmando o que quer que seja. Ele é exatamente, com toda a precisão, quem ele disse para você que era. Um bisbilhoteiro com licença e verba para despesas.</w:t>
       </w:r>
     </w:p>
     <w:p/>
@@ -3415,18 +3415,18 @@
     </w:p>
     <w:p>
       <w:r>
-        <w:t>— Eu disse no primeiro dia. Eu traço para onde as coisas foram. O resto é entre as pessoas e o que quer que elas respondam. — Ele puxou uma pasta gorda da pilha dele e, após um momento de hesitação, deslizou-a pela mesa na minha direção. — Tome. É melhor a senhorinha ficar com isso, já que estamos sendo francos um com o outro, e já que algum ladrãozinho mixuruca nessa sua cidade bonitinha está usando a pior metade disso para torturar uma boa mulher. É tudo o que descobri sobre a criada. Constance Okafor.</w:t>
-      </w:r>
-    </w:p>
-    <w:p/>
-    <w:p>
-      <w:r>
-        <w:t>Abri a pasta. Era um trabalho minucioso, cem anos rastreados página por página. E ela não dizia o que a carta de chantagem dizia. Dizia mais do que a carta, e dizia de forma mais bondosa.</w:t>
-      </w:r>
-    </w:p>
-    <w:p>
-      <w:r>
-        <w:t>— Ela tinha direito — disse o Neil, observando-me ler. — Essa é a parte que a fofoca sempre deixa de lado, porque a fofoca quer um vilãozinho limpo e um crimezinho limpo. Os Blackburn não pagavam a criadagem havia meses, naquele inverno de vinte e quatro. Tenho as reclamações aí dentro, os outros empregados que se demitiram, e uma carta, Sra. Claus, uma carta da própria Constance, pedindo, muito educadamente, seus salários atrasados, e recebendo como resposta que devia ser grata por ter um teto sobre a cabeça. A mãe dela estava morrendo naquele mesmo inverno, a três ruas de distância, e não havia dinheiro para um médico, nenhum. E lá estava ela, dia após dia, tirando o pó de um broche que valia mais do que ganharia em três vidas, enquanto a família dona dele mandava que fosse grata. — Ele abriu as mãos. — Não estou dizendo que ela fez bem em pegar. Estou dizendo que ela não era uma ladra do jeito simples que a nota quer fazer sua amiga acreditar. Era uma garota desesperada, roubada primeiro por gente rica que tinha condições de sobra para lhe pagar e preferiu não fazê-lo. Ela se pagou com a única coisa que podia alcançar, e construiu cem anos de acolhimento honesto em cima disso. Há fundações piores para uma estalagem.</w:t>
+        <w:t xml:space="preserve">— Eu disse no primeiro dia. Eu traço para onde as coisas foram. O resto é entre as pessoas e seja lá a quem devam satisfações. — Ele puxou uma pasta gorda da pilha dele e, após um momento de hesitação, deslizou-a pela mesa na minha direção. — Tome. É melhor a senhora ficar com isso, já que estamos sendo francos um com o outro, e já que algum ladrãozinho mixuruca nessa sua cidade bonitinha está usando a pior metade disso para torturar uma boa mulher. É tudo o que descobri sobre a criada. Constance Okafor.</w:t>
+      </w:r>
+    </w:p>
+    <w:p/>
+    <w:p>
+      <w:r>
+        <w:t xml:space="preserve">Abri a pasta. Era um trabalho minucioso, cem anos rastreados página por página. E ela não dizia o que o bilhete de chantagem dizia. Dizia mais do que o bilhete, e dizia de forma mais bondosa.</w:t>
+      </w:r>
+    </w:p>
+    <w:p>
+      <w:r>
+        <w:t xml:space="preserve">— Deviam a ela — disse o Neil, observando-me ler. — Essa é a parte que a fofoca sempre deixa de lado, porque a fofoca quer um vilãozinho limpo e um crimezinho limpo. Os Blackburn não pagavam a criadagem havia meses, naquele inverno de vinte e quatro. Tenho as reclamações aí dentro, os outros empregados que se demitiram, e uma carta, Sra. Claus, uma carta da própria Constance, pedindo, muito educadamente, seus salários atrasados, e recebendo como resposta que devia ser grata por ter um teto sobre a cabeça. A mãe dela estava morrendo naquele mesmo inverno, a três ruas de distância, e não havia dinheiro para um médico, nenhum. E lá estava ela, dia após dia, tirando o pó de um broche que valia mais do que ganharia em três vidas, enquanto a família dona dele mandava que fosse grata. — Ele abriu as mãos. — Não estou dizendo que ela fez bem em pegar. Estou dizendo que ela não era uma ladra do jeito simples que o bilhete quer fazer sua amiga acreditar. Era uma garota desesperada, roubada primeiro por gente rica que tinha condições de sobra para lhe pagar e preferiu não fazê-lo. Ela se pagou com a única coisa que podia alcançar, e construiu cem anos de acolhimento honesto em cima disso. Há fundações piores para uma pousada.</w:t>
       </w:r>
     </w:p>
     <w:p/>
@@ -3479,7 +3479,7 @@
     </w:p>
     <w:p>
       <w:r>
-        <w:t xml:space="preserve">Theo mantinha um índice, como todo bom arquivista deve fazer, uma gaveta rasa e comprida de fichas, uma ficha para cada item do acervo, cada qual contendo um breve resumo na sua letra miúda e inclinada sobre o teor de determinada pasta. Eu me oferecera para reorganizar uma pilha de fichas que havia saído de ordem. Eu estava passando pelas letras B — Recibos da Padaria, Assinaturas do Coreto —, quando cheguei às fichas dos documentos da família Blackburn, e entre elas encontrei três marcadas no topo a lápis vermelho: </w:t>
+        <w:t xml:space="preserve">Theo mantinha um índice, como todo bom arquivista deve fazer, uma gaveta rasa e comprida de fichas, uma ficha para cada item do acervo, cada qual contendo um breve resumo na sua letra miúda e inclinada sobre o teor de determinada pasta. Eu me oferecera para reorganizar uma pilha de fichas que havia saído de ordem. Eu estava passando pelas letras B — Balcão da Padaria — Recibos, Banda do Coreto — Assinaturas —, quando cheguei às fichas dos documentos da família Blackburn, e entre elas encontrei três marcadas no topo a lápis vermelho: </w:t>
       </w:r>
       <w:r>
         <w:rPr>
@@ -3501,17 +3501,17 @@
         <w:rPr>
           <w:i/>
         </w:rPr>
-        <w:t>Correspondência, Adelaide Blackburn para sua irmã, inverno de 1924. Re: o furto do broche da família (o safira em seu coração) por um criado da casa; peça penhorada mais tarde em Ridgeline. De significativo interesse local.</w:t>
-      </w:r>
-    </w:p>
-    <w:p>
-      <w:r>
-        <w:t>O safira em seu coração.</w:t>
-      </w:r>
-    </w:p>
-    <w:p>
-      <w:r>
-        <w:t>Fiquei imóvel. Treinei-me ao longo de uma vida inteira para não deixar que meu corpo me traísse, e precisei de cada migalha desse treino naquele momento, sentada à mesa de trabalho de Theo com a ficha dele na mão, porque o bilhete de extorsão dobrado no meu casaco trazia exatamente essas mesmas palavras. Não palavras parecidas com elas. Aquelas palavras. Eu não precisava tirar o bilhete para ter certeza; eu o havia lido cem vezes e conseguia vê-lo na minha mente. O safira em seu coração. É uma maneira estranha de descrever um broche, um tanto poética, a frase de um historiador e não de um ladrão. Ele constava no bilhete de extorsão exatamente como constava na ficha de Theo, as mesmas cinco palavras na mesma ordem. Duas pessoas não descrevem uma joia usando as mesmas cinco palavras esquisitas por acaso.</w:t>
+        <w:t xml:space="preserve">Correspondência, Adelaide Blackburn para sua irmã, inverno de 1924. Re: o furto do broche da família (a safira em seu coração) por um criado da casa; peça penhorada mais tarde em Ridgeline. De significativo interesse local.</w:t>
+      </w:r>
+    </w:p>
+    <w:p>
+      <w:r>
+        <w:t xml:space="preserve">A safira em seu coração.</w:t>
+      </w:r>
+    </w:p>
+    <w:p>
+      <w:r>
+        <w:t xml:space="preserve">Fiquei imóvel. Treinei-me ao longo de uma vida inteira para não deixar que meu corpo me traísse, e precisei de cada migalha desse treino naquele momento, sentada à mesa de trabalho de Theo com a ficha dele na mão, porque o bilhete de chantagem dobrado no meu casaco trazia exatamente essas mesmas palavras. Não palavras parecidas com elas. Aquelas palavras. Eu não precisava tirar o bilhete para ter certeza; eu o havia lido cem vezes e conseguia vê-lo na minha mente. A safira em seu coração. É uma maneira estranha de descrever um broche, um tanto poética, a frase de um historiador e não de um ladrão. A frase constava no bilhete de chantagem exatamente como constava na ficha de Theo, as mesmas cinco palavras na mesma ordem. Duas pessoas não descrevem uma joia usando as mesmas cinco palavras esquisitas por acaso.</w:t>
       </w:r>
     </w:p>
     <w:p>
@@ -3526,7 +3526,7 @@
     </w:p>
     <w:p>
       <w:r>
-        <w:t>Obriguei-me a respirar. Obriguei-me a pousar as três fichas marcadas a lápis vermelho junto com as outras e continuar organizando — B, B, Torneio de Xadrez, Flâmulas, Excedentes —, como se o chão da sala não tivesse acabado de se abrir silenciosamente debaixo da minha cadeira. Do outro lado da sala, Theo cantarolava baixinho, mudou uma caixa de lugar e disse algo sobre a caldeira, ao que respondi sem ouvir a minha própria resposta. O homem do outro lado da sala, o homem mais bondoso de Frost Falls, o homem que comprava o cacau bom com os marshmallows pequenos do próprio bolso para que as crianças não crescessem sem conhecer as histórias de sua cidade, havia escrito os bilhetes que estavam aterrorizando Fiona. Ou o cuidado que ele tinha com aquelas cartas permitira que outra pessoa as escrevesse, alguém de uma lista tão curta que o nome dele encabeçava a relação, com a sua caligrafia caprichosa.</w:t>
+        <w:t xml:space="preserve">Obriguei-me a respirar. Obriguei-me a pousar as três fichas marcadas a lápis vermelho junto com as outras e continuar organizando — B, B, Bridge — Torneio, Bandeirolas — Excedentes —, como se o chão da sala não tivesse acabado de se abrir silenciosamente debaixo da minha cadeira. Do outro lado da sala, Theo cantarolava baixinho, mudou uma caixa de lugar e disse algo sobre a caldeira, ao que respondi sem ouvir a minha própria resposta. O homem do outro lado da sala, o homem mais bondoso de Frost Falls, o homem que comprava o chocolate quente bom com os marshmallows pequenos do próprio bolso para que as crianças não crescessem sem conhecer as histórias de sua cidade, havia escrito os bilhetes que estavam aterrorizando Fiona. Ou o cuidado que ele tinha com aquelas cartas permitira que outra pessoa os escrevesse, alguém de uma lista tão curta que o nome dele encabeçava a relação, com a sua caligrafia caprichosa.</w:t>
       </w:r>
     </w:p>
     <w:p>
@@ -3556,7 +3556,7 @@
     </w:p>
     <w:p>
       <w:r>
-        <w:t>— Sei que veio dele ou por intermédio dele. — Minha voz saiu áspera. — Sei que quem escreveu aquele bilhete leu as palavras do próprio Theo sobre o broche. E sei que há uma lista curta de pessoas que poderiam tê-lo feito, e o nome dele está no topo, a lápis vermelho, com a própria letra. — Atei o cobertor mais firme ao corpo. — Não me sai da cabeça a imagem dele na porta agorinha mesmo. Quarenta novos membros. Tão feliz. Nick, como um homem faz uma coisa dessas? Como ele faz isso com Fiona na escuridão e leva o cacau para as crianças de manhã e fala sério em ambas as ocasiões, na mesma semana, com as mesmas mãos?</w:t>
+        <w:t xml:space="preserve">— Sei que veio dele ou por intermédio dele. — Minha voz saiu áspera. — Sei que quem escreveu aquele bilhete leu as palavras do próprio Theo sobre o broche. E sei que há uma lista curta de pessoas que poderiam tê-lo feito, e o nome dele está no topo, a lápis vermelho, com a própria letra. — Atei o cobertor mais firme ao corpo. — Não me sai da cabeça a imagem dele na porta agorinha mesmo. Quarenta novos membros. Tão feliz. Nick, como um homem faz uma coisa dessas? Como ele faz isso com Fiona na escuridão e leva o chocolate quente para as crianças de manhã e fala sério em ambas as ocasiões, na mesma semana, com as mesmas mãos?</w:t>
       </w:r>
     </w:p>
     <w:p>
@@ -3596,7 +3596,7 @@
     </w:p>
     <w:p>
       <w:r>
-        <w:t>No centro do cômodo, onde a antiga lareira do Polo ficaria, ele havia construído uma grande lareira de pedra rústica, pedras redondas de rio empilhadas à mão, uma sobre a outra. Não havia fogo ali. A grelha estava fria e vazia, e no entanto ela irradiava brilho. O ouro morno jorrava da própria pedra nua. A magia errante que vinha batendo de porta em porta por todo o Frost Falls havia vindo dar ali, em parte, e girava em círculos lentos no ar aquecido acima da grelha vazia, como uma criatura cansada que finalmente encontrara um lugar onde, algum dia, talvez lhe permitam deitar.</w:t>
+        <w:t xml:space="preserve">No centro do cômodo, onde a antiga lareira do Polo ficaria, ele havia construído uma grande lareira de pedra rústica, pedras redondas de rio empilhadas à mão, uma sobre a outra. Não havia fogo ali. A grelha estava fria e vazia, e no entanto ela irradiava brilho. O ouro morno jorrava da própria pedra nua. A magia errante que vinha batendo de porta em porta por toda Frost Falls havia vindo dar ali, em parte, e girava em círculos lentos no ar aquecido acima da grelha vazia, como uma criatura cansada que finalmente encontrara um lugar onde, algum dia, talvez lhe permitam deitar.</w:t>
       </w:r>
     </w:p>
     <w:p>
@@ -3638,7 +3638,7 @@
     <w:p/>
     <w:p>
       <w:r>
-        <w:t>Homens carregavam mesas de cavalete para o gramado quando desci a Evergreen. Na pousada, Vera Reed descia os degraus da varanda enquanto eu subia, com uma bolsa de lona no ombro e uma prancheta debaixo do braço, abotoada até o queixo contra o frio, como fizera na exposição.</w:t>
+        <w:t xml:space="preserve">Homens carregavam mesas de cavalete para a praça quando desci a Evergreen. Na pousada, Vera Reed descia os degraus da varanda enquanto eu subia, com uma bolsa de lona no ombro e uma prancheta debaixo do braço, abotoada até o queixo contra o frio, como fizera na exposição.</w:t>
       </w:r>
     </w:p>
     <w:p/>
@@ -3704,7 +3704,7 @@
     <w:p/>
     <w:p>
       <w:r>
-        <w:t>— Não — falei, virando o bilhete nas mãos, lendo-o de novo. — Ele quer que você fique com medo o suficiente para encontrar o que não existe. Pessoas que nunca passaram por um desespero real acreditam que os desesperados sempre conseguem conjurar dinheiro de algum jeito, basta apertá-los forte o suficiente. Ele acha que há um parente rico de quem você teve orgulho demais para pedir ajuda. Acha que você vai vender alguma coisa, hipotecar alguma coisa, ir aos Worthingtons de joelhos. Ele acredita que o medo em si vai fazer o dinheiro se soltar, como moedas de um bolso virado de cabeça para baixo. — Olhei para ela. — E isso me diz algo sobre ele, Fiona, querendo ele mostrar isso ou não. Me diz que ele também está desesperado. Pessoas confortáveis não imaginam que o dinheiro aparece sob pressão, porque o dinheiro nunca precisou aparecer para elas, simplesmente sempre esteve lá. Só alguém que teve de dar um jeito de fazê-lo aparecer, num mês difícil, pensa desse jeito. O bilhete me amedrontou por você durante dias. Só agora me ocorreu ficar com um pouco de medo dele também, quem quer que ele seja.</w:t>
+        <w:t xml:space="preserve">— Não — falei, virando o bilhete nas mãos, lendo-o de novo. — Ele quer que você fique com medo o suficiente para encontrar o que não existe. Pessoas que nunca passaram por um desespero real acreditam que os desesperados sempre conseguem conjurar dinheiro de algum jeito, basta apertá-los forte o suficiente. Ele acha que há um parente rico de quem você teve orgulho demais para pedir ajuda. Acha que você vai vender alguma coisa, hipotecar alguma coisa, ir aos Worthington de joelhos. Ele acredita que o medo em si vai fazer o dinheiro se soltar, como moedas de um bolso virado de cabeça para baixo. — Olhei para ela. — E isso me diz algo sobre ele, Fiona, querendo ele mostrar isso ou não. Me diz que ele também está desesperado. Pessoas confortáveis não imaginam que o dinheiro aparece sob pressão, porque o dinheiro nunca precisou aparecer para elas, simplesmente sempre esteve lá. Só alguém que teve de dar um jeito de fazê-lo aparecer, num mês difícil, pensa desse jeito. O bilhete me amedrontou por você durante dias. Só agora me ocorreu ficar com um pouco de medo dele também, quem quer que ele seja.</w:t>
       </w:r>
     </w:p>
     <w:p/>
@@ -3752,7 +3752,7 @@
     <w:p/>
     <w:p>
       <w:r>
-        <w:t>Mas eu viera em busca de mais do que consolo. Virei o bilhete e olhei, desta vez, não para as palavrinhas cruéis, mas para o papel em que estavam impressas. Cor de creme. Um toque pesado nos dedos. As linhas suaves prensadas na textura, finas e paralelas, que a gente só percebe quando segura o objeto contra a luz. O mesmo do primeiro bilhete, e o mesmo da pilha que vira sobre uma mesa perto da porta da Sociedade Histórica na manhã em que a exposição foi aberta. O segundo bilhete apenas confirmava isso. O chantagista ainda estava escrevendo o que diziam as cartas de Blackburn no papel da Sociedade.</w:t>
+        <w:t xml:space="preserve">Mas eu viera em busca de mais do que consolo. Virei o bilhete e olhei, desta vez, não para as palavrinhas cruéis, mas para o papel em que estavam escritas. Cor de creme. Um toque pesado nos dedos. As linhas suaves prensadas na textura, finas e paralelas, que a gente só percebe quando segura o objeto contra a luz. O mesmo do primeiro bilhete, e o mesmo da pilha que vira sobre uma mesa perto da porta da Sociedade Histórica na manhã em que a exposição foi aberta. O segundo bilhete apenas confirmava isso. O chantagista ainda estava escrevendo o que diziam as cartas dos Blackburn no papel da Sociedade.</w:t>
       </w:r>
     </w:p>
     <w:p/>
@@ -3782,7 +3782,7 @@
     <w:p/>
     <w:p>
       <w:r>
-        <w:t xml:space="preserve">Fiona dissera aquilo mesma, transtornada, e a frase ficara presa em mim como um carrapato. </w:t>
+        <w:t xml:space="preserve">A própria Fiona dissera aquilo, transtornada, e a frase ficara presa em mim como um carrapicho. </w:t>
       </w:r>
       <w:r>
         <w:rPr>
@@ -3815,7 +3815,7 @@
     <w:p/>
     <w:p>
       <w:r>
-        <w:t>Saí para o frio com Pip andando patinhando perto do meu calcanhar e as faixas do festival estalando no alto. Eu não precisava mais me perguntar quem lera aquelas cartas. Agora eu tinha de descobrir quantas mãos as haviam transportado. E então, o mais difícil de tudo, eu tinha de decidir o que diabos ia fazer com a resposta.</w:t>
+        <w:t xml:space="preserve">Saí para o frio com Pip gingando perto do meu calcanhar e as faixas do festival estalando no alto. Eu não precisava mais me perguntar quem lera aquelas cartas. Agora eu tinha de descobrir quantas mãos as haviam transportado. E então, o mais difícil de tudo, eu tinha de decidir o que diabos ia fazer com a resposta.</w:t>
       </w:r>
     </w:p>
     <w:p>
@@ -3831,7 +3831,7 @@
     </w:p>
     <w:p>
       <w:r>
-        <w:t>O gramado da praça havia se transformado desde a manhã. As mesas de cavalete que carregáramos e arrumáramos com tanto esmero agora estavam abarrotadas com as ofertas da cidade: as tortas de Greta, cem potes de conservas, os bolinhos da esposa do senhor Kim e uma mesa inteira com as luvas de lã do círculo dispostas em fileiras por tamanho. O palco na extremidade norte exibia uma banda, uma banda de verdade, três velhinhos e uma garota com um violino, tocando aquele tipo de música que fazia até quem jurava não dançar bater a bota contra o chão frio. Lanternas pendiam das árvores despidas. Barracas de cidra e castanhas assadas estendiam-se por toda a extensão do largo, e sobre tudo isso as luzes do festival brilhavam. Brilhavam em tom dourado agora, cada festão, constante e quente. Nenhuma alma comentou sobre isso, porque a cidade inteira decidira em conjunto, sem dizer uma palavra, que as luzes sempre tinham sido douradas e pronto.</w:t>
+        <w:t xml:space="preserve">A praça havia se transformado desde a manhã. As mesas de cavalete que carregáramos e arrumáramos com tanto esmero agora estavam abarrotadas com as ofertas da cidade: as tortas de Greta, cem potes de conservas, os bolinhos da esposa do Sr. Kim e uma mesa inteira com as luvas de lã do círculo dispostas em fileiras por tamanho. O palco na extremidade norte exibia uma banda, uma banda de verdade, três velhinhos e uma garota com um violino, tocando aquele tipo de música que fazia até quem jurava não dançar bater a bota contra o chão frio. Lanternas pendiam das árvores despidas. Barracas de suco de maçã quente e castanhas assadas estendiam-se por toda a extensão do largo, e sobre tudo isso as luzes do festival brilhavam. Brilhavam em tom dourado agora, cada festão, constante e quente. Nenhuma alma comentou sobre isso, porque a cidade inteira decidira em conjunto, sem dizer uma palavra, que as luzes sempre tinham sido douradas e pronto.</w:t>
       </w:r>
     </w:p>
     <w:p>
@@ -3846,7 +3846,7 @@
     </w:p>
     <w:p>
       <w:r>
-        <w:t>Numa frente, eu estava ali, uma moradora no festival da sua cidade, e aquilo era glorioso. Emma Redfern me encontrou perto da cidra e exibiu sua fantasia, que ela fizera questão de vestir uma noite antes: uma constelação, Órion, preta com estrelas de prata costuradas nos lugares certos pelas mãos cuidadosas de seu pai, com o cinturão perfeitamente exato. Ela me fez nomear cada estrela, e eu o fiz, porque conheço essas estrelas há muito tempo. Ela ficou encantada por a senhora Claus conhecer suas constelações. Mark estava por perto com dois copos de cidra e aquela expressão suavizada pelo tempo de um homem vendo sua filha ter oito anos em voz alta no meio de uma multidão. Martha me impôs um par de luvas de lã da mesa, as verdes, "para essas suas mãos frias". Sam Patel ergueu o chapéu de longe, do outro lado do gramado, postado perto da varanda da pousada, onde se mantivera de sentinela o dia todo com os olhos fitados na recepção logo ali dentro, como eu lhe pedira.</w:t>
+        <w:t xml:space="preserve">Numa frente, eu estava ali, uma moradora no festival da sua cidade, e aquilo era glorioso. Emma Redfern me encontrou perto do suco de maçã e exibiu sua fantasia, que ela fizera questão de vestir uma noite antes: uma constelação, Órion, preta com estrelas de prata costuradas nos lugares certos pelas mãos cuidadosas de seu pai, com o cinturão perfeitamente exato. Ela me fez nomear cada estrela, e eu o fiz, porque conheço essas estrelas há muito tempo. Ela ficou encantada por a Sra. Claus conhecer suas constelações. Mark estava por perto com dois copos de suco de maçã e aquela expressão suavizada pelo tempo de um homem vendo sua filha ter oito anos em voz alta no meio de uma multidão. Martha me impôs um par de luvas de lã da mesa, as verdes, "para essas suas mãos frias". Sam Patel ergueu o chapéu de longe, do outro lado da praça, postado perto da varanda da pousada, onde se mantivera de sentinela o dia todo com os olhos fitados na recepção logo ali dentro, como eu lhe pedira.</w:t>
       </w:r>
     </w:p>
     <w:p>
@@ -3856,17 +3856,17 @@
     </w:p>
     <w:p>
       <w:r>
-        <w:t>A certa altura, no meio da tarde, achei que estava acontecendo. Uma figura esgueirou-se para a varanda da pousada, parou na porta aberta, olhou em volta e estendeu a mão em direção à recepção. Meu coração parou. Comecei a atravessar o gramado rápido demais, e Sam já vinha se movendo de seu posto. Então a figura se virou, e era apenas a senhora Pelletier, da diretoria da Sociedade, deixando uma pilha de panfletos de associação na mesa onde os hóspedes pudessem vê-los. Sam e eu chegamos ao mesmo tempo, de direções opostas, ambos rápidos demais, e cruzamos olhares por cima dos panfletos. A senhora Pelletier olhou de um para o outro, intrigada. Peguei três panfletos de que não precisava, Sam disse alguma coisa sobre o tempo e recuamos. Foi o mais perto que o dia chegou de um incidente. Um alarme falso. Mas isso me mostrou o quanto eu estava tensa, sob a música de violino, e quão tênue era a linha entre o calor e o medo.</w:t>
-      </w:r>
-    </w:p>
-    <w:p>
-      <w:r>
-        <w:t>Noriko Tanaka tinha visto aquilo. Ela estava na barraca de cidra a poucos metros de distância, vestida com sua parka, com um copo de papel em cada mão, e quando voltei cruzando o gramado ela estendeu um deles para mim.</w:t>
-      </w:r>
-    </w:p>
-    <w:p>
-      <w:r>
-        <w:t>— Você parecia prestes a derrubar a senhora Pelletier — disse ela.</w:t>
+        <w:t xml:space="preserve">A certa altura, no meio da tarde, achei que estava acontecendo. Uma figura esgueirou-se para a varanda da pousada, parou na porta aberta, olhou em volta e estendeu a mão em direção à recepção. Meu coração parou. Comecei a atravessar a praça rápido demais, e Sam já vinha se movendo de seu posto. Então a figura se virou, e era apenas a Sra. Pelletier, da diretoria da Sociedade, deixando uma pilha de panfletos de associação na mesa onde os hóspedes pudessem vê-los. Sam e eu chegamos ao mesmo tempo, de direções opostas, ambos rápidos demais, e cruzamos olhares por cima dos panfletos. A Sra. Pelletier olhou de um para o outro, intrigada. Peguei três panfletos de que não precisava, Sam disse alguma coisa sobre o tempo e recuamos. Foi o mais perto que o dia chegou de um incidente. Um alarme falso. Mas isso me mostrou o quanto eu estava tensa, sob a música de violino, e quão tênue era a linha entre o calor e o medo.</w:t>
+      </w:r>
+    </w:p>
+    <w:p>
+      <w:r>
+        <w:t xml:space="preserve">Noriko Tanaka tinha visto aquilo. Ela estava na barraca de suco de maçã a poucos metros de distância, vestida com sua parka, com um copo de papel em cada mão, e quando voltei cruzando a praça ela estendeu um deles para mim.</w:t>
+      </w:r>
+    </w:p>
+    <w:p>
+      <w:r>
+        <w:t xml:space="preserve">— A senhora parecia prestes a derrubar a Sra. Pelletier — disse ela.</w:t>
       </w:r>
     </w:p>
     <w:p>
@@ -3876,7 +3876,7 @@
     </w:p>
     <w:p>
       <w:r>
-        <w:t>— Aham. — Ela tomou um gole de cidra. Não estava olhando para mim. Estava observando a multidão, como eu fizera a tarde inteira. — Sam Patel achou o mesmo. Já são dois de vocês de olho na recepção da Fiona. Tem alguma coisa que eu deva saber, senhora Claus?</w:t>
+        <w:t xml:space="preserve">— Aham. — Ela tomou um gole do suco de maçã. Não estava olhando para mim. Estava observando a multidão, como eu fizera a tarde inteira. — Sam Patel achou o mesmo. Já são dois de vocês de olho na recepção da Fiona. Tem alguma coisa que eu deva saber, Sra. Claus?</w:t>
       </w:r>
     </w:p>
     <w:p>
@@ -3891,7 +3891,7 @@
     </w:p>
     <w:p>
       <w:r>
-        <w:t>Ela assentiu, como se fosse uma resposta que ouvia muito. — Você sabe onde fica a delegacia. O café é ruim, mas a porta está aberta. Aos domingos também. — Ela inclinou o copo em direção à varanda da pousada, onde Pip posava com um cachecol vermelho para uma família de cinco pessoas. — O seu pinguim arrecadou mais dinheiro para a Sociedade hoje do que o prefeito o ano todo.</w:t>
+        <w:t xml:space="preserve">Ela assentiu, como se fosse uma resposta que ouvia muito. — A senhora sabe onde fica a delegacia. O café é ruim, mas a porta está aberta. Aos domingos também. — Ela inclinou o copo em direção à varanda da pousada, onde Pip posava com um cachecol vermelho para uma família de cinco pessoas. — O seu pinguim arrecadou mais dinheiro para a Sociedade hoje do que o prefeito o ano todo.</w:t>
       </w:r>
     </w:p>
     <w:p>
@@ -3901,7 +3901,7 @@
     </w:p>
     <w:p>
       <w:r>
-        <w:t>A magia estava em toda parte naquele dia, de pequenas maneiras que a cidade conseguia desdenhar. Quando a banda tocava um ritmo animado, as lanternas nas árvores balançavam um pouco, embora eu não sentisse vento algum. Samambaias de geada cresciam pelo lado de dentro das janelas da pousada em padrões belos demais para serem acidentais, derretiam e cresciam de novo. E na última hora de claridade, quando o sol se pôs atrás das colinas e as luzes douradas do festival assumiram seu verdadeiro esplendor, começou a nevar suavemente, pela primeira vez desde a semana em que encontramos o Bola de Neve. Flocos lentos e graúdos desceram flutuando sobre o gramado, sobre a banda, as barracas e os rostos voltados para cima. A cidade inteira parou, toda de uma vez, ergueu os olhos e silenciou.</w:t>
+        <w:t xml:space="preserve">A magia estava em toda parte naquele dia, de pequenas maneiras que a cidade conseguia desdenhar. Quando a banda tocava um ritmo animado, as lanternas nas árvores balançavam um pouco, embora eu não sentisse vento algum. Samambaias de geada cresciam pelo lado de dentro das janelas da pousada em padrões belos demais para serem acidentais, derretiam e cresciam de novo. E na última hora de claridade, quando o sol se pôs atrás das colinas e as luzes douradas do festival assumiram seu verdadeiro esplendor, começou a nevar suavemente, pela primeira vez desde a semana em que encontramos o Snowball. Flocos lentos e graúdos desceram flutuando sobre a praça, sobre a banda, as barracas e os rostos voltados para cima. A cidade inteira parou, toda de uma vez, ergueu os olhos e silenciou.</w:t>
       </w:r>
     </w:p>
     <w:p>
@@ -3958,10 +3958,10 @@
         <w:rPr>
           <w:i/>
         </w:rPr>
-        <w:t>The sapphire at its heart</w:t>
-      </w:r>
-      <w:r>
-        <w:t>: cinco palavras, a linguagem de um historiador e não de um ladrão, postas no bilhete de extorsão exatamente como estavam na ficha com a caligrafia inclinada e cuidadosa de Theo. O bilhete fora escrito no papel de carta creme da Sociedade, o estoque encorpado que eu vira empilhado na recepção da exposição. O homem que geria o arquivo estava afundando. Ele batera a todas as portas honestas em três estados e as vira se fecharem. Ele se levantara diante da cidade inteira e anunciara, com pesar, que as próprias cartas que descreviam o broche haviam desaparecido.</w:t>
+        <w:t xml:space="preserve">A safira em seu coração</w:t>
+      </w:r>
+      <w:r>
+        <w:t xml:space="preserve">: cinco palavras, a linguagem de um historiador e não de um ladrão, postas no bilhete de chantagem exatamente como estavam na ficha com a caligrafia inclinada e cuidadosa de Theo. O bilhete fora escrito no papel de carta creme da Sociedade, o papel encorpado que eu vira empilhado na recepção da exposição. O homem que geria o arquivo estava afundando. Ele batera a todas as portas honestas em três estados e as vira se fecharem. Ele se levantara diante da cidade inteira e anunciara, com pesar, que as próprias cartas que descreviam o broche haviam desaparecido.</w:t>
       </w:r>
     </w:p>
     <w:p>
@@ -3997,7 +3997,7 @@
         <w:rPr>
           <w:i/>
         </w:rPr>
-        <w:t>I know how your family came by this inn,</w:t>
+        <w:t xml:space="preserve">Eu sei como sua família conseguiu esta pousada,</w:t>
       </w:r>
       <w:r>
         <w:t xml:space="preserve"> dissera o primeiro bilhete. O roubo em si, o broche, a pedra, a casa de penhores em Ridgeline, tudo estava nas cartas dos Blackburn, no arquivo de Theo. Mas a compra da pousada, a aquisição de 1924, o rastro de documentos de uma propriedade mudando de mãos, não constava em nenhuma carta dos Blackburn. Aquilo era um registro imobiliário. Uma escritura.</w:t>
@@ -4052,7 +4052,7 @@
     <w:p/>
     <w:p>
       <w:r>
-        <w:t>A história era sem graça demais para parecer mentira, e esse era o objetivo. Contei a ela que a comissão do festival precisava da escritura antiga do gramado, o terreno comunal em si, para resolver um pequeno desentendimento sobre onde um comerciante tinha permissão para montar sua barraca, e perguntei se ela podia ser tão querida a ponto de buscá-la para mim. Ela suspirou, o suspiro aborrecido de uma mulher a quem se pede mais uma coisinha num dia longo, e foi até a sala de arquivos no fundo para encontrá-la.</w:t>
+        <w:t xml:space="preserve">A história era sem graça demais para parecer mentira, e esse era o objetivo. Contei a ela que o comitê do festival precisava da escritura antiga da praça, o terreno comunal em si, para resolver um pequeno desentendimento sobre onde um comerciante tinha permissão para montar sua barraca, e perguntei se ela podia ser tão querida a ponto de buscá-la para mim. Ela suspirou, o suspiro aborrecido de uma mulher a quem se pede mais uma coisinha num dia longo, e foi até a sala de arquivos no fundo para encontrá-la.</w:t>
       </w:r>
     </w:p>
     <w:p/>
@@ -4070,31 +4070,31 @@
         <w:rPr>
           <w:i/>
         </w:rPr>
-        <w:t>PROPERTY — EVERGREEN AVE — WINTER WONDERLAND INN.</w:t>
-      </w:r>
-    </w:p>
-    <w:p/>
-    <w:p>
-      <w:r>
-        <w:t>A escritura da pousada. Fora de sua gaveta. Sentada na cesta de rearquivamento, manuseada recentemente, na mesa de uma mulher que tinha me olhado bem nos olhos e me dito, duas vezes, que nunca lia os arquivos atrás dela.</w:t>
-      </w:r>
-    </w:p>
-    <w:p/>
-    <w:p>
-      <w:r>
-        <w:t>Ela tinha lido aquilo. Tinha tirado aquilo de lá. A escritura da pousada, o papel que registrava a compra de 1924, a metade do segredo que não constava em nenhuma carta de Blackburn e nunca havia constado. Estava nas mãos de Vera Reed, havia tempo suficiente para que ela ainda não a tivesse guardado.</w:t>
-      </w:r>
-    </w:p>
-    <w:p/>
-    <w:p>
-      <w:r>
-        <w:t>Quando ela voltou com uma cópia da escritura do gramado, agradeci-lhe e fiz meus comentários sem graça de comissão sobre vendedores e a colocação das barracas. Depois, levei o meu tempo dobrando o papel e colocando-o na minha bolsa. Observei-a, e agora que eu sabia o que estava vendo, conseguia decifrá-la claramente. Ela não era uma mulher durona. Foi isso que me pegou. Eu meio que esperava, quando finalmente vi aquilo por completo, encontrar algo frio e avarento sob o cansaço. Não havia absolutamente nada de frio ali, apenas o medo desgastado até a exaustão, o medo enraizado até a medula de uma pessoa que fez algo grande demais para si e passa todas as noites acordada dentro desse erro. As mãos dela não estavam firmes ao ajeitar a cesta. Duas xícaras de café esquecidas repousavam frias sobre a mesa. Ela parecia com a Fiona a semana inteira, como uma pessoa sendo esmagada, exceto pelo fato de que era ela quem estava esmagando, e de algum modo aquilo era ainda mais triste.</w:t>
-      </w:r>
-    </w:p>
-    <w:p/>
-    <w:p>
-      <w:r>
-        <w:t>— Vera — eu disse gentilmente, a caminho da porta —, está tudo bem com você? De verdade. Você não tem nada boa aparência.</w:t>
+        <w:t xml:space="preserve">PROPRIEDADE — AV. EVERGREEN — WINTER WONDERLAND INN.</w:t>
+      </w:r>
+    </w:p>
+    <w:p/>
+    <w:p>
+      <w:r>
+        <w:t xml:space="preserve">A escritura da pousada. Fora de sua gaveta. Largada na cesta de rearquivamento, manuseada recentemente, na mesa de uma mulher que tinha me olhado bem nos olhos e me dito, duas vezes, que nunca lia os arquivos atrás dela.</w:t>
+      </w:r>
+    </w:p>
+    <w:p/>
+    <w:p>
+      <w:r>
+        <w:t xml:space="preserve">Ela tinha lido aquilo. Tinha tirado aquilo de lá. A escritura da pousada, o papel que registrava a compra de 1924, a metade do segredo que não constava em nenhuma carta dos Blackburn e nunca havia constado. Estivera nas mãos de Vera Reed, tão recentemente que ela ainda não a guardara.</w:t>
+      </w:r>
+    </w:p>
+    <w:p/>
+    <w:p>
+      <w:r>
+        <w:t xml:space="preserve">Quando ela voltou com uma cópia da escritura da praça, agradeci-lhe e fiz meus comentários sem graça de comitê sobre vendedores e a colocação das barracas. Depois, levei o meu tempo dobrando o papel e colocando-o na minha bolsa. Observei-a, e agora que eu sabia o que estava vendo, conseguia decifrá-la claramente. Ela não era uma mulher durona. Foi isso que me pegou. Eu meio que esperava, quando finalmente vi aquilo por completo, encontrar algo frio e avarento sob o cansaço. Não havia absolutamente nada de frio ali, apenas o medo desgastado até a exaustão, o medo enraizado até a medula de uma pessoa que fez algo grande demais para si e passa todas as noites acordada dentro desse erro. As mãos dela não estavam firmes ao ajeitar a cesta. Duas xícaras de café esquecidas repousavam frias sobre a mesa. Ela parecia com a Fiona a semana inteira, como uma pessoa sendo esmagada, exceto pelo fato de que era ela quem estava esmagando, e de algum modo aquilo era ainda mais triste.</w:t>
+      </w:r>
+    </w:p>
+    <w:p/>
+    <w:p>
+      <w:r>
+        <w:t xml:space="preserve">— Vera — eu disse gentilmente, a caminho da porta —, está tudo bem com a senhora? De verdade. A senhora não está com uma aparência nada boa.</w:t>
       </w:r>
     </w:p>
     <w:p/>
@@ -4106,7 +4106,7 @@
     <w:p/>
     <w:p>
       <w:r>
-        <w:t>Os olhos dela tinham ficado brilhantes, e ela não conseguia erguê-los para encontrar os meus, nem mais nem menos do que conseguia sempre que a velha história era mencionada em voz alta. Eu compreendi, parada ali com o meu casaco e com a escritura do gramado na bolsa, que Vera Reed não era nenhuma vilã. Era uma mulher assustada que havia sido arrastada para algo por um homem em quem confiava, ou de quem tinha pena, ou ambos, e agora estava fundo demais para conseguir sair. Ela sabia disso, e não dormia melhor do que a mulher a quem estava ajudando a destruir.</w:t>
+        <w:t xml:space="preserve">Os olhos dela tinham ficado brilhantes, e ela não conseguia erguê-los para encontrar os meus, assim como não conseguia sempre que a velha história era mencionada em voz alta. Eu compreendi, parada ali com o meu casaco e com a escritura da praça na bolsa, que Vera Reed não era nenhuma vilã. Era uma mulher assustada que havia sido arrastada para algo por um homem em quem confiava, ou de quem tinha pena, ou ambos, e agora estava fundo demais para conseguir sair. Ela sabia disso, e não dormia melhor do que a mulher a quem estava ajudando a destruir.</w:t>
       </w:r>
     </w:p>
     <w:p/>
@@ -4118,7 +4118,7 @@
     <w:p/>
     <w:p>
       <w:r>
-        <w:t>Theo tinha o furto. Ele o descobrira nas cartas de Blackburn, o broche, a gema, a casa de penhores. Ele o catalogara com sua caligrafia caprichosa, a safira em seu coração, e depois retirara essas cartas dos arquivos, declarando-as sumidas. Mas Theo, afundando, vigiado por toda a cidade, nunca em casa, não poderia ter feito o resto. Ele não podia ter confirmado que a pousada havia sido comprada com o dinheiro, porque essa prova não estava no prédio dele. E ele não podia ter levado os bilhetes cruzando a cidade e deixado um sobre uma mesa cheia de gente em plena luz do dia de festival, porque Theo Hussein não conseguia caminhar pela Evergreen Avenue sem ser notado nem para salvar a própria vida.</w:t>
+        <w:t xml:space="preserve">Theo tinha o furto. Ele o descobrira nas cartas dos Blackburn, o broche, a gema, a casa de penhores. Ele o catalogara com sua caligrafia caprichosa, a safira em seu coração, e depois retirara essas cartas dos arquivos, declarando-as sumidas. Mas Theo, afundando, vigiado por toda a cidade, nunca em casa, não poderia ter feito o resto. Ele não podia ter confirmado que a pousada havia sido comprada com o dinheiro, porque essa prova não estava no prédio dele. E ele não podia ter levado os bilhetes cruzando a cidade e deixado um sobre uma mesa cheia de gente em plena luz do dia de festival, porque Theo Hussein não conseguia caminhar pela Avenida Evergreen sem ser notado nem para salvar a própria vida.</w:t>
       </w:r>
     </w:p>
     <w:p/>
@@ -4154,7 +4154,7 @@
     <w:p/>
     <w:p>
       <w:r>
-        <w:t>Caminhando o resto do caminho para casa no frio, com a escritura do gramado na bolsa e os nomes de ambos pesando no meu chest, eu podia sentir a escolha se aproximando. Ela trazia o peso do tipo mais difícil, o tipo que eu não precisava fazer desde o dia em que desci do topo do mundo.</w:t>
+        <w:t xml:space="preserve">Caminhando o resto do caminho para casa no frio, com a escritura da praça na bolsa e os nomes de ambos pesando no meu peito, eu podia sentir a escolha se aproximando. Ela trazia o peso do tipo mais difícil, o tipo que eu não precisava fazer desde o dia em que desci do topo do mundo.</w:t>
       </w:r>
     </w:p>
     <w:p>
@@ -4171,13 +4171,13 @@
     <w:p/>
     <w:p>
       <w:r>
-        <w:t>Eram mais ou menos assim. Eu sabia quem. Eu sabia como. Eu tinha a prova disso: o cartão de catálogo, o papel correspondente levado à lâmpada, a escritura da pousada fora da gaveta. Portanto, eu podia ir falar com Theo e Vera calmamente, só nós três, mais ninguém envolvido, e dizer: eu sei. Parem agora, e isso acaba aqui, esta noite, sem que ninguém saiba de nada. Nunca mais. E eles parariam, porque eram pessoas assustadas, não endurecidas. Chorariam de alívio por serem perdoados. Os bilhetes parariam, e Fiona estaria a salvo. O segredo voltaria para o baú no sótão. Theo manteria a Sociedade dele e seu bom nome, e Vera, o seu emprego. A cidade nunca precisaria saber que dois de seus moradores haviam se corrompido por causa de uma única estação difícil. Todos os que eu amava seriam poupados da dor daquilo.</w:t>
-      </w:r>
-    </w:p>
-    <w:p/>
-    <w:p>
-      <w:r>
-        <w:t>Sem polícia. Sem escândalo. Sem coluna feia no Gazette. Sem um bom velhinho sendo conduzido para fora do prédio a que dedicara a vida toda. Apenas uma palavra misericordiosa e discreta no escuro, misericórdia, e todos vão para casa deitar.</w:t>
+        <w:t xml:space="preserve">Era mais ou menos assim. Eu sabia quem. Eu sabia como. Eu tinha a prova disso: a ficha de catálogo, o papel correspondente levado à lâmpada, a escritura da pousada fora da gaveta. Portanto, eu podia ir falar com Theo e Vera calmamente, só nós três, mais ninguém envolvido, e dizer: eu sei. Parem agora, e isso acaba aqui, esta noite, sem que ninguém saiba de nada. Nunca mais. E eles parariam, porque eram pessoas assustadas, não endurecidas. Chorariam de alívio por serem perdoados. Os bilhetes parariam, e Fiona estaria a salvo. O segredo voltaria para o baú no sótão. Theo manteria a Sociedade dele e seu bom nome, e Vera, o seu emprego. A cidade nunca precisaria saber que dois de seus moradores haviam se corrompido por causa de uma única estação difícil. Todos os que eu amava seriam poupados da dor daquilo.</w:t>
+      </w:r>
+    </w:p>
+    <w:p/>
+    <w:p>
+      <w:r>
+        <w:t xml:space="preserve">Sem polícia. Sem escândalo. Sem coluna feia no Gazette. Sem um bom velhinho sendo conduzido para fora do prédio a que dedicara a vida toda. Apenas uma palavra discreta no escuro, misericórdia, e todos vão para casa deitar.</w:t>
       </w:r>
     </w:p>
     <w:p/>
@@ -4195,13 +4195,13 @@
     <w:p/>
     <w:p>
       <w:r>
-        <w:t>Uma palavra discreta no escuro protegeria todas as pessoas, exceto aquela que ela mais devia proteger. Não libertaria Fiona. Apenas mudaria as mãos em que o segredo estaria guardado. No momento, um chantagista o possuía. Após a minha misericórdia discreta, eu o possuiria. Nick também, e Theo e Vera também, perdoados e livres, as únicas duas pessoas no mundo inteiro que sabiam exatamente como transformar o baú daquele sótão em uma fortuna. Fiona passaria o resto da vida sabendo que dois de seus vizinhos haviam tentado extorqui-la e saído ilesos, e que poderiam tentar de novo, em qualquer noite ruim, em qualquer inverno desesperador ao longo dos anos. O medo não terminaria. Apenas ficaria silencioso. Eu havia lido dez mil cartas no Polo, e a dor nelas era quase sempre um segredo carregado sozinha no escuro.</w:t>
-      </w:r>
-    </w:p>
-    <w:p/>
-    <w:p>
-      <w:r>
-        <w:t>E havia uma segunda mentira dobrada por dentro da primeira. O caminho mais fácil parecia perdão, mas não era nada disso. O que eu estaria entregando a Theo e Vera era um jeito de nunca encarar aquilo de verdade, de pular direto do meio difícil em que a pessoa assume o mal que causou, indo direto do crime para a absolvição sem nada de real no meio. Isso só os ajudaria a continuar se escondendo, da cidade e de si mesmos. E se nunca tivessem de sentir o peso daquilo, poderiam fazer de novo. Eu não estaria salvando a alma de Theo ao enterrar o crime dele. Estaria roubando dele a única coisa capaz de curá-lo, que era assumi-lo.</w:t>
+        <w:t xml:space="preserve">Uma palavra discreta no escuro protegeria todas as pessoas, exceto aquela que ela mais devia proteger. Não libertaria Fiona. Apenas mudaria as mãos em que o segredo estaria guardado. No momento, um chantagista o possuía. Após a minha misericórdia discreta, eu o possuiria. Nick também, e Theo e Vera também, perdoados e livres, as únicas duas pessoas no mundo inteiro que sabiam exatamente como transformar o baú daquele sótão em uma fortuna. Fiona passaria o resto da vida sabendo que dois de seus vizinhos haviam tentado extorqui-la e saído ilesos, e que poderiam tentar de novo, em qualquer noite ruim, em qualquer inverno desesperador ao longo dos anos. O medo não terminaria. Apenas ficaria silencioso. Eu havia lido dez mil cartas no Polo, e a dor nelas era quase sempre um segredo carregado sozinho no escuro.</w:t>
+      </w:r>
+    </w:p>
+    <w:p/>
+    <w:p>
+      <w:r>
+        <w:t xml:space="preserve">E havia uma segunda mentira dobrada por dentro da primeira. O caminho mais fácil parecia perdão, mas não era nada disso. O que eu estaria entregando a Theo e Vera era um jeito de nunca encarar aquilo de verdade, de pular por cima da difícil etapa do meio, em que a pessoa assume o mal que causou, indo direto do crime para a absolvição sem nada de real no meio. Isso só os ajudaria a continuar se escondendo, da cidade e de si mesmos. E se nunca tivessem de sentir o peso daquilo, poderiam fazer de novo. Eu não estaria salvando a alma de Theo ao enterrar o crime dele. Estaria roubando dele a única coisa capaz de curá-lo, que era assumi-lo.</w:t>
       </w:r>
     </w:p>
     <w:p/>
@@ -4237,13 +4237,13 @@
     <w:p/>
     <w:p>
       <w:r>
-        <w:t>Aí estava, o último medo, o menor deles e o mais inteiramente meu. Eu ainda era meio estrangeira naquela cidade. Todos os outros se conheciam desde que eram crianças aprendendo a andar naquelas mesmas calçadas, e eu vinha conquistando meu espaço centímetro por centímetro, uma caçarola aqui, uma busca por cachorro acolá, uma cadeira puxada na roda de tricô. Arrastar Theo Hussein para a luz podia me custar um pouco desse espaço conquistado a custo. As pessoas nem sempre gostam de quem diz a dura verdade. Eu podia fazer exatamente a coisa certa e ser, para sempre, a forasteira que destruiu um homem bom e trouxe sofrimento à cidade.</w:t>
-      </w:r>
-    </w:p>
-    <w:p/>
-    <w:p>
-      <w:r>
-        <w:t>Fiquei ali com aquele medo e deixei que ele fosse real. Depois, deixei-o ir embora, porque Martha já havia respondido a isso na roda, com a mão no meu joelho. O que quer que você esteja carregando, não precisa carregar sozinha. Esse é o propósito de uma roda. Eu podia amar um lugar o bastante para fazer a coisa certa e difícil por ele, e confiar que ele ainda seria meu do outro lado.</w:t>
+        <w:t xml:space="preserve">Aí estava, o último medo, o menor deles e o mais inteiramente meu. Eu ainda era meio estrangeira naquela cidade. Todos os outros se conheciam desde que eram crianças aprendendo a andar naquelas mesmas calçadas, e eu vinha conquistando meu espaço centímetro por centímetro, uma caçarola aqui, uma busca por cachorro acolá, uma cadeira puxada no círculo de tricô. Arrastar Theo Hussein para a luz podia me custar um pouco desse espaço conquistado a custo. As pessoas nem sempre gostam de quem diz a dura verdade. Eu podia fazer exatamente a coisa certa e ser, para sempre, a forasteira que destruiu um homem bom e trouxe sofrimento à cidade.</w:t>
+      </w:r>
+    </w:p>
+    <w:p/>
+    <w:p>
+      <w:r>
+        <w:t xml:space="preserve">Fiquei ali com aquele medo e deixei que ele fosse real. Depois, deixei-o ir embora, porque Martha já havia respondido a isso no círculo, com a mão no meu joelho. Seja lá o que você estiver carregando, não precisa carregar sozinha. Esse é o objetivo de um círculo. Eu podia amar um lugar o bastante para fazer a coisa certa e difícil por ele, e confiar que ele ainda seria meu do outro lado.</w:t>
       </w:r>
     </w:p>
     <w:p/>
@@ -4290,7 +4290,7 @@
     <w:p/>
     <w:p>
       <w:r>
-        <w:t>A delegada Tanaka me ouviu em sua pequena sala na delegacia, com o caderno gasto aberto na mesa à sua frente e a caneta imóvel em cima dele. Ela não escrevia enquanto decidia se acreditava na gente. Pus tudo às claras, do mesmo jeito que havia feito para mim mesma na mesa da cozinha. As duas cartas. O cartão de catálogo de Theo com as cinco palavras idênticas. A papelaria da Sociedade, com a mesma textura de papel sob a lâmpada. A escritura da pousada fora da gaveta, na cesta de rascunhos de Vera. Constance, o broche, a casa de penhores em Ridgeline, toda a raiz centenária da história, e a pasta de Neil por baixo de tudo aquilo, a parte que tornava aquela raiz humana.</w:t>
+        <w:t xml:space="preserve">A chefe Tanaka me ouviu em sua pequena sala na delegacia, com o caderno gasto aberto na mesa à sua frente e a caneta imóvel em cima dele. Ela não escrevia enquanto decidia se acreditava na gente. Pus tudo às claras, do mesmo jeito que havia feito para mim mesma na mesa da cozinha. Os dois bilhetes. A ficha de catálogo de Theo com as cinco palavras idênticas. A papelaria da Sociedade, com a mesma textura de papel sob a lâmpada. A escritura da pousada fora da gaveta, na cesta de rearquivamento de Vera. Constance, o broche, a casa de penhores em Ridgeline, toda a raiz centenária da história, e a pasta de Neil por baixo de tudo aquilo, a parte que tornava aquela raiz humana.</w:t>
       </w:r>
     </w:p>
     <w:p/>
@@ -4302,7 +4302,7 @@
     <w:p/>
     <w:p>
       <w:r>
-        <w:t>— Você entende que preciso tratar isso pelo que é — disse ela por fim. — A chantagem é um crime, Jessica. Duas cartas, uma exigência de dinheiro, uma ameaça de arruinar uma mulher. Isso não é um mal-entendido que eu possa varrer para debaixo do tapete com uma palavra firme. Se você trouxe isso até mim, eu não posso simplesmente desfazê-lo. Você sabe disso. Sabia quando entrou aqui.</w:t>
+        <w:t xml:space="preserve">— Você entende que preciso tratar isso pelo que é — disse ela por fim. — A chantagem é um crime, Jessica. Dois bilhetes, uma exigência de dinheiro, uma ameaça de arruinar uma mulher. Isso não é um mal-entendido que eu possa varrer para debaixo do tapete com uma palavra firme. Se você trouxe isso até mim, eu não posso simplesmente desfazê-lo. Você sabe disso. Sabia quando entrou aqui.</w:t>
       </w:r>
     </w:p>
     <w:p/>
@@ -4320,7 +4320,7 @@
     <w:p/>
     <w:p>
       <w:r>
-        <w:t>— Há um jeito — disse ela. — Quase sempre há um jeito, quando as pessoas envolvidas não são monstros, e, pelo que você me contou, esses dois não são monstros. Eles são um homem desesperado e uma mulher assustada que fizeram uma coisa errada por motivos que tinham mais do que convenciado a si mesmos de que eram bons. — Ela pousou a caneta. — Eis o que eu não vou fazer. Não vou arrombar uma porta e colocar algemas em Theo Hussein no meio do festival, na frente da cidade inteira. Isso não ajuda ninguém, não é necessário e eu não faço uma crueldade dessas quando algo mais bondoso pode funcionar. — Ela me olhou fixamente do outro lado da mesa. — Eis o que eu vou fazer. Vou dar a ele a chance de assumir a culpa, comigo na sala, para que seja legal e documentado. Se ele assumir livremente e consertar as coisas, com restituição e uma prestação de contas real, então há espaço para que isso termine em algo que não seja a ruína. Chamamos isso de justiça restaurativa. Ela conserta o que pode em vez de apenas destruir o que sobrou. Mas isso só funciona se for verdade, Jessica. Se ele mentir ou tentar dar um jeito de escapar pela porta dos fundos, então o caminho vai ser o mais rigoroso, e a escolha é dele, não minha nem sua.</w:t>
+        <w:t xml:space="preserve">— Há um jeito — disse ela. — Quase sempre há um jeito, quando as pessoas envolvidas não são monstros, e, pelo que você me contou, esses dois não são monstros. Eles são um homem desesperado e uma mulher assustada que fizeram uma coisa errada por motivos que eles tinham mais do que meio se convencido de que eram bons. — Ela pousou a caneta. — Eis o que eu não vou fazer. Não vou arrombar uma porta e colocar algemas em Theo Hussein no meio do festival, na frente da cidade inteira. Isso não ajuda ninguém, não é necessário e eu não faço uma crueldade dessas quando algo mais bondoso pode funcionar. — Ela me olhou fixamente do outro lado da mesa. — Eis o que eu vou fazer. Vou dar a ele a chance de assumir a culpa, comigo na sala, para que seja legal e documentado. Se ele assumir livremente e consertar as coisas, com restituição e uma prestação de contas real, então há espaço para que isso termine em algo que não seja a ruína. Chamamos isso de justiça restaurativa. Ela conserta o que pode em vez de apenas destruir o que sobrou. Mas isso só funciona se for verdade, Jessica. Se ele mentir ou tentar dar um jeito de escapar pela porta dos fundos, então o caminho vai ser o mais rigoroso, e a escolha é dele, não minha nem sua.</w:t>
       </w:r>
     </w:p>
     <w:p/>
@@ -4338,13 +4338,13 @@
     <w:p/>
     <w:p>
       <w:r>
-        <w:t>Era a decisão certa. Era muito melhor do que a armadilha que eu havia meio imaginado, uma noite de dinheiro guardado, prender a respiração e ver a mão de alguém saindo da escuridão. Não haveria escuridão nenhuma nisso. Faríamos em uma sala aquecida à luz da tarde, com a misericórdia em nossas mãos e a delegada de polícia ao nosso lado, e daríamos a um homem bom que se perdeu a dignidade simples de encarar o problema de pé, apoiado nas próprias pernas.</w:t>
-      </w:r>
-    </w:p>
-    <w:p/>
-    <w:p>
-      <w:r>
-        <w:t>***</w:t>
+        <w:t xml:space="preserve">Era a decisão certa. Era muito melhor do que a armadilha que eu havia meio imaginado, uma noite de dinheiro de isca, prender a respiração e ver a mão de alguém saindo da escuridão. Não haveria escuridão nenhuma nisso. Faríamos em uma sala aquecida à luz da tarde, com a misericórdia em nossas mãos e a chefe de polícia ao nosso lado, e daríamos a um homem bom que se perdeu a dignidade simples de encarar o problema de pé, apoiado nas próprias pernas.</w:t>
+      </w:r>
+    </w:p>
+    <w:p/>
+    <w:p>
+      <w:r>
+        <w:t xml:space="preserve"/>
       </w:r>
     </w:p>
     <w:p/>
@@ -4362,7 +4362,7 @@
     <w:p/>
     <w:p>
       <w:r>
-        <w:t>— Você tem tido medo do segredo errado esse tempo todo — eu lhe disse. — Você achava que o segredo era que Constance era uma ladra. Leia isto, Fiona. Os Blackburns não lhe pagavam havia meses. A mãe dela estava morrendo a três ruas de distância sem dinheiro para um médico. Eles disseram a uma garota para ser grata por ter um teto enquanto uma fortuna repousava em uma caixa que ela espanava todos os dias. Ela não roubou de pessoas que tinham sido justas com ela. Ela tirou de pessoas que a haviam roubado primeiro, e construiu cem anos de acolhimento honesto em cima disso. — Eu fechei as mãos dela ao redor da pasta. — Esse não é um segredo que arruina você. Essa é uma história dentro da qual você pode ficar de pé, com a coluna reta. A chantagem só funcionou porque você passou a vida inteira escondendo a metade que lhe traz vergonha, sem nunca saber que havia uma metade que não traz.</w:t>
+        <w:t xml:space="preserve">— Você tem tido medo do segredo errado esse tempo todo — eu lhe disse. — Você achava que o segredo era que Constance era uma ladra. Leia isto, Fiona. Os Blackburn não lhe pagavam havia meses. A mãe dela estava morrendo a três ruas de distância sem dinheiro para um médico. Eles disseram a uma garota para ser grata por ter um teto enquanto uma fortuna repousava em uma caixa que ela espanava todos os dias. Ela não roubou de pessoas que tinham sido justas com ela. Ela tirou de pessoas que a haviam roubado primeiro, e construiu cem anos de acolhimento honesto em cima disso. — Eu fechei as mãos dela ao redor da pasta. — Esse não é um segredo que arruina você. Essa é uma história dentro da qual você pode ficar de pé, com a coluna reta. A chantagem só funcionou porque você passou a vida inteira escondendo a metade que lhe traz vergonha, sem nunca saber que havia uma metade que não traz.</w:t>
       </w:r>
     </w:p>
     <w:p/>
@@ -4427,13 +4427,13 @@
     <w:p/>
     <w:p>
       <w:r>
-        <w:t>Fizemos isso na última tarde do festival, na salinha de Fiona, com os sons do parque de diversões se despedindo e entrando pela janela, uma criança reclamando de ter que ir para casa, o arrastar de mesas de cavalete sendo dobradas no gramado. Noriko havia pedido a Theo que viesse conversar sobre o que ela chamara de assunto da Sociedade, e pedido a Vera que viesse com o pretexto do que chamara de recado do escritório do prefeito. Assim, os dois chegaram com poucos minutos de diferença, separadamente, sem saber que o outro estava vindo.</w:t>
-      </w:r>
-    </w:p>
-    <w:p/>
-    <w:p>
-      <w:r>
-        <w:t>Observei tudo da minha cadeira no canto. Pip acomodara-se embaixo dela e, por uma vez, guardou suas opiniões para si. Vera entrou primeiro, deu dois passos para dentro da sala antes de ver Theo já sentado ali. Ela me olhou, olhou para Fiona, pálida e erguida junto à janela, e para a chefe de polícia do outro lado da sala, com seu caderno gastado aberto no colo. Ela entendeu. O sangue sumiu de seu rosto de uma só vez, como água saindo de um copo tombado.</w:t>
+        <w:t xml:space="preserve">Fizemos isso na última tarde do festival, na salinha de Fiona, com os sons da feira se despedindo e entrando pela janela, uma criança reclamando de ter que ir para casa, o arrastar de mesas de cavalete sendo dobradas na praça. Noriko havia pedido a Theo que viesse conversar sobre o que ela chamara de assunto da Sociedade, e pedido a Vera que viesse com o pretexto do que chamara de recado do escritório do prefeito. Assim, os dois chegaram com poucos minutos de diferença, separadamente, sem saber que o outro estava vindo.</w:t>
+      </w:r>
+    </w:p>
+    <w:p/>
+    <w:p>
+      <w:r>
+        <w:t xml:space="preserve">Observei tudo da minha cadeira no canto. Pip acomodara-se embaixo dela e, por uma vez, guardou suas opiniões para si. Vera entrou primeiro, deu dois passos para dentro da sala antes de ver Theo já sentado ali. Ela me olhou, olhou para Fiona, pálida e erguida junto à janela, e para a chefe de polícia do outro lado da sala, com seu caderno gasto aberto no colo. Ela entendeu. O sangue sumiu de seu rosto de uma só vez, como água saindo de um copo tombado.</w:t>
       </w:r>
     </w:p>
     <w:p/>
@@ -4445,7 +4445,7 @@
     <w:p/>
     <w:p>
       <w:r>
-        <w:t>— Sente-se, por favor, os dois — disse Noriko, com voz mansa e firme. — Ninguém está sendo preso. Ninguém está com algemas. Vamos conversar, só isso. A Sra. Claus vai expor o que sabe, e então vocês dois vão ter uma escolha a fazer. Sente-se.</w:t>
+        <w:t xml:space="preserve">— Sentem-se, por favor, vocês dois — disse Noriko, com voz mansa e firme. — Ninguém está sendo preso. Ninguém está com algemas. Vamos conversar, só isso. A Sra. Claus vai expor o que sabe, e então vocês dois vão ter uma escolha a fazer. Sentem-se.</w:t>
       </w:r>
     </w:p>
     <w:p/>
@@ -4463,25 +4463,25 @@
     <w:p/>
     <w:p>
       <w:r>
-        <w:t xml:space="preserve">— Theo — eu disse. — As cartas de chantagem para Fiona foram escritas no papel de carta da Sociedade. O papel-creme pesado com linhas vergê. Comparei grama por grama com uma folha do seu estoque. — Ele recuou com um sobressalto, mas continuei, firme. — E elas descrevem o broche como </w:t>
-      </w:r>
-      <w:r>
-        <w:t>&lt;bt&gt;</w:t>
-      </w:r>
-      <w:r>
-        <w:t>the sapphire at its heart</w:t>
-      </w:r>
-      <w:r>
-        <w:t>&lt;/bt&gt;</w:t>
-      </w:r>
-      <w:r>
-        <w:t>. Essas são as suas palavras, Theo. Estão no seu cartão de catálogo, de seu próprio punho, o cartão das cartas Blackburn que você disse à cidade inteira na abertura que tinham sumido. As cartas não sumiram. Você as retirou porque continham o segredo, e depois as chamou de perdidas para que ninguém pensasse em perguntar o que havia nelas. — Parei um instante e deixei que a continuação viesse branda. — Você encontrou um jeito de salvar a Sociedade naquelas cartas. E aproveitou. Não foi?</w:t>
-      </w:r>
-    </w:p>
-    <w:p/>
-    <w:p>
-      <w:r>
-        <w:t>Por um longo momento ele não falou. Suas mãos apertavam uma à outra no colo. E então aconteceu aquilo que Noriko me dissera que a maioria das pessoas faz quando a verdade é expuesta de maneira gentil e completa. Ele parou de lutar contra isso. Seu rosto foi se enrugando devagar, como papel velho. As lágrimas vieram, e depois a verdade, tudo de uma vez.</w:t>
+        <w:t xml:space="preserve">— Theo — eu disse. — Os bilhetes de chantagem para Fiona foram escritos no papel de carta da Sociedade. O papel-creme pesado com linhas vergê. Comparei fibra por fibra com uma folha do seu estoque. — Ele recuou com um sobressalto, mas continuei, firme. — E eles descrevem o broche como </w:t>
+      </w:r>
+      <w:r>
+        <w:t xml:space="preserve">a</w:t>
+      </w:r>
+      <w:r>
+        <w:t xml:space="preserve"> safira em seu coração</w:t>
+      </w:r>
+      <w:r>
+        <w:t xml:space="preserve"/>
+      </w:r>
+      <w:r>
+        <w:t xml:space="preserve">. Essas são as suas palavras, Theo. Estão na sua ficha de catálogo, de seu próprio punho, a ficha das cartas dos Blackburn que você disse à cidade inteira na abertura que tinham sumido. As cartas não sumiram. Você as retirou porque continham o segredo, e depois as chamou de perdidas para que ninguém pensasse em perguntar o que havia nelas. — Parei um instante e deixei que a continuação viesse branda. — Você encontrou um jeito de salvar a Sociedade naquelas cartas. E aproveitou. Não foi?</w:t>
+      </w:r>
+    </w:p>
+    <w:p/>
+    <w:p>
+      <w:r>
+        <w:t xml:space="preserve">Por um longo momento ele não falou. Suas mãos apertavam uma à outra no colo. E então aconteceu aquilo que Noriko me dissera que a maioria das pessoas faz quando a verdade é exposta de maneira gentil e completa. Ele parou de lutar contra isso. Seu rosto foi se enrugando devagar, como papel velho. As lágrimas vieram, e depois a verdade, tudo de uma vez.</w:t>
       </w:r>
     </w:p>
     <w:p/>
@@ -4505,7 +4505,7 @@
     <w:p/>
     <w:p>
       <w:r>
-        <w:t>— Vera — eu disse. — Theo cometeu o furto. Mas as notas sabiam que a pousada havia sido comprada com o dinheiro do broche, e isso nunca esteve em nenhuma carta Blackburn. Isso é um registro de propriedade. Uma escritura. E a escritura desta pousada estava fora de sua gaveta na sua cesta de reorganização ontem de manhã, manuseada, na escrivaninha de uma mulher que me dissera duas vezes que nunca lê os registros que guarda nas costas. — Mantive a voz macia. — Ele cometeu o furto. Você tinha a escritura. E você tinha as pernas, Vera. Ele não conseguiria cruzar esta cidade sem ser notado nem se sua vida dependesse disso, todo mundo conhece o Theo, todo mundo o para. Mas ninguém pisca para a secretária do prefeito dando um pulo na pousada durante o festival. Eu mesma passei por você nos degraus naquela manhã, com os passes de estacionamento. Ele não teria conseguido fazer isso sozinho. Precisava de alguém que pudesse se mover pela cidade sem ser visto. Essa era você.</w:t>
+        <w:t xml:space="preserve">— Vera — eu disse. — Theo cometeu o furto. Mas os bilhetes sabiam que a pousada havia sido comprada com o dinheiro do broche, e isso nunca esteve em nenhuma carta dos Blackburn. Isso é um registro de propriedade. Uma escritura. E a escritura desta pousada estava fora de sua gaveta na sua cesta de rearquivamento ontem de manhã, manuseada, na escrivaninha de uma mulher que me dissera duas vezes que nunca lê os registros que guarda nas costas. — Mantive a voz macia. — Ele cometeu o furto. A senhora tinha a escritura. E a senhora tinha as pernas, Vera. Ele não conseguiria cruzar esta cidade sem ser notado nem se sua vida dependesse disso, todo mundo conhece o Theo, todo mundo o para. Mas ninguém pisca para a secretária do prefeito dando um pulo na pousada durante o festival. Eu mesma passei pela senhora nos degraus naquela manhã, com os passes de estacionamento. Ele não teria conseguido fazer isso sozinho. Precisava de alguém que pudesse se mover pela cidade sem ser visto. Essa pessoa era a senhora.</w:t>
       </w:r>
     </w:p>
     <w:p/>
@@ -4517,7 +4517,7 @@
     <w:p/>
     <w:p>
       <w:r>
-        <w:t>— Ele me procurou — disse ela. — Semanas atrás. Meio fora de si com aquilo, falando da Sociedade, sobre como havia achado aquilo e não conseguia fazer sozinho. E eu devia ter dito não. Sei que devia ter dito não, eu já sabia naquela hora. — Ela balançou um pouco o corpo, com os braços apertados ao redor de si. — Mas estou tão atolada, Sra. Claus. O prefeito me paga uma miséria e me esgota até o osso, e tenho dívidas que o senhor não imaginaria, daquelas que não deixam a gente dormir, e o Theo disse que era dinheiro roubado para começo de conversa, tirado de uma família rica cem anos atrás, e que salvaria a Sociedade, e que uma parte daquilo viria para mim, e finalmente eu me livraria daquela situação. Ele fez soar quase nobre. Ele é bom nisso, em fazer uma coisa parecer história em vez de crime. E eu queria tanto me livrar daquilo que deixei ele fazer soar daquele jeito, porque queria acreditar. — Ela olhou para Fiona, acabada. — Nunca pensei em você como uma pessoa. Essa é a pior parte, é isso que vou carregar. Só pensei no dinheiro e em conseguir dormir. Me desculpe. Me desculpe tanto, Fiona.</w:t>
+        <w:t xml:space="preserve">— Ele me procurou — disse ela. — Semanas atrás. Meio fora de si com aquilo, falando da Sociedade, sobre como havia achado aquilo e não conseguia fazer sozinho. E eu devia ter dito não. Sei que devia ter dito não, eu já sabia naquela hora. — Ela balançou um pouco o corpo, com os braços apertados ao redor de si. — Mas estou tão atolada, Sra. Claus. O prefeito me paga uma miséria e me esgota até o osso, e tenho dívidas que a senhora não imaginaria, daquelas que não deixam a gente dormir, e o Theo disse que era dinheiro roubado para começo de conversa, tirado de uma família rica cem anos atrás, e que salvaria a Sociedade, e que uma parte daquilo viria para mim, e finalmente eu me livraria daquela situação. Ele fez soar quase nobre. Ele é bom nisso, em fazer uma coisa parecer história em vez de crime. E eu queria tanto me livrar daquilo que deixei ele fazer soar daquele jeito, porque queria acreditar. — Ela olhou para Fiona, acabada. — Nunca pensei em você como uma pessoa. Essa é a pior parte, é isso que vou carregar. Só pensei no dinheiro e nas noites sem dormir. Me desculpe. Me desculpe tanto, Fiona.</w:t>
       </w:r>
     </w:p>
     <w:p/>
@@ -4576,13 +4576,13 @@
     <w:p/>
     <w:p>
       <w:r>
-        <w:t>Para Vera, significava devolver o que pudesse, em parcelas que sentiria nos ossos todos os meses, um longo período de supervisão e a saída da prefeitura. Ela pediu demissão na semana seguinte. Foi a coisa certa a fazer e custou-lhe caro, porque, por mais que o prefeito the pagasse mal, aquela mesa havia sido o seu lugar nesta cidade por quinze anos. Aquilo me pesou. Eu tinha provocado aquilo. Teve um custo real, e me forcei a encará-lo de frente em vez de desviar o olhar.</w:t>
-      </w:r>
-    </w:p>
-    <w:p/>
-    <w:p>
-      <w:r>
-        <w:t>Para Theo, foi pior, porque a Sociedade era todo o seu coração, e a Sociedade era a única coisa que ele tinha de perder.</w:t>
+        <w:t xml:space="preserve">Para Vera, significava devolver o que pudesse, em parcelas que sentiria nos ossos todos os meses, um longo período de supervisão e a saída da prefeitura. Ela pediu demissão na semana seguinte. Foi a coisa certa a fazer e custou-lhe caro, porque, por mais que o prefeito lhe pagasse mal, aquela mesa havia sido o seu lugar nesta cidade por quinze anos. Aquilo me pesou. Eu tinha provocado aquilo. Teve um custo real, e me forcei a encará-lo de frente em vez de desviar o olhar.</w:t>
+      </w:r>
+    </w:p>
+    <w:p/>
+    <w:p>
+      <w:r>
+        <w:t xml:space="preserve">Para Theo, foi pior, porque a Sociedade era todo o seu coração, e a Sociedade era a única coisa de que ele tinha de abrir mão.</w:t>
       </w:r>
     </w:p>
     <w:p/>
@@ -4600,7 +4600,7 @@
     <w:p/>
     <w:p>
       <w:r>
-        <w:t>— É mais do que eu mereço — disse Theo, quando lhe contaram. Ele chorou, e foi o choro de um homem que se negara a aceitar a forca e em troca recebera uma estrada longa e árdua.</w:t>
+        <w:t xml:space="preserve">— É mais do que eu mereço — disse Theo, quando lhe contaram. Ele chorou, e foi o choro de um homem que se preparara para a forca e em troca recebera uma estrada longa e árdua.</w:t>
       </w:r>
     </w:p>
     <w:p/>
@@ -4624,13 +4624,13 @@
     <w:p/>
     <w:p>
       <w:r>
-        <w:t>— Você fez uma coisa errada — eu disse. — E está pagando por ela, do jeito certo, o que é correto. Mas você assumiu tudo no exato segundo em que foi questionada, Vera. Você não mentiu e não tentou escapar. Isso não é pouca coisa. Essa é a parte em você que ainda é boa, e ela é maior do que a parte que cometeu o erro, e eu quero que você se agarre a isso. O caminho de volta também é longo para você. Mas ele existe. Não deixe ninguém lhe dizer o contrário e, acima de tudo, não diga isso a si mesma.</w:t>
-      </w:r>
-    </w:p>
-    <w:p/>
-    <w:p>
-      <w:r>
-        <w:t>Ela chorou. Abraçou-me, essa mulher rígida e contida a quem eu nunca tinha visto abraçar alma viva, e agradeceu encostada no meu ombro. Depois, partiu em direção à casa da irmã, e Pip e I caminhamos para casa no escuro que caía cedo. Não havia triunfo algum nisso. Eu estava pesada e exausta por dentro, como se tivesse limpado uma ferida até o fundo: doía muito mais do que deixá-la quieta, mas agora ela podia cicatrizar.</w:t>
+        <w:t xml:space="preserve">— A senhora fez uma coisa errada — eu disse. — E está pagando por ela, do jeito certo, o que é correto. Mas a senhora assumiu tudo no exato segundo em que foi questionada, Vera. A senhora não mentiu e não tentou escapar. Isso não é pouca coisa. Essa é a parte da senhora que ainda é boa, e ela é maior do que a parte que cometeu o erro, e eu quero que a senhora se agarre a isso. O caminho de volta também é longo para a senhora. Mas ele existe. Não deixe ninguém lhe dizer o contrário e, acima de tudo, não diga isso a si mesma.</w:t>
+      </w:r>
+    </w:p>
+    <w:p/>
+    <w:p>
+      <w:r>
+        <w:t xml:space="preserve">Ela chorou. Abraçou-me, essa mulher rígida e contida a quem eu nunca tinha visto abraçar alma viva, e agradeceu encostada no meu ombro. Depois, partiu em direção à casa da irmã, e Pip e eu caminhamos para casa no escuro que caía cedo. Não havia triunfo algum nisso. Eu estava pesada e exausta por dentro, como se tivesse limpado uma ferida até o fundo: doía muito mais do que deixá-la quieta, mas agora ela podia cicatrizar.</w:t>
       </w:r>
     </w:p>
     <w:p/>
@@ -4659,17 +4659,17 @@
     <w:p/>
     <w:p>
       <w:r>
-        <w:t>Os Worthingtons vieram me procurar antes de irem embora da cidade, o que me surpreendeu, e se ofereceram para consertar tudo, o que me surpreendeu muito mais.</w:t>
-      </w:r>
-    </w:p>
-    <w:p>
-      <w:r>
-        <w:t>Eles sabiam, é claro. Nada ficava em segredo em Frost Falls por mais de uma manhã. Os polidos e gentis Worthingtons tinham juntado os pedaços, através do murmúrio do festival e do silêncio da pousada, de que a Sociedade Histórica estava em sérios apuros e que os apuros tinham levado um homem bom a um caminho ruim. O Sr. Worthington me encontrou na varanda da pousada na última manhã deles, com a esposa ao lado usando seu casaco de cashmere cor de creme e o casaco bom pendurado no braço, e ele foi direto ao assunto com a naturalidade de alguém para quem o dinheiro nunca fora um assunto difícil de levantar.</w:t>
-      </w:r>
-    </w:p>
-    <w:p>
-      <w:r>
-        <w:t>— Sra. Claus — disse ele. — Afeiçoamo-nos a esta cidade nestas semanas que passamos aqui. Afeiçoamo-nos de verdade. E entendemos que a Sociedade Histórica está passando por uma verdadeira dificuldade financeira. Uma dificuldade séria, pelo que ouvimos. — Ele sorriu, caloroso e seguro. — Estamos em condições de ajudar. Generosamente. O bastante para resolver o assunto todo de uma só vez, o telhado, a caldeira, e ainda um fundo de doação para manter o lugar seguro por uma geração. Eu teria o maior prazer em assinar o cheque antes de darmos o fora esta manhã. Custaria muito pouco para nós e significaria muito aqui, e francamente, depois de toda essa feiura, acho que a cidade faria bem em ter um pouco de notícia boa para encerrar a temporada.</w:t>
+        <w:t xml:space="preserve">Os Worthington vieram me procurar antes de irem embora da cidade, o que me surpreendeu, e se ofereceram para consertar tudo, o que me surpreendeu muito mais.</w:t>
+      </w:r>
+    </w:p>
+    <w:p>
+      <w:r>
+        <w:t xml:space="preserve">Eles sabiam, é claro. Nada ficava em segredo em Frost Falls por mais de uma manhã. Os polidos e gentis Worthington tinham juntado os pedaços, através do murmúrio do festival e do silêncio da pousada, de que a Sociedade Histórica estava em sérios apuros e que os apuros tinham levado um homem bom a um caminho ruim. O Sr. Worthington me encontrou na varanda da pousada na última manhã deles, com a esposa ao lado usando sua blusa de caxemira cor de creme e o casaco bom pendurado no braço, e ele foi direto ao assunto com a naturalidade de alguém para quem o dinheiro nunca fora um assunto difícil de levantar.</w:t>
+      </w:r>
+    </w:p>
+    <w:p>
+      <w:r>
+        <w:t xml:space="preserve">— Sra. Claus — disse ele. — Afeiçoamo-nos a esta cidade nestas semanas que passamos aqui. Afeiçoamo-nos de verdade. E entendemos que a Sociedade Histórica está passando por uma verdadeira dificuldade financeira. Uma dificuldade séria, pelo que ouvimos. — Ele sorriu, caloroso e seguro. — Estamos em condições de ajudar. Generosamente. O bastante para resolver o assunto todo de uma só vez, o telhado, a caldeira, e ainda um fundo de doação para manter o lugar seguro por uma geração. Eu teria o maior prazer em assinar o cheque antes de partirmos esta manhã. Custaria muito pouco para nós e significaria muito aqui, e francamente, depois de toda essa feiura, acho que a cidade faria bem em ter um pouco de notícia boa para encerrar a temporada.</w:t>
       </w:r>
     </w:p>
     <w:p>
@@ -4699,7 +4699,7 @@
     </w:p>
     <w:p>
       <w:r>
-        <w:t>— Esta cidade acabou de passar por algo feio — eu disse —, porque um homem bom decidiu que salvar a Sociedade justificava qualquer coisa, que um resgate valia um erro, que o fim justificaria os meios. Ora. Se a Sociedade for salva semana que vem pelo talão de cheques de um visitante de passagem, por mais gentil que seja, a lição que a cidade inteira aprende em silêncio é que Theo estava certo pelo menos em uma coisa. Que a sobrevivência do prédio é algo que vem de fora, por meio de dinheiro, de um atalho, de um benfeitor, e não algo que a própria cidade tem de desejar, pela qual tem de lutar e que tem de merecer. — Balançuei a cabeça. — Uma Sociedade salva por um hóspede generoso é apenas adiada, Sr. Worthington. Estará no mesmo buraco daqui a cinco anos, esperando o próximo visitante rico se encantar com as colchas. O único jeito de o lugar estar realmente a salvo é se Frost Falls decidir por si mesma que ele vale a pena ser salvo, e o salvar com as próprias mãos, tirando do próprio bolso, por mais raso que seja. Isso é mais lento. É muito mais difícil. Mas é a versão que dura, e isso cura o que acabou de acontecer aqui em vez de colar um cartaz alegre por cima.</w:t>
+        <w:t xml:space="preserve">— Esta cidade acabou de passar por algo feio — eu disse —, porque um homem bom decidiu que salvar a Sociedade justificava qualquer coisa, que um resgate valia um erro, que o fim justificaria os meios. Ora. Se a Sociedade for salva semana que vem pelo talão de cheques de um visitante de passagem, por mais gentil que seja, a lição que a cidade inteira aprende em silêncio é que Theo estava certo pelo menos em uma coisa. Que a sobrevivência do prédio é algo que vem de fora, por meio de dinheiro, de um atalho, de um benfeitor, e não algo que a própria cidade tem de desejar, pela qual tem de lutar e que tem de merecer. — Balancei a cabeça. — Uma Sociedade salva por um hóspede generoso é apenas adiada, Sr. Worthington. Estará no mesmo buraco daqui a cinco anos, esperando o próximo visitante rico se encantar com as colchas. O único jeito de o lugar estar realmente a salvo é se Frost Falls decidir por si mesma que ele vale a pena ser salvo, e o salvar com as próprias mãos, tirando do próprio bolso, por mais raso que seja. Isso é mais lento. É muito mais difícil. Mas é a versão que dura, e isso cura o que acabou de acontecer aqui em vez de colar um cartaz alegre por cima.</w:t>
       </w:r>
     </w:p>
     <w:p>
@@ -4739,7 +4739,7 @@
     </w:p>
     <w:p>
       <w:r>
-        <w:t>Quando cheguei à nossa alameda, vi que confiava que a cidade daria conta do recado. Eu a viera mobilizada para procurar um cachorro perdido. Eu soube pelo próprio Mark como as pessoas continuavam aparecendo para os Redfern com caçarolas, semana após semana, no pior momento da situação. Pessoas capazes de fazer essas coisas podiam salvar um prédio.</w:t>
+        <w:t xml:space="preserve">Quando cheguei à nossa alameda, vi que confiava que a cidade daria conta do recado. Eu a vira mobilizada para procurar um cachorro perdido. Eu soube pelo próprio Mark como as pessoas continuavam aparecendo para os Redfern com caçarolas, semana após semana, no pior momento da situação. Pessoas capazes de fazer essas coisas podiam salvar um prédio.</w:t>
       </w:r>
     </w:p>
     <w:p>
@@ -4761,7 +4761,7 @@
     <w:p/>
     <w:p>
       <w:r>
-        <w:t>Ela subiu até a cabana alguns dias depois, com a pasta de Neil debaixo do braço e uma expressão no rosto que eu nunca vira ali antes, resolvida e um tanto feroz.</w:t>
+        <w:t xml:space="preserve">Ela subiu até o chalé alguns dias depois, com a pasta de Neil debaixo do braço e uma expressão no rosto que eu nunca vira ali antes, resolvida e um tanto feroz.</w:t>
       </w:r>
     </w:p>
     <w:p/>
@@ -4803,7 +4803,7 @@
     <w:p/>
     <w:p>
       <w:r>
-        <w:t>Foi esse o fim do poder do segredo, ali mesmo, numa loja de tricô, com a camomila em infusão e as luvas prontas se amontoando na cesta. Uma coisa contada por inteiro, num quarto quente, entre pessoas que tinham conhecido seus próprios invernos rigorosos.</w:t>
+        <w:t xml:space="preserve">Foi esse o fim do poder do segredo, ali mesmo, numa loja de tricô, com a camomila em infusão e as luvas prontas se amontoando na cesta. Uma coisa contada por inteiro, numa sala aquecida, entre pessoas que tinham conhecido seus próprios invernos rigorosos.</w:t>
       </w:r>
     </w:p>
     <w:p/>
@@ -4869,16 +4869,15 @@
     <w:p/>
     <w:p>
       <w:r>
-        <w:t xml:space="preserve">Caminhei para casa naquela tarde através de uma cidade que parecia inteira e inquestionavelmente minha. O festival já havia sido desmontado e ido embora, mas as luzes ao longo da Avenida Evergreen, quase todas douradas a esta altura, ainda brilhavam firmes contra o escuro que caía cedo. Pip waddled à minha frente — </w:t>
+        <w:t xml:space="preserve">Caminhei para casa naquela tarde através de uma cidade que parecia inteira e inquestionavelmente minha. O festival já havia sido desmontado e ido embora, mas as luzes ao longo da Avenida Evergreen, quase todas douradas a esta altura, ainda brilhavam firmes contra o escuro que caía cedo. </w:t>
       </w:r>
       <w:r>
         <w:rPr>
           <w:i/>
         </w:rPr>
-        <w:t xml:space="preserve">nota: "Pip waddled" -&gt; Pip marchava gingada</w:t>
-      </w:r>
-      <w:r>
-        <w:t xml:space="preserve"> — [corrigindo para o fluxo natural:] Pip marchava gingada à minha frente de uma poça de luz dourada para a outra, parando em cada uma como se pudesse haver algo brilhante no fundo dela.</w:t>
+      </w:r>
+      <w:r>
+        <w:t>Pip marchava gingada à minha frente de uma poça de luz dourada para a outra, parando em cada uma como se pudesse haver algo brilhante no fundo dela.</w:t>
       </w:r>
     </w:p>
     <w:p>
@@ -4889,13 +4888,13 @@
     <w:p/>
     <w:p>
       <w:r>
-        <w:t>A Sociedade precisava de uma boajeitada depois de Theo, então o círculo e boa metade da Avenida Evergreen apareceram nos dias seguintes para botar o arquivo em ordem.</w:t>
-      </w:r>
-    </w:p>
-    <w:p/>
-    <w:p>
-      <w:r>
-        <w:t xml:space="preserve">Theo tinha devolvido as cartas dos Blackburn, cada uma delas, como parte de sua reparação, e eu estava arquivando-as com Olivia e Dot em uma tarde fria, nós três na mesa de trabalho comprida com a luminária boa puxada para perto, quando dei com uma que eu não tinha visto antes. Não era sobre o broche. Descrevia um dia de inverno em 1924, quando as famílias da cidade se reuniram no gramado, lacraram uma caixa com os tesouros do município e a enterraram sob o grande olmo, </w:t>
+        <w:t xml:space="preserve">A Sociedade precisava de uma boa arrumação depois de Theo, então o círculo e boa metade da Avenida Evergreen apareceram nos dias seguintes para botar o arquivo em ordem.</w:t>
+      </w:r>
+    </w:p>
+    <w:p/>
+    <w:p>
+      <w:r>
+        <w:t xml:space="preserve">Theo tinha devolvido as cartas dos Blackburn, cada uma delas, como parte de sua reparação, e eu estava arquivando-as com Olivia e Dot em uma tarde fria, nós três na mesa de trabalho comprida com a luminária boa puxada para perto, quando dei com uma que eu não tinha visto antes. Não era sobre o broche. Descrevia um dia de inverno em 1924, quando as famílias da cidade se reuniram na praça, lacraram uma caixa com os tesouros do município e a enterraram sob o grande olmo, </w:t>
       </w:r>
       <w:r>
         <w:rPr>
@@ -4919,19 +4918,19 @@
     <w:p/>
     <w:p>
       <w:r>
-        <w:t>— A cápsula do tempo — disse Olivia, baixinho. — O Theo esteve arrancando os cabelos por causa disso. Todo registro que ele tinha dizia apenas que ela estava enterrada no gramado, e o gramado tem um hectare e meio. Está debaixo do olmo. Esteve bem ali o tempo todo.</w:t>
-      </w:r>
-    </w:p>
-    <w:p/>
-    <w:p>
-      <w:r>
-        <w:t>Dentro de uma hora, metade de Frost Falls estava a postos no gramado ao redor do grande olmo, com pás e lampiões, em um silêncio contido e sem fôlego que eu jamais tinha visto vindo dessa cidade barulhenta e amigável.</w:t>
-      </w:r>
-    </w:p>
-    <w:p/>
-    <w:p>
-      <w:r>
-        <w:t>Sam Patel fez a escavação, porque Sam fazia o trabalho pesado e honesto e gostava disso. Ficamos todos em volta dele sob o ouro dos lampiões e das luzes penduradas, nossa fumaça subindo junta no frio. Emma Redfern segurou minha mão de um lado e Pip encostou-se, quentinha, à minha bota do outro. Bola de Neve usava seu gorro de chifres. Mark ficou atrás da filha com as mãos nos ombros dela. O círculo inteiro estava lá, e Neil Carter também, que tinha ficado por mais tempo do que planejara e estava no fundo, com o caderno pela primeira vez guardado no bolso. Quando a pá de Sam bateu em algo que soou oco, sólido e metálico, o gramado inteiro emitiu um único som coletivo, um ah suave e estupefato que pairou no ar frio.</w:t>
+        <w:t xml:space="preserve">— A cápsula do tempo — disse Olivia, baixinho. — O Theo esteve arrancando os cabelos por causa disso. Todo registro que ele tinha dizia apenas que ela estava enterrada na praça, e a praça tem pouco mais de um hectare e meio. Está debaixo do olmo. Esteve bem ali o tempo todo.</w:t>
+      </w:r>
+    </w:p>
+    <w:p/>
+    <w:p>
+      <w:r>
+        <w:t xml:space="preserve">Dentro de uma hora, metade de Frost Falls estava a postos na praça ao redor do grande olmo, com pás e lampiões, em um silêncio contido e sem fôlego que eu jamais tinha ouvido dessa cidade barulhenta e amigável.</w:t>
+      </w:r>
+    </w:p>
+    <w:p/>
+    <w:p>
+      <w:r>
+        <w:t xml:space="preserve">Sam Patel fez a escavação, porque Sam fazia o trabalho pesado e honesto e gostava disso. Ficamos todos em volta dele sob o ouro dos lampiões e das luzes penduradas, nosso hálito subindo junto no frio. Emma Redfern segurou minha mão de um lado e Pip encostou-se, quentinha, à minha bota do outro. Snowball usava seu gorro de chifres. Mark ficou atrás da filha com as mãos nos ombros dela. O círculo inteiro estava lá, e Neil Carter também, que tinha ficado por mais tempo do que planejara e estava no fundo, com o caderno pela primeira vez guardado no bolso. Quando a pá de Sam bateu em algo que soou oco, sólido e metálico, a praça inteira emitiu um único som coletivo, um ah suave e estupefato que pairou no ar frio.</w:t>
       </w:r>
     </w:p>
     <w:p/>
@@ -4943,7 +4942,7 @@
     <w:p/>
     <w:p>
       <w:r>
-        <w:t>— Não abram — disse Noriko, antes que as mãos de qualquer um pudessem alcançá-la, e ela o disse com gentileza, mas com firmeza, a delegada e a mulher sábia, ambas ao mesmo tempo. — Hoje não, não desse jeito, no escuro, com pás e todo mundo com frio. Ela está lá embaixo há cem anos. Pode esperar até o ano novo e ser aberta direito. Vamos fazer isso do jeito certo. A cidade inteira, à luz do dia. — Ela encontrou meu olhar através da luz do lampião e o sustentou. — Com o Theo lá.</w:t>
+        <w:t xml:space="preserve">— Não abram — disse Noriko, antes que as mãos de qualquer um pudessem alcançá-la, e ela o disse com gentileza, mas com firmeza, a chefe de polícia e a mulher sábia, ambas ao mesmo tempo. — Hoje não, não desse jeito, no escuro, com pás e todo mundo com frio. Ela está lá embaixo há cem anos. Pode esperar até o ano novo e ser aberta direito. Vamos fazer isso do jeito certo. A cidade inteira, à luz do dia. — Ela encontrou meu olhar através da luz do lampião e o sustentou. — Com o Theo lá.</w:t>
       </w:r>
     </w:p>
     <w:p/>
@@ -4955,7 +4954,7 @@
     <w:p/>
     <w:p>
       <w:r>
-        <w:t>— Ele encontrou metade da trilha até ela, afinal de contas — continuou Noriko, — mesmo que tenha acabado de encontrá-la do jeito errado. Ele dedicou trinta anos a saber onde as coisas enterradas desta cidade estão. Ele deveria estar lá para ver esta vir à luz. Pode ser a primeira coisa boa de que ele chega a participar de novo. E participar de uma coisa boa pela qual ele não pode levar crédito nenhum talvez seja exatamente o remédio de que ele precisa.</w:t>
+        <w:t xml:space="preserve">— Ele encontrou metade da trilha até ela, afinal de contas — continuou Noriko —, mesmo que tenha acabado de encontrá-la do jeito errado. Ele dedicou trinta anos a saber onde as coisas enterradas desta cidade estão. Ele deveria estar lá para ver esta vir à luz. Pode ser a primeira coisa boa de que ele chega a participar de novo. E participar de uma coisa boa pela qual ele não pode levar crédito nenhum talvez seja exatamente o remédio de que ele precisa.</w:t>
       </w:r>
     </w:p>
     <w:p/>
@@ -4973,7 +4972,7 @@
     <w:p/>
     <w:p>
       <w:r>
-        <w:t>Um momento depois, Bram disparou cruzando o gramado, torcendo o boné, e atrás dele, é claro, veio uma rena. Dançarina desta vez, que tinha se soltado do piquete de novo e seguido os lampiões até a cidade. Ela parou no meio do gramado com a geada reluzindo em seus chifres, encarando a caixa de cobre desenterrada com um interesse brando e sem pressa, enquanto cem moradores a encaravam e uma menininha soltava um grito de pura alegria.</w:t>
+        <w:t xml:space="preserve">Um momento depois, Bram disparou cruzando a praça, torcendo o boné, e atrás dele, é claro, veio uma rena. Dancer desta vez, que tinha se soltado do piquete de novo e seguido os lampiões até a cidade. Ela parou no meio da praça com a geada reluzindo em seus chifres, encarando a caixa de cobre desenterrada com um interesse brando e sem pressa, enquanto cem moradores a encaravam e uma menininha soltava um grito de pura alegria.</w:t>
       </w:r>
     </w:p>
     <w:p/>
@@ -4985,13 +4984,13 @@
     <w:p/>
     <w:p>
       <w:r>
-        <w:t>— Deixe-a ficar — eu disse, rindo, enquanto Emma se soltava do pai e corria para jogar os braços em volta do pescoço de Dançarina. — Ela não está fazendo mal nenhum, Bram. Deixe-a dar uma olhada.</w:t>
-      </w:r>
-    </w:p>
-    <w:p/>
-    <w:p>
-      <w:r>
-        <w:t>Fiquei ali no gramado e olhei em volta para tudo aquilo: o olmo e as luzes douradas, a caixa de cobre esverdeada, a rena, a criança rindo e a cidade inteira reunida de perto à luz dos lampiões. Pip tinha ido postar-se sob o focinho de Dançarina e estava dando na rena um olhar longo e severo, como se para lembrá-la de de quem era aquele pinguim. A mão de Nick encontrou a minha. Logo além do piquete ficava a lareira que ele tinha construído para a magia, e eu me perguntei quanto mais dela estaria circulando por lá quando chegássemos em casa.</w:t>
+        <w:t xml:space="preserve">— Deixe-a ficar — eu disse, rindo, enquanto Emma se soltava do pai e corria para jogar os braços em volta do pescoço de Dancer. — Ela não está fazendo mal nenhum, Bram. Deixe-a dar uma olhada.</w:t>
+      </w:r>
+    </w:p>
+    <w:p/>
+    <w:p>
+      <w:r>
+        <w:t xml:space="preserve">Fiquei ali na praça e olhei em volta para tudo aquilo: o olmo e as luzes douradas, a caixa de cobre esverdeada, a rena, a criança rindo e a cidade inteira reunida de perto à luz dos lampiões. Pip tinha ido postar-se sob o focinho de Dancer e estava dando na rena um olhar longo e severo, como se para lembrá-la de quem era aquele pinguim. A mão de Nick encontrou a minha. Logo além do piquete ficava a lareira que ele tinha construído para a magia, e eu me perguntei quanto mais dela estaria circulando por lá quando chegássemos em casa.</w:t>
       </w:r>
     </w:p>
     <w:p/>
@@ -5062,7 +5061,7 @@
     <w:p/>
     <w:p>
       <w:r>
-        <w:t>— Espera — disse ela. — Não vai embora. — Ela correu para dentro e voltou com um pote de geleia segurado com as duas mãos.</w:t>
+        <w:t xml:space="preserve">— Espere — disse ela. — Não vá embora. — Ela correu para dentro e voltou com um pote de geleia segurado com as duas mãos.</w:t>
       </w:r>
     </w:p>
     <w:p/>
@@ -5098,7 +5097,7 @@
     <w:p/>
     <w:p>
       <w:r>
-        <w:t>Vi Theo mais uma vez naquela semana. Ele estava na Sociedade, na sala dos fundos, remendando um mapa antigo e rasgado, o trabalho mais humilde que já lhe haviam dado, e visivelmente grato por isso. Ele não me ouviu entrar. Quando levantou os olhos, empertigou-se e tencionou-se, como um homem que esperava ser lembrado exatamente do que era.</w:t>
+        <w:t xml:space="preserve">Vi Theo mais uma vez naquela semana. Ele estava na Sociedade, na sala dos fundos, remendando um mapa antigo e rasgado, o trabalho mais humilde que já lhe haviam dado, e visivelmente grato por isso. Ele não me ouviu entrar. Quando levantou os olhos, empertigou-se e retesou-se, como um homem que esperava ser lembrado exatamente do que era.</w:t>
       </w:r>
     </w:p>
     <w:p/>
@@ -5116,7 +5115,7 @@
     <w:p/>
     <w:p>
       <w:r>
-        <w:t>— É tudo o que me deixam fazer — disse ele e, logo em seguida, antes que eu pudesse responder: — O que é certo. Não estou reclamando. É bem mais do que eu me daria no meu lugar. — Ele alisou o papel velho com a ponta de dois dedos. — Vão abrir a cápsula no ano novo. Ficou sabendo? Noriko diz que vou poder estar lá. Assistindo. — Os olhos dele se encheram d'água. Pestanejou com força e inclinou-se ainda mais sobre o mapa. — Não mereço estar lá. Mas ela diz que posso assistir. Depois de tudo, vou poder ficar na sala quando a cidade abrir o próprio coração. Penso nisso todo santo dia. É uma boa parte do que está me mantendo de pé, para ser sincera.</w:t>
+        <w:t xml:space="preserve">— É tudo o que me deixam fazer — disse ele e, logo em seguida, antes que eu pudesse responder: — O que é certo. Não estou reclamando. É bem mais do que eu me daria, no lugar deles. — Ele alisou o papel velho com a ponta de dois dedos. — Vão abrir a cápsula no ano novo. Ficou sabendo? Noriko diz que vou poder estar lá. Assistindo. — Os olhos dele se encheram d'água. Pestanejou com força e inclinou-se ainda mais sobre o mapa. — Não mereço estar lá. Mas ela diz que posso assistir. Depois de tudo, vou poder ficar na sala quando a cidade abrir o próprio coração. Penso nisso todo santo dia. É uma boa parte do que está me mantendo de pé, para ser sincero.</w:t>
       </w:r>
     </w:p>
     <w:p/>
@@ -5146,7 +5145,7 @@
     <w:p/>
     <w:p>
       <w:r>
-        <w:t>— Um pouco dela. O começo. — Ele passou o braço em volta de mim. — Não tudo, não para valer, ainda não. Isso ainda são anos de trabalho, construir uma lareira grande o bastante para abrigar toda a magia do Natal. Mais tarde, Jess.</w:t>
+        <w:t xml:space="preserve">— Um pouco dela. O começo. — Ele passou o braço em volta de mim. — Não tudo, não para valer, ainda não. Isso ainda são anos de trabalho, construir uma lareira grande o bastante para abrigar toda a magia do Natal. Mas já começou, Jess.</w:t>
       </w:r>
     </w:p>
     <w:p/>
@@ -5158,7 +5157,7 @@
     <w:p/>
     <w:p>
       <w:r>
-        <w:t>Mas as luzes brilhavam douradas sobre Frost Falls. Uma criança que havia emudecido tagarelava de novo sobre tesouro. Fiona afinal se aprumara dentro da própria história verdadeira, e a Theo havia sido entregue um caminho de volta. Eu já não era uma estranha ali. Eu estava em casa. Nós dois estávamos. E a magia do Natal, que nos seguira desde o Polo todo, começara, apenas começara, a se assentar.</w:t>
+        <w:t xml:space="preserve">Mas as luzes brilhavam douradas sobre Frost Falls. Uma criança que havia emudecido tagarelava de novo sobre tesouro. Fiona afinal se aprumara dentro da própria história verdadeira, e a Theo havia sido entregue um caminho de volta. Eu já não era uma estranha ali. Eu estava em casa. Nós dois estávamos. E a magia do Natal, que nos seguira por todo o caminho desde o Polo, começara, apenas começara, a se assentar.</w:t>
       </w:r>
     </w:p>
     <w:p/>
@@ -5215,37 +5214,37 @@
     <w:p/>
     <w:p>
       <w:r>
-        <w:t>O que Vem a Seguir?</w:t>
-      </w:r>
-    </w:p>
-    <w:p/>
-    <w:p>
-      <w:r>
-        <w:t>Greta faz o mesmo rolinho de canela há quarenta anos. Ela o fez na manhã seguinte ao enterro do marido porque não sabia o que mais fazer com as mãos. Nesta semana, ele sai azedo do forno, e o lote seguinte também, e o outro depois desse.</w:t>
-      </w:r>
-    </w:p>
-    <w:p/>
-    <w:p>
-      <w:r>
-        <w:t>Farinha nova. Água nova. Uma balança emprestada. Ainda azedo. Na quinta-feira, Greta está em sua própria padaria dizendo a Jessica Claus que suas mãos finalmente esqueceram como se faz.</w:t>
-      </w:r>
-    </w:p>
-    <w:p/>
-    <w:p>
-      <w:r>
-        <w:t>Então um tijolo atravessa a janela, e uma palavra surge pintada de vermelho na tábua da fachada, onde todas as crianças da Evergreen Avenue vão ler ao passar.</w:t>
-      </w:r>
-    </w:p>
-    <w:p/>
-    <w:p>
-      <w:r>
-        <w:t>A cidade apela para os suspeitos fáceis: o açougueiro que acorrentou o portão de carga, a família atrasada com a conta de óleo, um garoto entorpecido com uma lata roubada. Jessica vai atrás do que faz sentido — porque quem fez isso comprou o pó, conhecia a dosagem e apresentou uma reclamação citando o código de saúde por parágrafo. Isso não é um acesso de raiva. Isso é um ofício.</w:t>
-      </w:r>
-    </w:p>
-    <w:p/>
-    <w:p>
-      <w:r>
-        <w:t>E na ponta iluminada da avenida, uma nova confeitaria marcou sua grande inauguração justamente para a semana em que a The Holly Jolly vai estar de portas fechadas.</w:t>
+        <w:t xml:space="preserve">O Que Vem a Seguir?</w:t>
+      </w:r>
+    </w:p>
+    <w:p/>
+    <w:p>
+      <w:r>
+        <w:t xml:space="preserve">Greta faz o mesmo rolinho de canela há quarenta anos. Ela o fez na manhã seguinte ao funeral do marido porque não sabia o que mais fazer com as próprias mãos. Esta semana, ele sai azedo do forno dela, e o lote seguinte também, e o outro depois desse.</w:t>
+      </w:r>
+    </w:p>
+    <w:p/>
+    <w:p>
+      <w:r>
+        <w:t xml:space="preserve">Farinha nova. Água nova. Uma balança emprestada. Ainda azedo. Na quinta-feira, Greta está em sua própria padaria dizendo a Jessica Claus que as mãos dela finalmente se esqueceram de como fazer.</w:t>
+      </w:r>
+    </w:p>
+    <w:p/>
+    <w:p>
+      <w:r>
+        <w:t xml:space="preserve">Então, um tijolo atravessa a janela, e uma palavra surge na fachada de tábuas de madeira, escrita em vermelho, onde todas as crianças da Avenida Evergreen vão ler ao passar.</w:t>
+      </w:r>
+    </w:p>
+    <w:p/>
+    <w:p>
+      <w:r>
+        <w:t xml:space="preserve">A cidade recorre aos suspeitos fáceis: o açougueiro que acorrentou o portão de carga, a família com a conta de óleo atrasada, um garoto entediado com uma lata roubada. Jessica busca a pista que se encaixa — porque quem quer que tenha feito isso comprou o pó, sabia a dose certa e fez uma denúncia que citava o código sanitário até os incisos. Isso não é acesso de raiva. É coisa de quem conhece o ofício.</w:t>
+      </w:r>
+    </w:p>
+    <w:p/>
+    <w:p>
+      <w:r>
+        <w:t xml:space="preserve">E, na extremidade iluminada da avenida, uma nova confeitaria marcou sua grande inauguração exatamente para a única semana em que a Holly Jolly estará de portas fechadas.</w:t>
       </w:r>
     </w:p>
     <w:p/>
@@ -5299,37 +5298,37 @@
     <w:p/>
     <w:p>
       <w:r>
-        <w:t xml:space="preserve">Todas as mulheres do círculo haviam trazido o próprio festão de abeto, e eu trouxera o jeito do Polo Norte de amarrá-lo, o qual Olivia havia jurado me roubar antes do Natal. Acoplei o arame à armação bem devagar, para que todas pudessem acompanhar. Só então estiquei a mão para pegar o primeiro punhado de abeto. O cheiro subiu frio e verde, agudo o bastante para clarear a cabeça. Preencheu a sala da frente da </w:t>
-      </w:r>
-      <w:r>
-        <w:t>&lt;bt&gt;</w:t>
+        <w:t xml:space="preserve">Todas as mulheres do círculo haviam trazido seu próprio ramo de abeto, e eu levara o jeito do Polo Norte de amarrá-lo, o qual Olivia jurara roubar de mim antes do Natal. Prendi o arame à armação lentamente, para que todas pudessem acompanhar. Só então alcancei o primeiro punhado de abeto. O cheiro subiu frio e verde, forte o bastante para desentupir a cabeça. Preencheu a sala da frente da </w:t>
+      </w:r>
+      <w:r>
+        <w:t xml:space="preserve"/>
       </w:r>
       <w:r>
         <w:t>Yarn Tales</w:t>
       </w:r>
       <w:r>
-        <w:t>&lt;/bt&gt;</w:t>
-      </w:r>
-      <w:r>
-        <w:t xml:space="preserve"> como a lã da própria loja jamais conseguiria. Sentei-me ali com seiva nos dedos e uma armação nua no colo, uma de sete mulheres curvadas sobre o mesmo trabalho. Há maneiras piores de passar a primeira manhã livre de novembro.</w:t>
-      </w:r>
-    </w:p>
-    <w:p/>
-    <w:p>
-      <w:r>
-        <w:t>A neve caíra durante a noite. Não a neve precoce de outubro, que sumia logo numa sequência de dias amenos. Neve de verdade. Daquela de temporada profunda que começara no Dia das Bruxas e duraria até a primavera. Ela cobria a Evergreen Avenue agora com uns bons quinze centímetros limpos, rangendo sob os sapatos toda vez que alguém entrava batendo as botas. No fim de semana, as lojas haviam trocado seus esqueletos e abóboras de Halloween por pés de milho e perus de papel, embora as abóboras simples continuassem nas soleiras, firmes até o Dia de Ação de Graças. A avenida silenciara depois do Dia das Bruxas, na calmaria que antecede o longo e brilhante empurrão rumo ao Natal.</w:t>
-      </w:r>
-    </w:p>
-    <w:p/>
-    <w:p>
-      <w:r>
-        <w:t>— Vai mais devagar — disse Olivia, inclinando-se da cadeira ao lado. — Não consigo roubar se não consigo ver.</w:t>
-      </w:r>
-    </w:p>
-    <w:p/>
-    <w:p>
-      <w:r>
-        <w:t xml:space="preserve">Desacelerei por causa dela. Coloquei três raminhos contra a armação, prendi-os com duas voltas de arame e posicionei o maço seguinte por cima do primeiro, de modo a esconder a amarra. </w:t>
+        <w:t xml:space="preserve"> de um jeit</w:t>
+      </w:r>
+      <w:r>
+        <w:t xml:space="preserve">o que a própria lã da loja nunca conseguia de verdade. Sentei-me ali com seiva nos dedos e uma armação nua no colo, uma das sete mulheres curvadas sobre o mesmo trabalho. Há maneiras piores de passar a primeira manhã livre de novembro.</w:t>
+      </w:r>
+    </w:p>
+    <w:p/>
+    <w:p>
+      <w:r>
+        <w:t xml:space="preserve">A neve caíra durante a noite. Não aquela neve precoce de outubro, que logo sumira numa sequência de dias amenos. Neve de verdade. Daquela típica do inverno, que começara no Halloween e duraria até a primavera. Agora ela cobria a Avenida Evergreen numa boa e limpa camada de quinze centímetros, rangendo sob os sapatos quando alguém entrava batendo as solas. No fim de semana, as lojas haviam trocado seus esqueletos e abóboras esculpidas por pés de milho e perus de papel, embora as abóboras lisas continuassem nos degraus da entrada, firmes até o Dia de Ação de Graças. A avenida silenciara depois do Halloween, na calmaria que antecede a longa e brilhante arrancada rumo ao Natal.</w:t>
+      </w:r>
+    </w:p>
+    <w:p/>
+    <w:p>
+      <w:r>
+        <w:t xml:space="preserve">— Vai mais devagar — disse Olivia, debruçando-se da cadeira ao lado. — Não consigo roubar se não consigo ver.</w:t>
+      </w:r>
+    </w:p>
+    <w:p/>
+    <w:p>
+      <w:r>
+        <w:t xml:space="preserve">Diminuí o ritmo por causa dela. Coloquei três raminhos contra a armação, prendi-os com duas voltas de arame e pus o maço seguinte sobre o primeiro de forma que escondesse a amarra.</w:t>
       </w:r>
     </w:p>
     <w:p/>
@@ -5341,85 +5340,85 @@
     <w:p/>
     <w:p>
       <w:r>
-        <w:t xml:space="preserve">Olivia fez o mesmo na própria armação, com capricho e rapidez, e ergueu as duas lado a lado. </w:t>
-      </w:r>
-    </w:p>
-    <w:p/>
-    <w:p>
-      <w:r>
-        <w:t>— O meu ficou igualzinho ao seu.</w:t>
-      </w:r>
-    </w:p>
-    <w:p/>
-    <w:p>
-      <w:r>
-        <w:t>— Bem parecido.</w:t>
-      </w:r>
-    </w:p>
-    <w:p/>
-    <w:p>
-      <w:r>
-        <w:t>— Então cadê o Polo Norte nisso?</w:t>
-      </w:r>
-    </w:p>
-    <w:p/>
-    <w:p>
-      <w:r>
-        <w:t>— Nos pulsos — respondi, e ela franziu o cenho para as próprias mãos e tentou de novo.</w:t>
-      </w:r>
-    </w:p>
-    <w:p/>
-    <w:p>
-      <w:r>
-        <w:t xml:space="preserve">Dot soltou sua risada curta e seca do outro lado do círculo, sem levantar os olhos da própria guirlanda, que já tinha quase o dobro do tamanho de qualquer outra e era duas vezes mais densa. </w:t>
-      </w:r>
-    </w:p>
-    <w:p/>
-    <w:p>
-      <w:r>
-        <w:t xml:space="preserve">— Ela anda atrás do seu truque desde o dia em que você pôs os pés aqui. Foi atrás do meu em mil novecentos e oitenta e pouco. </w:t>
-      </w:r>
-    </w:p>
-    <w:p/>
-    <w:p>
-      <w:r>
-        <w:t>Dot era troncuda, grisalha e dizia muita coisa com pouquíssimas palavras. Fazia guirlandas naquela loja havia décadas. Isso transparecia em suas mãos. Elas nunca paravam e nunca vacilavam.</w:t>
-      </w:r>
-    </w:p>
-    <w:p/>
-    <w:p>
-      <w:r>
-        <w:t xml:space="preserve">Estávamos todas lá naquela manhã. O círculo inteiro, quando ninguém estava de cama com um resfriado ou cuidando de netos. Olivia na ponta, na sua própria loja, meadas de lã empilhadas atrás dela em todas as cores que um inverno pudesse desejar. Dot ao lado dela, direta e veloz. Depois Claire Bennett, que escrevia para o </w:t>
-      </w:r>
-      <w:r>
-        <w:t>&lt;bt&gt;</w:t>
+        <w:t xml:space="preserve">Olivia fez o mesmo na própria armação, caprichosa e rápida, e ergueu as duas lado a lado.</w:t>
+      </w:r>
+    </w:p>
+    <w:p/>
+    <w:p>
+      <w:r>
+        <w:t xml:space="preserve">— A minha está igualzinha à sua.</w:t>
+      </w:r>
+    </w:p>
+    <w:p/>
+    <w:p>
+      <w:r>
+        <w:t xml:space="preserve">— Quase.</w:t>
+      </w:r>
+    </w:p>
+    <w:p/>
+    <w:p>
+      <w:r>
+        <w:t xml:space="preserve">— Então onde é que entra o Polo Norte nisso?</w:t>
+      </w:r>
+    </w:p>
+    <w:p/>
+    <w:p>
+      <w:r>
+        <w:t xml:space="preserve">— Nos pulsos — respondi, e ela franziu a testa para as próprias mãos e tentou de novo.</w:t>
+      </w:r>
+    </w:p>
+    <w:p/>
+    <w:p>
+      <w:r>
+        <w:t xml:space="preserve">Dot soltou aquela risada curta e seca de longe no círculo, sem erguer os olhos da própria guirlanda, que já tinha uma vez e meia o tamanho da de qualquer outra pessoa e o dobro da densidade.</w:t>
+      </w:r>
+    </w:p>
+    <w:p/>
+    <w:p>
+      <w:r>
+        <w:t xml:space="preserve">— Ela está atrás do seu truque desde o dia em que você pôs os pés aqui. Ela estava atrás do meu em mil novecentos e lá vai fumaça.</w:t>
+      </w:r>
+    </w:p>
+    <w:p/>
+    <w:p>
+      <w:r>
+        <w:t xml:space="preserve">Dot era robusta, grisalha e dizia muito com pouquíssimas palavras. Fazia coroas naquela loja havia décadas. Dava para ver em suas mãos. Elas nunca paravam e nunca erravam o passo.</w:t>
+      </w:r>
+    </w:p>
+    <w:p/>
+    <w:p>
+      <w:r>
+        <w:t xml:space="preserve">Estávamos todas lá naquela manhã. O círculo inteiro, quando ninguém estava de cama com resfriado ou cuidando de netos. Olivia à cabeceira em sua própria loja, meadas de lã empilhadas atrás dela em todas as cores que um inverno pudesse desejar. Dot ao lado dela, simples e ágil. Depois, Claire Bennett, que escrevia para o </w:t>
+      </w:r>
+      <w:r>
+        <w:t xml:space="preserve"/>
       </w:r>
       <w:r>
         <w:t>Gazette</w:t>
       </w:r>
       <w:r>
-        <w:t>&lt;/bt&gt;</w:t>
-      </w:r>
-      <w:r>
-        <w:t>, com um caderno aberto no braço da cadeira porque Claire nunca estava totalmente de folga. Ela vivia largando a guirlanda para anotar uma linha e a retomava um compasso atrasada em relação ao resto de nós. Ivy logo em seguida, cuja risada era tão escandalosa e pronta que a loja parecia mais clara por tê-la ali. De algum jeito, ela conseguira enfiar abeto no cabelo sem perceber. Martha, a professora aposentada, viúva havia tantos anos, com seu cãozinho branco Snowball adormecido encostado no seu tornozelo. A mão dela descia de vez em quando para lhe tocar a orelha. Para ter certeza de que ele ainda estava lá. E Ellie, gentil e sem pressa, que era voluntária no hospital três dias por semana. Ela levava essa mesma firme brandura a uma armação de arame. Sua guirlanda parecia menos fabricada e mais cultivada.</w:t>
-      </w:r>
-    </w:p>
-    <w:p/>
-    <w:p>
-      <w:r>
-        <w:t>E Pip, que não fazia parte do círculo, mas ficaria profundamente ofendida se fosse deixada de fora de qualquer contagem de quem estava presente. Ela se instalara debaixo da janela da frente na única mancha de sol fraco de novembro, num ninho que fizera com uma meada caída de lã vermelha que Olivia, notei, não tentara recuperar com muito afinco. Deitara-se ali, reluzente e satisfeita, com um olho meio aberto acompanhando os procedimentos. Qualquer coisa que reluzisse, particularmente. E havia bastante coisa reluzindo. Olivia tinha um pote de pinhas douradas sobre a mesa, um carretel de fita dourada ao lado. Pip já havia levado uma bronca por causa de ambos. Duas vezes.</w:t>
-      </w:r>
-    </w:p>
-    <w:p/>
-    <w:p>
-      <w:r>
-        <w:t>— Agora, o truque com as pinhas — eu disse, erguendo uma —, é passar o arame antes de encaixá-las, senão elas despencam de vez em você no Ano Novo e você vai ficar achando pinhas douradas no sofá até a primavera... Pip. Pip, estou te vendo. Isso não é para você.</w:t>
-      </w:r>
-    </w:p>
-    <w:p/>
-    <w:p>
-      <w:r>
-        <w:t>Pip se levantara e começara uma descida lenta e casual pelo assoalho em direção à fita dourada, com o desinteresse estudado de uma criatura fingindo ir a inteiramente outro lugar. Ela parou. Olhou para o teto. Sentou-se ali mesmo, como se aquele tivesse sido o plano dela o tempo todo.</w:t>
+        <w:t xml:space="preserve"/>
+      </w:r>
+      <w:r>
+        <w:t xml:space="preserve">, com um caderno aberto no braço da cadeira porque Claire nunca estava totalmente de folga. Ela vivia largando a guirlanda para anotar uma linha e a retomava um tempo atrasada em relação ao resto de nós. Ivy logo em seguida, cuja risada era tão grande e tão pronta que a loja parecia mais iluminada só por tê-la ali. De algum jeito, ela tinha conseguido enfiar abeto no cabelo sem perceber. Martha, a professora aposentada, viúva havia muitos anos, com seu cãozinho branco Snowball dormindo contra seu tornozelo. A mão dela descia de vez em quando para lhe acariciar a orelha. Só para ter certeza de que ele ainda estava lá. E Ellie, bondosa e sem pressa, que trabalhava como voluntária no hospital três dias por semana. Ela levava a mesma ternura firme para uma armação de arame. A guirlanda dela parecia menos feita e mais cultivada.</w:t>
+      </w:r>
+    </w:p>
+    <w:p/>
+    <w:p>
+      <w:r>
+        <w:t xml:space="preserve">E Pip, que não pertencia ao círculo, mas ficaria profundamente ofendida se fosse esquecida em qualquer contagem de quem estava presente. Ela se instalara sob a janela da frente na única faixa de sol fraco de novembro, num ninho que havia construído com uma meada caída de lã vermelha que Olivia, notei, não tentara recuperar com muito afinco. Ela jazia ali, reluzente e contente, com um olho meio aberto nos acontecimentos. Principalmente em tudo o que reluzia. E havia bastante coisa reluzindo. Olivia tinha um pote de pinhas douradas sobre a mesa, um carretel de fita dourada ao lado. Pip já havia levado uma bronca a respeito de ambos. Duas vezes.</w:t>
+      </w:r>
+    </w:p>
+    <w:p/>
+    <w:p>
+      <w:r>
+        <w:t xml:space="preserve">— Agora, o segredo das pinhas — disse eu, erguendo uma —, é passar o arame antes de encaixá-las, senão elas caem direto logo no Ano Novo e você vai ficar achando pinhas douradas no sofá até a primavera… Pip. Pip, eu estou vendo você. Isso não é para você.</w:t>
+      </w:r>
+    </w:p>
+    <w:p/>
+    <w:p>
+      <w:r>
+        <w:t xml:space="preserve">Pip se levantara e começara um deslocamento lento e casual pelo assoalho em direção à fita dourada, com a indiferença estudada de uma criatura fingindo ir a outro lugar inteiramente diferente. Ela parou. Olhou para o teto. Sentou-se onde estava, como se aquele tivesse sido o plano dela o tempo todo.</w:t>
       </w:r>
     </w:p>
     <w:p/>
@@ -5431,199 +5430,199 @@
     <w:p/>
     <w:p>
       <w:r>
-        <w:t>— Ela tem muita vergonha — retruquei. — Ela simplesmente a guarda para ocasiões em que isso lhe traga alguma vantagem. O que não é o caso agora. — Lancei a Pip aquele olhar que significa "não tirei os olhos de você", e ela me devolveu o que significa "não parei de cobiçar a fita", e nós nos entendemos. Voltei às minhas escamas de abeto.</w:t>
-      </w:r>
-    </w:p>
-    <w:p/>
-    <w:p>
-      <w:r>
-        <w:t>Foi então que me ocorreu, enquanto ajeitava os raminhos uns sobre os outros, o quão longe eu havia viajado para estar sentada ali. Não os quilômetros. Havia muitos deles, mas eu não me referia aos quilômetros. Não muito tempo atrás, eu fora a recém-chegada em Frost Falls. A mulher do Polo Norte com o marido famoso e o pinguim esquisito. As pessoas haviam sido gentis comigo do jeito que uma cidade é gentil com uma hóspede, quer dizer, abriram espaço e ficaram observando o que eu faria com ele. E agora Olivia estava tentando roubar meu jeito de amarrar uma guirlanda. O cachorro de Martha dormia encostado na minha cadeira com a mesma naturalidade que na dela. Ninguém mais me explicava nada. Supunha-se que eu já sabia. Eu conquistara aquilo rapidamente ao longo de um outono rigoroso, de um cachorro perdido e de uma cápsula do tempo.</w:t>
-      </w:r>
-    </w:p>
-    <w:p/>
-    <w:p>
-      <w:r>
-        <w:t>A sineta sobre a porta tocou, uma lufada de ar frio invadiu o ambiente e, logo atrás dela, num estardalhaço caloroso, apareceu Greta.</w:t>
-      </w:r>
-    </w:p>
-    <w:p/>
-    <w:p>
-      <w:r>
-        <w:t xml:space="preserve">— Ninguém se levante — anunciou ela, e ninguém demonstrara a menor intenção de fazê-lo. Ela depositou uma caixa de padaria do tamanho de uma chapeleira sobre a mesa, entre as pinhas e a fita, e apoiou os punhos na cintura para nos inspecionar. Greta era dona da </w:t>
-      </w:r>
-      <w:r>
-        <w:t>&lt;bt&gt;</w:t>
-      </w:r>
-      <w:r>
-        <w:t>The Holly Jolly Bakery</w:t>
-      </w:r>
-      <w:r>
-        <w:t>&lt;/bt&gt;</w:t>
-      </w:r>
-      <w:r>
-        <w:t xml:space="preserve"> ali na avenida, e tinha o formato de seus próprios rosca-doces, redonda, calorosa e polvilhada de ponta a ponta. Naquela manhã, seu avental estava cheio de farinha que ela nem se dera ao trabalho de escovar. — Tirei uma fornada de cupcakes de chocolate com nozes do forno há nem uma hora e disse a mim mesma: Greta, quem é que está sentada numa loja fria se mantendo útil esta manhã? E a resposta foi todas vocês, então tomem.</w:t>
-      </w:r>
-    </w:p>
-    <w:p/>
-    <w:p>
-      <w:r>
-        <w:t>— Greta, você nos mima — disse Ellie.</w:t>
-      </w:r>
-    </w:p>
-    <w:p/>
-    <w:p>
-      <w:r>
-        <w:t>— Alguém tem que fazê-lo. Vocês não vão fazer isso por si mesmas. — Ela já estava erguendo a tampa. O cheiro escapou e misturou-se ao abeto no centro da sala, chocolate, nozes e açúcar mascavo sobrepostos ao pinho verde e gelado. Era, pensei, o mais próximo do cheiro da temporada vindoura que eu conhecia. — E tem biscoitinhos de gengibre no fundo, então cuidado para não pegarem só os cupcakes e deixarem os biscoitos, Dot, eu vi você fazer isso lá no Grêmio e não esqueci.</w:t>
-      </w:r>
-    </w:p>
-    <w:p/>
-    <w:p>
-      <w:r>
-        <w:t xml:space="preserve">— Aquilo foi uma vez só — disse Dot —, e os cupcakes estavam ótimos. </w:t>
-      </w:r>
-    </w:p>
-    <w:p/>
-    <w:p>
-      <w:r>
-        <w:t>Greta apontou para ela um dedo enfarinhado em sinal de triunfo e começou a distribuir os cupcakes em guardanapos de papel.</w:t>
-      </w:r>
-    </w:p>
-    <w:p/>
-    <w:p>
-      <w:r>
-        <w:t>Ela me empurrou um cupcake antes que eu pedisse, e outro para Claire, que protestou e acabou aceitando. Ficou plantada sobre Martha até que esta prometeu comer o seu. E só quando todas tinham um é que pegou o seu próprio. Comeu-o de pé, observando-nos saboreá-lo.</w:t>
-      </w:r>
-    </w:p>
-    <w:p/>
-    <w:p>
-      <w:r>
-        <w:t>— Por que estão todas fazendo guirlandas? — perguntou ela, acenando com a cabeça para as nossas armações de boca cheia.</w:t>
-      </w:r>
-    </w:p>
-    <w:p/>
-    <w:p>
-      <w:r>
-        <w:t>— Guirlandas de porta para as lojas — explicou Olivia. — Elas pagam o que quiserem, e cada centavo vai para o fundo do telhado da Sociedade Histórica. A da Ivy é para a igreja e a da Ellie é para o hospital. Essas duas nós doamos.</w:t>
-      </w:r>
-    </w:p>
-    <w:p/>
-    <w:p>
-      <w:r>
-        <w:t>Atiramo-nos ao trabalho então para valer, oito mulheres, uma caixa de cupcakes, um pinguim e um cão adormecido. A conversa ia e vinha no meio do serviço, como convém a conversas de círculo, com as notinhas de uma manhã inteira contidas nos espaços entre os raminhos amarrados. A filha de Ivy arrumara um emprego novo em Concord. Claire publicaria na quinta-feira um artigo sobre o cronograma dos limpa-neves que nos jurou fielmente ser mais interessante do que parecia. Martha disse que os dias estavam encurtando tão rápido agora que Emma quase ia buscar Snowball já no escuro, e eu pedi que mandasse um abraço carinhoso à menina. Martha disse que Emma sempre perguntava por Pip. E Pip, ouvindo seu nome e tomando-o corretamente como elogio, eriçou as penas e pareceu vaidosa.</w:t>
-      </w:r>
-    </w:p>
-    <w:p/>
-    <w:p>
-      <w:r>
-        <w:t>Foi Claire quem puxou o assunto da loja, porque cabia a Claire notar que algo havia mudado e ao resto de nós apenas fofocar sobre isso depois.</w:t>
-      </w:r>
-    </w:p>
-    <w:p/>
-    <w:p>
-      <w:r>
-        <w:t>— Alguém sabe o que vai entrar no antigo ponto dos Fenwick? — perguntou ela, sem levantar os olhos. — Aquele vazio, depois da farmácia. Alguém cobriu as vidraças com papel.</w:t>
-      </w:r>
-    </w:p>
-    <w:p/>
-    <w:p>
-      <w:r>
-        <w:t xml:space="preserve">Isso desviou a atenção do círculo do arame. O antigo ponto dos Fenwick estava vazio há um bom ano, com janelas escuras no fim de um quarteirão iluminado. Era daquelas lacunas numa fileira de lojas que as pessoas aprendem a não olhar para não sentirem uma pontada de pena. </w:t>
-      </w:r>
-    </w:p>
-    <w:p/>
-    <w:p>
-      <w:r>
-        <w:t>— Cobriram com o quê? — perguntou Dot.</w:t>
-      </w:r>
-    </w:p>
-    <w:p/>
-    <w:p>
-      <w:r>
-        <w:t>— Papel pardo, por dentro do vidro. Do jeito que a gente faz quando está montando um ponto e não quer a cidade fiscalizando. — Claire deu de ombros. — Sem placa. Sem nome no quadro de alvarás também, eu conferi. Mas tem uma caçamba de entulho no beco e uma van esteve lá no sábado, e a gente não aluga caçamba a não ser que esteja limpando o espaço.</w:t>
-      </w:r>
-    </w:p>
-    <w:p/>
-    <w:p>
-      <w:r>
-        <w:t>— Ora — disse Ivy, com satisfação —, alguma coisa vai abrir. Já estava na hora. Uma loja escura é uma vergonha para a rua. — Houve um murmúrio geral de concordância, porque o povo numa cidade como Frost Falls encara um ponto comercial vazio como um pequeno luto pessoal e um novo como um pequeno presente pessoal.</w:t>
-      </w:r>
-    </w:p>
-    <w:p/>
-    <w:p>
-      <w:r>
-        <w:t>Virei um raminho de abeto entre meus dedos pegajosos de seiva e senti, sem nenhuma razão que pudesse nomear ao círculo, uma leve e fresca picada de curiosidade na nuca. Guardei-a, do jeito que aprendi ao longo de muitos anos a guardar as coisas que ainda não significam nada, para o caso de virem a significar.</w:t>
-      </w:r>
-    </w:p>
-    <w:p/>
-    <w:p>
-      <w:r>
-        <w:t xml:space="preserve">— Bem, seja quem for — disse Greta confortavelmente, recolhendo os guardanapos —, vai precisar comer como qualquer outro. Vou levar uma torta para eles no dia da inauguração. </w:t>
-      </w:r>
-    </w:p>
-    <w:p/>
-    <w:p>
-      <w:r>
-        <w:t>Foi Ellie, que tinha ido até a janela para sacudir os farelos de abeto da manga, quem viu o boneco de neve.</w:t>
-      </w:r>
-    </w:p>
-    <w:p/>
-    <w:p>
-      <w:r>
-        <w:t>— Ora, que estranho — disse ela, com seu jeito pacato, e algo nessa mansidão fez com que todas nós levantássemos os olhos. — Os bonecos de neve das crianças não estavam todos virados para a estrada ontem?</w:t>
-      </w:r>
-    </w:p>
-    <w:p/>
-    <w:p>
-      <w:r>
-        <w:t xml:space="preserve">A praça ficava em frente à </w:t>
-      </w:r>
-      <w:r>
-        <w:t>&lt;bt&gt;</w:t>
+        <w:t xml:space="preserve">— Ela tem muita vergonha — retruquei. — Simplesmente guarda para ocasiões em que isso vá lhe servir para alguma coisa. O que não é o caso agora.</w:t>
+      </w:r>
+    </w:p>
+    <w:p/>
+    <w:p>
+      <w:r>
+        <w:t xml:space="preserve">Foi então que me ocorreu, enquanto ajeitava os raminhos uns sobre os outros, o quão longe eu havia viajado para estar sentada ali. Não em quilômetros. Foram muitos, mas eu não me referia aos quilômetros. Não muito tempo atrás, eu tinha sido a recém-chegada em Frost Falls. A mulher do Polo Norte com o marido famoso e o pinguim mais esquisito. As pessoas haviam sido gentis comigo do jeito que uma cidade é gentil com uma hóspede, quer dizer, abriram espaço e ficaram observando o que eu faria com ele. E agora Olivia estava tentando roubar meu jeito de amarrar uma guirlanda. O cachorro de Martha dormia contra a minha cadeira com a mesma naturalidade que contra a dela. Ninguém mais me explicava nada. Supunha-se que eu já sabia. Eu havia conquistado aquilo rapidamente ao longo de um outono rigoroso, de um cachorro perdido e de uma cápsula do tempo.</w:t>
+      </w:r>
+    </w:p>
+    <w:p/>
+    <w:p>
+      <w:r>
+        <w:t xml:space="preserve">A sineta sobre a porta tocou, uma lufada de ar frio entrou e, logo atrás dela, num grande ímpeto caloroso, veio Greta.</w:t>
+      </w:r>
+    </w:p>
+    <w:p/>
+    <w:p>
+      <w:r>
+        <w:t xml:space="preserve">— Ninguém se levante — anunciou ela, o que nenhuma de nós dera o menor sinal de fazer. Ela colocou uma caixa de confeitaria do tamanho de uma chapeleira sobre a mesa, entre as pinhas e a fita, e pôs os punhos na cintura para nos inspecionar. Greta era dona da </w:t>
+      </w:r>
+      <w:r>
+        <w:t xml:space="preserve"/>
+      </w:r>
+      <w:r>
+        <w:t xml:space="preserve">Holly Jolly Bakery</w:t>
+      </w:r>
+      <w:r>
+        <w:t xml:space="preserve"/>
+      </w:r>
+      <w:r>
+        <w:t xml:space="preserve"> ali na avenida, e tinha o formato de suas próprias rosquinhas, redonda, calorosa e toda polvilhada de açúcar. Naquela manhã, havia farinha espalhada por todo o seu avental, a qual ela não se dera ao trabalho de escovar. — Tirei uma fornada de cupcakes de chocolate com nozes do forno há nem uma hora e disse a mim mesma: Greta, quem está sentada numa loja fria tentando ser útil esta manhã? E a resposta foi todas vocês, então tomem.</w:t>
+      </w:r>
+    </w:p>
+    <w:p/>
+    <w:p>
+      <w:r>
+        <w:t xml:space="preserve">— Greta, você mima a gente — disse Ellie.</w:t>
+      </w:r>
+    </w:p>
+    <w:p/>
+    <w:p>
+      <w:r>
+        <w:t xml:space="preserve">— Alguém tem que fazer isso. Vocês todas não vão fazer por si mesmas. — Ela já estava tirando a tampa. O cheiro escapou e misturou-se ao abeto no meio da sala, chocolate, noz-pecã e açúcar mascavo sobrepostos ao pinho verde e gelado. Era, pensei, o mais próximo do cheiro de toda a temporada vindoura que eu conhecia. — E tem biscoitos de gengibre no fundo, então cuidado para não pegarem só os cupcakes e deixarem os biscoitos, Dot, eu vi você fazer isso lá na Grange e não esqueci.</w:t>
+      </w:r>
+    </w:p>
+    <w:p/>
+    <w:p>
+      <w:r>
+        <w:t xml:space="preserve">— Aquilo foi uma vez só — disse Dot —, e os cupcakes eram muito bons.</w:t>
+      </w:r>
+    </w:p>
+    <w:p/>
+    <w:p>
+      <w:r>
+        <w:t xml:space="preserve">Greta apontou um dedo enfarinhado para ela em sinal de vitória e começou a distribuir os cupcakes em guardanapos de papel.</w:t>
+      </w:r>
+    </w:p>
+    <w:p/>
+    <w:p>
+      <w:r>
+        <w:t xml:space="preserve">Ela empurrou um cupcake para cima de mim antes que eu pedisse, e outro para Claire, que protestou e acabou aceitando. Ficou plantada sobre Martha até que esta prometeu comer o dela. E só quando todas tinham o seu foi que pegou um para si. Comeu em pé, observando-nos saborear.</w:t>
+      </w:r>
+    </w:p>
+    <w:p/>
+    <w:p>
+      <w:r>
+        <w:t xml:space="preserve">— Por que todas vocês estão fazendo guirlandas? — perguntou, acenando para as nossas armações, de boca cheia.</w:t>
+      </w:r>
+    </w:p>
+    <w:p/>
+    <w:p>
+      <w:r>
+        <w:t xml:space="preserve">— Guirlandas de porta para as lojas — disse Olivia. — Elas pagam o que quiserem, e cada centavo vai para o fundo do telhado da Sociedade Histórica. A da Ivy é para a igreja e a da Ellie é para o hospital. Essas duas nós doamos.</w:t>
+      </w:r>
+    </w:p>
+    <w:p/>
+    <w:p>
+      <w:r>
+        <w:t xml:space="preserve">Aí nos dedicamos ao trabalho a sério, oito mulheres, uma caixa de cupcakes, um pinguim e um cão adormecido. A conversa entrava e saía do afazer como costuma ser a conversa de círculo, todas as pequenas notícias de uma manhã contidas nos espaços entre prender os raminhos. A filha de Ivy conseguira um emprego novo em Concord. Claire publicaria na quinta-feira um artigo sobre o cronograma de limpa-neves que nos jurou ser mais interessante do que parecia. Martha disse que os dias estavam encurtando tão rápido agora que Emma vinha passear com Snowball quase no escuro, e eu pedi que mandasse um abraço à menina. Martha disse que Emma sempre perguntava por Pip. E Pip, ouvindo seu nome e tomando-o corretamente por elogio, eriçou as penas e pareceu satisfeita.</w:t>
+      </w:r>
+    </w:p>
+    <w:p/>
+    <w:p>
+      <w:r>
+        <w:t xml:space="preserve">Foi Claire quem puxou o assunto da loja, porque era da alçada de Claire notar que algo havia mudado e de todas as outras apenas fofocar sobre isso depois.</w:t>
+      </w:r>
+    </w:p>
+    <w:p/>
+    <w:p>
+      <w:r>
+        <w:t xml:space="preserve">— Alguém sabe o que vai entrar no antigo ponto dos Fenwick? — perguntou ela, sem erguer os olhos. — Aquele vazio, depois da farmácia. Alguém cobriu as janelas com papel.</w:t>
+      </w:r>
+    </w:p>
+    <w:p/>
+    <w:p>
+      <w:r>
+        <w:t xml:space="preserve">Isso desviou a atenção do círculo para longe do arame. O antigo ponto dos Fenwick estava vazio havia um bom ano, com as janelas escuras no fim de um quarteirão iluminado. Era o tipo de lacuna numa fileira de comércios que as pessoas aprendem a não olhar, para não sentir aquela pontada.</w:t>
+      </w:r>
+    </w:p>
+    <w:p/>
+    <w:p>
+      <w:r>
+        <w:t xml:space="preserve">— Cobriram como? — perguntou Dot.</w:t>
+      </w:r>
+    </w:p>
+    <w:p/>
+    <w:p>
+      <w:r>
+        <w:t xml:space="preserve">— Papel pardo, do lado de dentro do vidro. Do jeito que a gente faz quando está arrumando um lugar e não quer a cidade vigiando. — Claire deu de ombros. — Nenhuma placa. Nenhum nome no quadro de alvarás ainda, eu conferi. Mas há uma caçamba de entulho no beco e teve uma van lá no sábado, e ninguém aluga uma caçamba a não ser que esteja limpando um espaço.</w:t>
+      </w:r>
+    </w:p>
+    <w:p/>
+    <w:p>
+      <w:r>
+        <w:t xml:space="preserve">— Bem — disse Ivy, com satisfação —, alguma coisa vai abrir. Já estava na hora. Uma loja escura é uma vergonha numa rua. — Houve um murmúrio geral de concordância, porque o pessoal de uma cidade como Frost Falls encara uma vitrine vazia como um pequeno luto pessoal e uma nova como um pequeno presente pessoal.</w:t>
+      </w:r>
+    </w:p>
+    <w:p/>
+    <w:p>
+      <w:r>
+        <w:t xml:space="preserve">Virei um raminho de abeto entre meus dedos pegajosos de seiva e senti, sem nenhum motivo que eu pudesse nomear para o círculo, uma leve e fresca pontada de curiosidade na nuca. Guardei-a na memória, como aprendi ao longo de muitos anos a guardar as coisas que ainda não significam nada, para o caso de passarem a significar.</w:t>
+      </w:r>
+    </w:p>
+    <w:p/>
+    <w:p>
+      <w:r>
+        <w:t xml:space="preserve">— Bem, seja quem for — disse Greta confortavelmente, recolhendo os guardanapos —, vão precisar comer como qualquer outro. Vou levar uma torta para eles no dia da inauguração.</w:t>
+      </w:r>
+    </w:p>
+    <w:p/>
+    <w:p>
+      <w:r>
+        <w:t xml:space="preserve">Foi Ellie, que tinha ido até a janela para sacudir os pedacinhos de abeto da manga, quem viu o boneco de neve.</w:t>
+      </w:r>
+    </w:p>
+    <w:p/>
+    <w:p>
+      <w:r>
+        <w:t xml:space="preserve">— Ora, que estranho — disse ela, com seu jeito suave, e algo naquela suavidade fez todas nós levantarmos os olhos. — Os bonecos de neve das crianças não estavam todos virados para a estrada ontem?</w:t>
+      </w:r>
+    </w:p>
+    <w:p/>
+    <w:p>
+      <w:r>
+        <w:t xml:space="preserve">A praça gramada ficava em frente à </w:t>
+      </w:r>
+      <w:r>
+        <w:t xml:space="preserve"/>
       </w:r>
       <w:r>
         <w:t>Yarn Tales</w:t>
       </w:r>
       <w:r>
-        <w:t>&lt;/bt&gt;</w:t>
-      </w:r>
-      <w:r>
-        <w:t>, um gramado amplo e branco com o coreto numa extremidade e o memorial de guerra na outra. Os escolares tinham construído ali uma fileira de bonecos de neve durante a primeira neve decente. Três deles, gorduchos, tortos e coroados com o que quer que as crianças conseguissem juntar. Ontem, como Ellie dissera, eles estavam virados para a estrada, com olhos de carvão e feição hospitaleira, observando o tráfego passar como os bonecos de neve fazem. Eu mesma passara por eles na véspera. Estavam voltados para a rua.</w:t>
-      </w:r>
-    </w:p>
-    <w:p/>
-    <w:p>
-      <w:r>
-        <w:t>Naquela manhã, o do meio dera meia-volta por completo.</w:t>
-      </w:r>
-    </w:p>
-    <w:p/>
-    <w:p>
-      <w:r>
-        <w:t>Ficava agora de costas para a estrada, com os braços de graveto abertos para os lados, a carinha informe de carvão apontada cruzando o gramado em direção às lojas. Na direção, se quiséssemos ser exatos, da ponta distante do quarteirão onde o antigo ponto dos Fenwick repousava atrás do papel pardo. Os outros dois ainda encaravam a rua. Só o do meio se movera. Virara-se de corpo inteiro sobre a base para olhar para o outro lado. E não havia uma única pegada por perto. A neve ao redor dos três estava lisa e intacta. Quinze centímetros de neve limpa da noite anterior, com nada escrito nela além das longas sombras azuis do corrimão do coreto.</w:t>
-      </w:r>
-    </w:p>
-    <w:p/>
-    <w:p>
-      <w:r>
-        <w:t>Aglomeramo-nos na janela, os cupcakes esquecidos, e olhamos.</w:t>
-      </w:r>
-    </w:p>
-    <w:p/>
-    <w:p>
-      <w:r>
-        <w:t>— Ideia de peça de alguém — decretou Dot. — Viraram aquilo de madrugada. Crianças.</w:t>
-      </w:r>
-    </w:p>
-    <w:p/>
-    <w:p>
-      <w:r>
-        <w:t>— Não há pegadas — disse Claire. — Como é que viraram sem deixar pegadas?</w:t>
-      </w:r>
-    </w:p>
-    <w:p/>
-    <w:p>
-      <w:r>
-        <w:t>— Varreram atrás de si mesmos. Ou o vento encobriu. É uma brincadeira. Uma criança de dedos frios sem nada melhor para fazer. Vai estar a fileira inteira virada até domingo, podem apostar, assim que os outros virem que dá para fazer.</w:t>
+        <w:t xml:space="preserve"/>
+      </w:r>
+      <w:r>
+        <w:t xml:space="preserve">, um largo descampado branco com o coreto numa extremidade e o memorial de guerra na outra. Os escolares haviam construído uma fileira de bonecos de neve ali durante a primeira neve boa. Três deles, gorduchos, tortos e coroados com o que as crianças conseguiram catar. Ontem, como Ellie dissera, eles estavam de frente para a estrada, com olhos de carvão e ar companheiro, observando o tráfego passar como os bonecos de neve fazem. Eu mesma passara caminhando por eles na noitinha anterior. Estavam virados para a rua.</w:t>
+      </w:r>
+    </w:p>
+    <w:p/>
+    <w:p>
+      <w:r>
+        <w:t xml:space="preserve">Naquela manhã, o do meio dera meia-volta completa.</w:t>
+      </w:r>
+    </w:p>
+    <w:p/>
+    <w:p>
+      <w:r>
+        <w:t xml:space="preserve">Agora ele estava de costas para a estrada, braços de graveto esticados para os lados, a carinha informe de carvão apontando praça acima, em direção às lojas. Em direção, se quiséssemos ser precisos, à extremidade distante do quarteirão onde o antigo ponto dos Fenwick ficava atrás de seu papel pardo. Os outros dois ainda virados para a rua. Apenas o do meio se movera. Virado corporalmente sobre a própria base para olhar para o outro lado. E não havia uma única pegada por perto. A neve ao redor dos três estava lisa e intacta. Quinze centímetros de acúmulo fresco da noite anterior, sem nada impresso a não ser as longas sombras azuis da grade do coreto.</w:t>
+      </w:r>
+    </w:p>
+    <w:p/>
+    <w:p>
+      <w:r>
+        <w:t xml:space="preserve">Todas nos acotovelamos na janela, os cupcakes esquecidos, e olhamos.</w:t>
+      </w:r>
+    </w:p>
+    <w:p/>
+    <w:p>
+      <w:r>
+        <w:t xml:space="preserve">— Ideia de brincadeira de alguém — decretou Dot. — Viraram aquilo de madrugada. Crianças.</w:t>
+      </w:r>
+    </w:p>
+    <w:p/>
+    <w:p>
+      <w:r>
+        <w:t xml:space="preserve">— Não tem pegadas — disse Claire. — Como é que viraram sem deixar pegadas?</w:t>
+      </w:r>
+    </w:p>
+    <w:p/>
+    <w:p>
+      <w:r>
+        <w:t xml:space="preserve">— Varreram atrás de si mesmos. Ou o vento cobriu. É uma piada. Uma criança de dedos frios sem nada melhor para fazer. Vai estar a fileira inteira virada até domingo, escrevam o que eu digo, assim que os outros virem que dá para fazer.</w:t>
       </w:r>
     </w:p>
     <w:p/>
@@ -5635,25 +5634,25 @@
     <w:p/>
     <w:p>
       <w:r>
-        <w:t>E essa era a visão sensata, e o círculo a adotou, e alguém disse que as crianças de hoje em dia e outra pessoa disse que nunca nevava assim quando ela era menina, e a conversa seguiu adiante, como a conversa de círculo costuma fazer, e Ivy voltou para pegar outro biscoito de gengibre. Mas eu permaneci na janela um instante mais do que as outras, com a minha guirlanda semiacabada na mão. Olhei para aquele boneco de neve do meio virado para cima no quarteirão. Olhei para a neve lisa e intacta que nenhuma bota de brincalhão tocara. E não disse o que estava pensando.</w:t>
-      </w:r>
-    </w:p>
-    <w:p/>
-    <w:p>
-      <w:r>
-        <w:t>Porque eu conheço a diferença. Vivi tempo suficiente agora ao lado da magia do Natal. O bastante para conhecê-la nos ossos, clara como uma pegada na minha própria escada. Aquilo não fora uma criança de dedos frios. A magia andava solta em Frost Falls. Estava solta desde a nossa chegada, à cata de um lar. Meu marido estava construindo um para ela. Lenta e pacientemente em sua oficina, uma lareira para ela se acomodar, e ela se aproximava um pouco mais do fogo a cada dia. Mas ainda não estava acomodada. Continuava por aí na cidade à noite, quente, desajeitada e sem malícia nenhuma, fazendo as pequenas coisas impossíveis que a magia faz quando tem mais sentimento do que juízo. Transformando as luzes do festival de laranja em dourado. E agora, pelo visto, fazendo um boneco de neve infantil dar a volta no escuro para encarar seja lá o que houvesse atraído sua atenção errante.</w:t>
-      </w:r>
-    </w:p>
-    <w:p/>
-    <w:p>
-      <w:r>
-        <w:t>Desviei o olhar do boneco de neve voltado para o quarteirão em direção às janelas cobertas de papel pardo do antigo ponto dos Fenwick, exatamente para onde seus braços de graveto apontavam, e pensei que a magia, fosse o que fosse que se pudesse dizer dela, sempre tivera faro para o que importava antes de mim.</w:t>
-      </w:r>
-    </w:p>
-    <w:p/>
-    <w:p>
-      <w:r>
-        <w:t>Mais não disse nada disso ao círculo. Peguei um biscoito de gengibre, disse não a Pip quando ela cobiçou os farelos e voltei a me sentar para terminar minha guirlanda. Fixei o abeto com firmeza, raminho sobre raminho, todos apontando para o mesmo lado. Atrás de mim, uma achada estalou no fogão e as mulheres conversavam. A neve repousava brilhante na praça com um boneco de neve virado para o lado errado no meio dela. Algo estava começando. Confiei naquela picada fria na nuca, e ela permaneceu comigo a manhã inteira.</w:t>
+        <w:t xml:space="preserve">E essa era a opinião sensata, e o círculo a adotou, e alguém disse as crianças de hoje em dia e outra pessoa disse que nunca nevava assim quando eu era menina, e a conversa seguiu adiante, como a conversa de círculo costuma fazer, e Ivy voltou para pegar outro biscoito de gengibre. Mas eu permaneci na janela um instante mais do que as outras, com minha guirlanda semiacabada na mão. Olhei para aquele boneco de neve do meio voltado para cima, no quarteirão. Olhei para a neve lisa e intacta que nenhuma bota de brincalhão tocara. E não disse o que estava pensando.</w:t>
+      </w:r>
+    </w:p>
+    <w:p/>
+    <w:p>
+      <w:r>
+        <w:t xml:space="preserve">Porque eu conheço a diferença. Vivo há muito tempo junto à magia do Natal. O bastante para conhecê-la nos ossos, clara como uma pegada na minha própria escada. Aquilo não era uma criança de dedos frios. A magia estava solta em Frost Falls. Estava solta desde a nossa chegada, à procura de um lar. Meu marido estava construindo um. Lenta e pacientemente em sua oficina, uma lareira para ela se acomodar, e ela se aproximava um pouco mais do fogo a cada dia. Mas ainda não estava acomodada. Continuava lá fora na cidade à noite, calorosa, desajeitada e completamente destituída de maldade, fazendo as pequenas coisas impossíveis que a magia faz quando tem mais sentimento do que juízo. Transformando as luzes do festival de laranja em dourado. E agora, pelo visto, girando o boneco de neve de uma criança no escuro para encarar seja lá o que tivesse atraído sua atenção errante.</w:t>
+      </w:r>
+    </w:p>
+    <w:p/>
+    <w:p>
+      <w:r>
+        <w:t xml:space="preserve">Olhei do boneco de neve virado quarteirão acima, em direção às janelas cobertas de papel pardo do antigo ponto dos Fenwick, exatamente para onde seus braços de graveto apontavam, e pensei que a magia, dissessem dela o que quisessem, sempre tivera faro para o que importava antes de mim.</w:t>
+      </w:r>
+    </w:p>
+    <w:p/>
+    <w:p>
+      <w:r>
+        <w:t xml:space="preserve">Mas não disse nada disso ao círculo. Peguei um biscoito de gengibre, disse não a Pip quando ela cobiçou as migalhas e me sentei de novo à minha guirlanda. Fixei o abeto, raminho sobre raminho, todos apontando para a mesma direção. Atrás de mim, um tronco estalava no fogão e as mulheres conversavam. A neve brilhava na praça com um boneco de neve virado para o lado errado no meio dela. Algo estava começando. Confiei naquele arrepio fresco na nuca, e ele permaneceu comigo a manhã inteira.</w:t>
       </w:r>
     </w:p>
     <w:p/>

</xml_diff>

<commit_message>
Proofcheck Inn Trouble Brazilian Portuguese: SIGNIFICANT (7 fixes)
Co-Authored-By: Claude Opus 5.5 <noreply@anthropic.com>
Claude-Session: https://claude.ai/code/session_012Cm8JxdqzjuttdUSdkQCUg
</commit_message>
<xml_diff>
--- a/translated/corrected/Inn Trouble - ASSEMBLED - FORMATTED_Brazilian Portuguese.docx
+++ b/translated/corrected/Inn Trouble - ASSEMBLED - FORMATTED_Brazilian Portuguese.docx
@@ -1030,7 +1030,7 @@
     <w:p/>
     <w:p>
       <w:r>
-        <w:t xml:space="preserve">Aquela noite, antes de deitar, fui à janela, como sempre fazia, para olhar a cidade se acomodando para a noite. Nosso chalé ficava um pouco afastado do resto, subindo o caminho, com o pasto e o formato escuro da oficina logo além, e então a cidade logo abaixo. A cidade estava iluminada.</w:t>
+        <w:t xml:space="preserve">Aquela noite, antes de deitar, fui à janela, como sempre fazia, para olhar a cidade se acomodando para a noite. Nosso chalé ficava um pouco afastado do resto, subindo o caminho, com o piquete e o formato escuro da oficina logo além, e então a cidade logo abaixo. A cidade estava iluminada.</w:t>
       </w:r>
     </w:p>
     <w:p/>
@@ -1114,7 +1114,7 @@
     <w:p/>
     <w:p>
       <w:r>
-        <w:t xml:space="preserve">Ficamos ali mais um pouco, observando a cidade dourada, e depois subimos para deitar. Fiquei acordada um bom tempo no escuro, segurando duas coisas ao mesmo tempo. Em algum lugar lá embaixo em Frost Falls, uma pessoa estivera entre as caixas dos Blackburn e encontrara um jeito de fechar a mão ao redor do pescoço de uma boa mulher por meio milhão de dólares. E lá além do pasto meu marido estava construindo uma surpresa cujo nome ele não dizia, enquanto as luzes se tornavam douradas por conta própria e a magia que havíamos trazido conosco saía pela escuridão à cata de um lugar para pousar.</w:t>
+        <w:t xml:space="preserve">Ficamos ali mais um pouco, observando a cidade dourada, e depois subimos para deitar. Fiquei acordada um bom tempo no escuro, segurando duas coisas ao mesmo tempo. Em algum lugar lá embaixo em Frost Falls, uma pessoa estivera entre as caixas dos Blackburn e encontrara um jeito de fechar a mão ao redor do pescoço de uma boa mulher por meio milhão de dólares. E lá além do piquete meu marido estava construindo uma surpresa cujo nome ele não dizia, enquanto as luzes se tornavam douradas por conta própria e a magia que havíamos trazido conosco saía pela escuridão à cata de um lugar para pousar.</w:t>
       </w:r>
     </w:p>
     <w:p/>
@@ -4505,7 +4505,7 @@
     <w:p/>
     <w:p>
       <w:r>
-        <w:t xml:space="preserve">— Vera — eu disse. — Theo cometeu o furto. Mas os bilhetes sabiam que a pousada havia sido comprada com o dinheiro do broche, e isso nunca esteve em nenhuma carta dos Blackburn. Isso é um registro de propriedade. Uma escritura. E a escritura desta pousada estava fora de sua gaveta na sua cesta de rearquivamento ontem de manhã, manuseada, na escrivaninha de uma mulher que me dissera duas vezes que nunca lê os registros que guarda nas costas. — Mantive a voz macia. — Ele cometeu o furto. A senhora tinha a escritura. E a senhora tinha as pernas, Vera. Ele não conseguiria cruzar esta cidade sem ser notado nem se sua vida dependesse disso, todo mundo conhece o Theo, todo mundo o para. Mas ninguém pisca para a secretária do prefeito dando um pulo na pousada durante o festival. Eu mesma passei pela senhora nos degraus naquela manhã, com os passes de estacionamento. Ele não teria conseguido fazer isso sozinho. Precisava de alguém que pudesse se mover pela cidade sem ser visto. Essa pessoa era a senhora.</w:t>
+        <w:t xml:space="preserve">— Vera — eu disse. — Theo tinha o roubo. Mas os bilhetes sabiam que a pousada havia sido comprada com o dinheiro do broche, e isso nunca esteve em nenhuma carta dos Blackburn. Isso é um registro de propriedade. Uma escritura. E a escritura desta pousada estava fora de sua gaveta na sua cesta de rearquivamento ontem de manhã, manuseada, na escrivaninha de uma mulher que me dissera duas vezes que nunca lê os registros que ficam atrás dela. — Mantive a voz macia. — Ele tinha o roubo. A senhora tinha a escritura. E a senhora tinha as pernas, Vera. Ele não conseguiria cruzar esta cidade sem ser notado nem se sua vida dependesse disso, todo mundo conhece o Theo, todo mundo o para. Mas ninguém pisca para a secretária do prefeito dando um pulo na pousada durante o festival. Eu mesma passei pela senhora nos degraus naquela manhã, com os passes de estacionamento. Ele não teria conseguido fazer isso sozinho. Precisava de alguém que pudesse se mover pela cidade sem ser visto. Essa pessoa era a senhora.</w:t>
       </w:r>
     </w:p>
     <w:p/>
@@ -4755,7 +4755,7 @@
     <w:p/>
     <w:p>
       <w:r>
-        <w:t>Eu achava que Fiona iria querer enterrar o segredo mais fundo do que nunca agora que ele quase a destruíra. Eu deveria saber melhor. Em vez disso, ela fez a coisa mais corajosa que vi alguém fazer em toda aquela história, mais corajosa do que encarar Theo na salinha de estar. Ela decidiu contar aquilo.</w:t>
+        <w:t>Eu achava que Fiona iria querer enterrar o segredo mais fundo do que nunca agora que ele quase a destruíra. Eu devia ter imaginado. Em vez disso, ela fez a coisa mais corajosa que vi alguém fazer em toda aquela história, mais corajosa do que encarar Theo na salinha de estar. Ela decidiu contar aquilo.</w:t>
       </w:r>
     </w:p>
     <w:p/>
@@ -5430,7 +5430,7 @@
     <w:p/>
     <w:p>
       <w:r>
-        <w:t xml:space="preserve">— Ela tem muita vergonha — retruquei. — Simplesmente guarda para ocasiões em que isso vá lhe servir para alguma coisa. O que não é o caso agora.</w:t>
+        <w:t xml:space="preserve">— Ela tem muita vergonha — retruquei. — Simplesmente guarda para ocasiões em que isso vá lhe servir para alguma coisa. O que não é o caso agora. Dei a Pip o olhar que significa não tirei os olhos de você, e ela me deu o olhar que significa não parei de querer a fita, e nos entendemos. Voltei às minhas escamas de abeto.</w:t>
       </w:r>
     </w:p>
     <w:p/>
@@ -5460,7 +5460,7 @@
         <w:t xml:space="preserve"/>
       </w:r>
       <w:r>
-        <w:t xml:space="preserve"> ali na avenida, e tinha o formato de suas próprias rosquinhas, redonda, calorosa e toda polvilhada de açúcar. Naquela manhã, havia farinha espalhada por todo o seu avental, a qual ela não se dera ao trabalho de escovar. — Tirei uma fornada de cupcakes de chocolate com nozes do forno há nem uma hora e disse a mim mesma: Greta, quem está sentada numa loja fria tentando ser útil esta manhã? E a resposta foi todas vocês, então tomem.</w:t>
+        <w:t xml:space="preserve"> ali na avenida, e tinha o formato de suas próprias rosquinhas, redonda, calorosa e toda polvilhada de açúcar. Naquela manhã, havia farinha espalhada por todo o seu avental, a qual ela não se dera ao trabalho de escovar. — Tirei uma fornada de cupcakes de chocolate com noz-pecã do forno há nem uma hora e disse a mim mesma: Greta, quem está sentada numa loja fria tentando ser útil esta manhã? E a resposta foi todas vocês, então tomem.</w:t>
       </w:r>
     </w:p>
     <w:p/>

</xml_diff>

<commit_message>
Proofcheck: apply cross-book excerpt follow-ups to 8 Inn Trouble editions; run complete
Co-Authored-By: Claude Opus 5.5 <noreply@anthropic.com>
Claude-Session: https://claude.ai/code/session_012Cm8JxdqzjuttdUSdkQCUg
</commit_message>
<xml_diff>
--- a/translated/corrected/Inn Trouble - ASSEMBLED - FORMATTED_Brazilian Portuguese.docx
+++ b/translated/corrected/Inn Trouble - ASSEMBLED - FORMATTED_Brazilian Portuguese.docx
@@ -5382,7 +5382,7 @@
     <w:p/>
     <w:p>
       <w:r>
-        <w:t xml:space="preserve">Dot era robusta, grisalha e dizia muito com pouquíssimas palavras. Fazia coroas naquela loja havia décadas. Dava para ver em suas mãos. Elas nunca paravam e nunca erravam o passo.</w:t>
+        <w:t xml:space="preserve">Dot era robusta, grisalha e dizia muito com pouquíssimas palavras. Fazia guirlandas naquela loja havia décadas. Dava para ver em suas mãos. Elas nunca paravam e nunca erravam o passo.</w:t>
       </w:r>
     </w:p>
     <w:p/>
@@ -5448,13 +5448,13 @@
     <w:p/>
     <w:p>
       <w:r>
-        <w:t xml:space="preserve">— Ninguém se levante — anunciou ela, o que nenhuma de nós dera o menor sinal de fazer. Ela colocou uma caixa de confeitaria do tamanho de uma chapeleira sobre a mesa, entre as pinhas e a fita, e pôs os punhos na cintura para nos inspecionar. Greta era dona da </w:t>
+        <w:t xml:space="preserve">— Ninguém se levante — anunciou ela, o que nenhuma de nós dera o menor sinal de fazer. Ela colocou uma caixa de padaria do tamanho de uma chapeleira sobre a mesa, entre as pinhas e a fita, e pôs os punhos na cintura para nos inspecionar. Greta era dona da padaria </w:t>
       </w:r>
       <w:r>
         <w:t xml:space="preserve"/>
       </w:r>
       <w:r>
-        <w:t xml:space="preserve">Holly Jolly Bakery</w:t>
+        <w:t xml:space="preserve">Holly Jolly</w:t>
       </w:r>
       <w:r>
         <w:t xml:space="preserve"/>

</xml_diff>

<commit_message>
Full proofcheck Inn Trouble Brazilian Portuguese: SIGNIFICANT (37 edits)
Co-Authored-By: Claude Opus 5.5 <noreply@anthropic.com>
Claude-Session: https://claude.ai/code/session_012Cm8JxdqzjuttdUSdkQCUg
</commit_message>
<xml_diff>
--- a/translated/corrected/Inn Trouble - ASSEMBLED - FORMATTED_Brazilian Portuguese.docx
+++ b/translated/corrected/Inn Trouble - ASSEMBLED - FORMATTED_Brazilian Portuguese.docx
@@ -734,7 +734,7 @@
     <w:p/>
     <w:p>
       <w:r>
-        <w:t>— Fiona. Olhe para mim. O que sua bisavó fez ou deixou de fazer, cem anos atrás, em um inverno rigoroso que nem podemos começar a imaginar, não é quem você é. Você dedicou todo o seu coração a este lugar e a esta cidade. É isso que as pessoas veem. É isso que é verdade a seu respeito.</w:t>
+        <w:t xml:space="preserve">— Fiona. Me escute. O que sua bisavó fez ou deixou de fazer, cem anos atrás, em um inverno rigoroso que nem podemos começar a imaginar, não é quem você é. Você dedicou todo o seu coração a este lugar e a esta cidade. É isso que as pessoas veem. É isso que é verdade a seu respeito.</w:t>
       </w:r>
     </w:p>
     <w:p/>
@@ -1226,7 +1226,7 @@
     </w:p>
     <w:p>
       <w:r>
-        <w:t>— Você continua atrás do seu broche — eu disse.</w:t>
+        <w:t xml:space="preserve">— O senhor continua atrás do seu broche — eu disse.</w:t>
       </w:r>
     </w:p>
     <w:p>
@@ -1311,7 +1311,7 @@
     </w:p>
     <w:p>
       <w:r>
-        <w:t>As cartas estiveram ali. O papel esteve ali.</w:t>
+        <w:t xml:space="preserve">As cartas estiveram ali. O papel estava ali.</w:t>
       </w:r>
     </w:p>
     <w:p>
@@ -1454,7 +1454,7 @@
     </w:p>
     <w:p>
       <w:r>
-        <w:t>Eu desconfiava dele. Um homem tão desesperado, que passara as noites sozinho entre as caixas de Blackburn, que se levantara diante da cidade inteira para dizer que as cartas mais interessantes haviam sumido. Eu queria ter certeza, e me forcei a esperar.</w:t>
+        <w:t xml:space="preserve">Eu desconfiava dele. Um homem tão desesperado, que passara as noites sozinho entre as caixas dos Blackburn, que se levantara diante da cidade inteira para dizer que as cartas mais interessantes haviam sumido. Eu queria ter certeza, e me forcei a esperar.</w:t>
       </w:r>
     </w:p>
     <w:p>
@@ -1649,7 +1649,7 @@
     <w:p/>
     <w:p>
       <w:r>
-        <w:t>Mark, carregando uma mesa ao meu passar, encontrou meu olhar por cima da cabeça da filha, e o brilho em seus olhos era de agradecimento, direcionado tanto a mim quanto além de mim, a todo o mundo, do tipo que a pessoa dá quando já não consegue mais contê-lo dentro de si. Ele não disse nada. Apenas olhou para mim, olhou para Emma tagarelando sobre o cinturão de Orion, olhou para mim de novo e continuou carregando sua mesa.</w:t>
+        <w:t xml:space="preserve">Mark, carregando uma mesa ao passar por mim, encontrou meu olhar por cima da cabeça da filha, e o brilho em seus olhos era de agradecimento, direcionado tanto a mim quanto além de mim, a todo o mundo, do tipo que a pessoa dá quando já não consegue mais contê-lo dentro de si. Ele não disse nada. Apenas olhou para mim, olhou para Emma tagarelando sobre o cinturão de Orion, olhou para mim de novo e continuou carregando sua mesa.</w:t>
       </w:r>
     </w:p>
     <w:p/>
@@ -1731,7 +1731,7 @@
     <w:p/>
     <w:p>
       <w:r>
-        <w:t xml:space="preserve">Fui ver. Do meio da polpa de laranja úmida, na última semana de outubro, brotara um ramo de azevinho: três folhas escuras e brilhantes, de bordas afiadas e inconfundíveis, e entre elas três bagas vermelhas redondas como gotas de sangue, crescendo a partir de uma abóbora de Halloween arruinada na hora que se passara desde que Pip a rasgara.</w:t>
+        <w:t xml:space="preserve">Fui ver. Do meio da polpa alaranjada e úmida, na última semana de outubro, brotara um ramo de azevinho: três folhas escuras e brilhantes, de bordas afiadas e inconfundíveis, e entre elas três bagas vermelhas redondas como gotas de sangue, crescendo a partir de uma abóbora de Halloween arruinada na hora que se passara desde que Pip a rasgara.</w:t>
       </w:r>
     </w:p>
     <w:p/>
@@ -1777,7 +1777,7 @@
     <w:p/>
     <w:p>
       <w:r>
-        <w:t>— Nossa — concordei, cruzei os dedos sobre o coração e a vi fechar a mão em concha sobre o azevinho para escondê-lo do comitê atarefado, como se estivesse mantendo um pequeno e morno segredo vivo entre as palmas das mãos.</w:t>
+        <w:t xml:space="preserve">— Nossa — concordei, jurei com a mão no coração e a vi fechar a mão em concha sobre o azevinho para escondê-lo do comitê atarefado, como se estivesse mantendo um pequeno e morno segredo vivo entre as palmas das mãos.</w:t>
       </w:r>
     </w:p>
     <w:p/>
@@ -1824,7 +1824,7 @@
     <w:p/>
     <w:p>
       <w:r>
-        <w:t>Voltei à pousada dois dias depois, não para investigar nada, mas porque Fiona precisava de uma amiga mais do que de uma investigadora naquele momento, e eu estivera tão ocupada desempenhando o primeiro papel que quase me esquecera do segundo.</w:t>
+        <w:t xml:space="preserve">Voltei à pousada dois dias depois, não para investigar nada, mas porque Fiona precisava de uma amiga mais do que de uma investigadora naquele momento, e eu estivera tão ocupada sendo investigadora que quase me esquecera de ser amiga.</w:t>
       </w:r>
     </w:p>
     <w:p>
@@ -2064,7 +2064,7 @@
     <w:p/>
     <w:p>
       <w:r>
-        <w:t>— Essas também são dela — disse ele, pegando uma e virando-a contra a luz, e havia amor em suas mãos por aquilo mesmo agora. — Os suportes da varanda. Os últimos do pedido. Coloquei muito de mim naquele saguão este ano, sabe? A gente não consegue andar pela sala de estar da Fiona sem tocar em alguma coisa que eu fiz, ou ficar perto dela. — Ele colocou a estrela de volta. — Para mim, está ótimo. Um ferreiro gosta de deixar um lugar cheirando ao seu fogo.</w:t>
+        <w:t xml:space="preserve">— Essas também são dela — disse ele, pegando uma e virando-a contra a luz, e havia amor em suas mãos por aquilo mesmo agora. — Os suportes da varanda. Os últimos do pedido. Coloquei muito de mim naquele saguão este ano, sabe? A gente não consegue andar pela sala da frente da Fiona sem tocar em alguma coisa que eu fiz, ou ficar perto dela. — Ele colocou a estrela de volta. — Para mim, está ótimo. Um ferreiro gosta de deixar um lugar cheirando ao seu fogo.</w:t>
       </w:r>
     </w:p>
     <w:p/>
@@ -2141,7 +2141,7 @@
     <w:p/>
     <w:p>
       <w:r>
-        <w:t xml:space="preserve">— Sou pago para isso. — Ele disse isso com alegria, o que me deteve, pois eu já estava preparada para uma esquiva. — Pesquisa de espólio. Esse é o meu ganha-pão, Sra. Claus. Quando o último membro de uma linhagem de dinheiro antigo morre, ele deixa um emaranhado para trás, um nó de quem era dono do quê, quem devia o quê, para onde foi alguma coisa de valor, e alguém tem de sentar nas bibliotecas e desatar esse nó, e esse alguém sou eu. — Ele abriu as mãos sobre as caixas. — No momento, estou desatando um nó dos Blackburn. Havia uma joia na família, antigamente. Um broche. Dos bons. Safira no centro, trabalho em ourivesaria por toda a volta, uma peça legítima, que valia muito naquela época e vale uma pequena fortuna agora. — Ele pegou a lupa e a colocou de volta na mesa, e, debaixo dela, Pip fixou um olho no aro de latão. — E ele sumiu sem deixar rastro dos registros da família por volta de 1924. Simplesmente parou de ser mencionado. E os advogados da família gostariam muito de saber para onde foi, porque há um espólio que não pode ser devidamente encerrado até que alguém consiga anotar o fim que levou esse broche.</w:t>
+        <w:t xml:space="preserve">— Sou pago para isso. — Ele disse isso com alegria, o que me deteve, pois eu já estava preparada para uma esquiva. — Pesquisa de espólio. Esse é o meu ganha-pão, Sra. Claus. Quando o último membro de uma linhagem de dinheiro antigo morre, ele deixa um emaranhado para trás, um nó de quem era dono do quê, quem devia o quê, para onde foi alguma coisa de valor, e alguém tem de sentar nas bibliotecas e desatar esse nó, e esse alguém sou eu. — Ele abriu as mãos sobre as caixas. — No momento, estou desatando um nó dos Blackburn. Havia uma joia na família, antigamente. Um broche. Dos bons. Safira no centro, trabalho em ourivesaria por toda a volta, uma peça legítima, que valia muito naquela época e vale uma pequena fortuna agora. — Ele pegou a lupa e a colocou de volta na mesa, e, debaixo da mesa, Pip fixou um olho no aro de latão. — E ele sumiu sem deixar rastro dos registros da família por volta de 1924. Simplesmente parou de ser mencionado. E os advogados da família gostariam muito de saber para onde foi, porque há um espólio que não pode ser devidamente encerrado até que alguém consiga anotar o fim que levou esse broche.</w:t>
       </w:r>
     </w:p>
     <w:p/>
@@ -2306,7 +2306,7 @@
     </w:p>
     <w:p>
       <w:r>
-        <w:t>— Eu também sou mantida do lado de fora, se isso serve de consolo — eu lhe disse, e pareceu consolá-lo, o pequeno consolo mesquinho de fazer companhia em uma mágoa. O deixei remoendo produtivamente o portão, que era o estado preferido de Bram e não fazia mal algum, e fui procurar meu marido.</w:t>
+        <w:t xml:space="preserve">— Eu também sou mantida do lado de fora, se isso serve de consolo — eu lhe disse, e pareceu consolá-lo, o pequeno consolo mesquinho de fazer companhia em uma mágoa. Deixei-o remoendo produtivamente o portão, que era o estado preferido de Bram e não fazia mal algum, e fui procurar meu marido.</w:t>
       </w:r>
     </w:p>
     <w:p>
@@ -2403,7 +2403,7 @@
     <w:p/>
     <w:p>
       <w:r>
-        <w:t xml:space="preserve">O saguão estava repleto de retratos de antigos prefeitos, emoldurados em dourado e com ares autossuficientes; uma quantidade notável deles eram Blackburn, ostentando o mesmo nariz comprido dos Blackburn herdado parede abaixo como se fosse a prataria da família. No fundo do saguão, a porta do prefeito atual estava aberta. Sentado atrás de uma escrivaninha ampla e limpa que não continha nada além de um telefone e um mata-borrão de couro estava o próprio prefeito Blackburn, um homem cinzento e polido que havia herdado o nariz, o cargo e, pelo que qualquer um na cidade soubesse dizer, pouquíssimo além disso.</w:t>
+        <w:t xml:space="preserve">O saguão estava repleto de retratos de antigos prefeitos, emoldurados em dourado e com ares presunçosos; uma quantidade notável deles eram Blackburn, ostentando o mesmo nariz comprido dos Blackburn herdado parede abaixo como se fosse a prataria da família. No fundo do saguão, a porta do prefeito atual estava aberta. Sentado atrás de uma escrivaninha ampla e limpa que não continha nada além de um telefone e um mata-borrão de couro estava o próprio prefeito Blackburn, um homem cinzento e polido que havia herdado o nariz, o cargo e, pelo que qualquer um na cidade soubesse dizer, pouquíssimo além disso.</w:t>
       </w:r>
     </w:p>
     <w:p/>
@@ -2580,7 +2580,7 @@
     <w:p/>
     <w:p>
       <w:r>
-        <w:t>Eu não sabia o que aquilo significava. Poderia não passar de uma mulher cansada que não gostava de perguntas intrometidas em um dia longo. Mas meu apelo em favor da Sociedade havia fracassado, exatamente como Dot dissera que aconteceria, e a Sociedade continuava rumando para a ruína. E agora havia duas pessoas em Frost Falls em quem eu não conseguia pensar sem que o nome Blackburn viesse à mente. Uma delas geria o arquivo de onde as cartas haviam desaparecido.</w:t>
+        <w:t xml:space="preserve">Eu não sabia o que aquilo significava. Poderia não passar de uma mulher cansada que não gostava de perguntas intrometidas em um dia longo. Mas meu apelo em favor da Sociedade havia fracassado, exatamente como Dot dissera que aconteceria, e a Sociedade continuava rumando para a ruína. E agora havia duas pessoas em Frost Falls de quem eu não conseguia deixar de me lembrar ao ouvir o nome Blackburn. Uma delas geria o arquivo de onde as cartas haviam desaparecido.</w:t>
       </w:r>
     </w:p>
     <w:p/>
@@ -2632,7 +2632,7 @@
     </w:p>
     <w:p>
       <w:r>
-        <w:t xml:space="preserve">— É o que a aritmética indica. — Theo tirou os óculos e pressionou os dedos contra a ponta do nariz e, por um instante, a voz controlada vacilou. — Eu recorri a toda parte. Quero que todos saibam disso. A cada subsídio, a cada fundação, a cada fundo em três estados. Tenho uma pasta cheia de negativas. Eu poderia forrar esta sala com elas, e pelo menos assim a sala estaria seca. — Alguns riram, aquele riso triste e impotente de quem está no fim da linha. — A cidade não vai ajudar. Eu mesmo fui falar com o prefeito na primavera passada, e a Sra. Claus aqui presente foi novamente esta manhã, e ele diz a mesma coisa de sempre. A história não limpa as ruas de neve. — Ele colocou os óculos sobre os papéis. — Não sei mais o que tentar. Tentei ser sensato. Tentei despertar comiseração. Não tenho vergonha de dizer que tentei suscitar comiseração, por escrito, a uma fundação na cidade grande, e eles me mandaram uma cartinha muito educada dizendo que não.</w:t>
+        <w:t xml:space="preserve">— É o que a aritmética indica. — Theo tirou os óculos e pressionou os dedos contra a ponte do nariz e, por um instante, a voz controlada vacilou. — Eu recorri a toda parte. Quero que todos saibam disso. A cada subsídio, a cada fundação, a cada fundo em três estados. Tenho uma pasta cheia de negativas. Eu poderia forrar esta sala com elas, e pelo menos assim a sala estaria seca. — Alguns riram, aquele riso triste e impotente de quem está no fim da linha. — A cidade não vai ajudar. Eu mesmo fui falar com o prefeito na primavera passada, e a Sra. Claus aqui presente foi novamente esta manhã, e ele diz a mesma coisa de sempre. A história não limpa as ruas de neve. — Ele colocou os óculos sobre os papéis. — Não sei mais o que tentar. Tentei ser sensato. Tentei despertar comiseração. Não tenho vergonha de dizer que tentei suscitar comiseração, por escrito, a uma fundação na cidade grande, e eles me mandaram uma cartinha muito educada dizendo que não.</w:t>
       </w:r>
     </w:p>
     <w:p>
@@ -2657,7 +2657,7 @@
     </w:p>
     <w:p>
       <w:r>
-        <w:t>Claire foi embora para escrever sua matéria bondosa e melancólica que não comoveria ninguém. Fiquei para ajudar Theo e empilhei cadeiras junto com o homem de quem eu começara a suspeitar de chantagear minha amiga. Ele me agradeceu três vezes por isso. Depois, contou-me sobre a ocasião em que, em 1936, uma enchente quase destruíra os registros originais da cidade, e uma dúzia de cidadãos formara uma corrente humana para carregar as caixas para um local seguro. Aquela era a cidade em seu melhor momento, disse ele, pessoas carregando o passado para um lugar seguro com as próprias mãos, e era nisso que ele pensava nas noites ruins.</w:t>
+        <w:t xml:space="preserve">Claire foi embora para escrever sua matéria bondosa e melancólica que não comoveria ninguém. Fiquei para ajudar Theo e empilhei cadeiras junto com o homem que eu começara a suspeitar de chantagear minha amiga. Ele me agradeceu três vezes por isso. Depois, contou-me sobre a ocasião em que, em 1936, uma enchente quase destruíra os registros originais da cidade, e uma dúzia de cidadãos formara uma corrente humana para carregar as caixas para um local seguro. Aquela era a cidade em seu melhor momento, disse ele, pessoas carregando o passado para um lugar seguro com as próprias mãos, e era nisso que ele pensava nas noites ruins.</w:t>
       </w:r>
     </w:p>
     <w:p>
@@ -3225,7 +3225,7 @@
     </w:p>
     <w:p>
       <w:r>
-        <w:t xml:space="preserve">— Então ponha à prova — disse Nick —, em vez de ficar aqui na cozinha com medo disso, o que nunca resolveu nada e nunca vai resolver. Vá dar uma olhada na única coisa que você ainda não examinou direito. As cartas em si, ou o lugar onde elas deveriam estar. — Ele estendeu a mão sobre a mesa e cobriu a minha, que estava fria, com a sua mão quente. — Theo bem que precisaria de um par de mãos para botar aquele arquivo em ordem. Vá e ofereça-se. E, enquanto ajuda, descubra uma única coisa. Se as palavras daquele bilhete coincidem com as palavras das cartas que sumiram. Porque se coincidirem, Jess, então quem escreveu o bilhete não leu apenas os papéis dos Blackburn no geral. Tinha aquelas cartas exatas nas mãos. E há uma lista muito curta de pessoas em Frost Falls que poderiam dizer isso.</w:t>
+        <w:t xml:space="preserve">— Então ponha à prova — disse Nick —, em vez de ficar aqui na cozinha com medo disso, o que nunca resolveu nada e nunca vai resolver. Vá dar uma olhada na única coisa que você ainda não examinou direito. As cartas em si, ou o lugar onde elas deveriam estar. — Ele estendeu a mão sobre a mesa e cobriu a minha, que estava fria, com a sua mão quente. — Theo bem que precisaria de um par de mãos para botar aquele arquivo em ordem. Vá e ofereça-se. E, enquanto ajuda, descubra uma única coisa. Se as palavras daquele bilhete coincidem com as palavras das cartas que sumiram. Porque se coincidirem, Jess, então quem escreveu o bilhete não leu apenas os papéis dos Blackburn no geral. Tinha aquelas cartas exatas nas mãos. E há uma lista muito curta de pessoas em Frost Falls de quem se poderia dizer isso.</w:t>
       </w:r>
     </w:p>
     <w:p>
@@ -3256,7 +3256,7 @@
     <w:p/>
     <w:p>
       <w:r>
-        <w:t>Voltei à forja na manhã seguinte, mas desta vez não fui para observar o Sam. Fui para limpar a barra, o que é uma tarefa diferente e bem melhor. Eu devia isso a ele desde o momento em que me permitira desconfiar dele.</w:t>
+        <w:t xml:space="preserve">Voltei à forja na manhã seguinte, mas desta vez não fui para observar o Sam. Fui para desfazer o mal-estar, o que é uma tarefa diferente e bem melhor. Eu devia isso a ele desde o momento em que me permitira desconfiar dele.</w:t>
       </w:r>
     </w:p>
     <w:p/>
@@ -3322,7 +3322,7 @@
     <w:p/>
     <w:p>
       <w:r>
-        <w:t xml:space="preserve">O cheiro do bilhete nunca tinha sido do Sam. Era do trabalho dele. Um ferreiro acaba o ferro queimando óleo nele enquanto ainda está quente, e o ferro novo guarda aquele cheiro de fumaça por semanas. A recepção da Fiona estava cheia daquilo, o corrimão da escada, a grade da lareira, os suportes que estavam sendo instalados na varanda, e o casaco e a bolsa de ferramentas do Sam ficavam pendurados perto da porta dela todo santo dia por três semanas. Qualquer papel que ficasse em cima daquela mesa pegava o cheiro. O bilhete também ficara lá. A pista que o colocara no topo da minha lista vinha me dizendo o tempo todo onde o bilhete estivera. Não quem o escrevera. Eu estivera lendo aquilo de trás para frente. Agora eu podia ler do jeito certo, e o jeito certo o absolvia por completo, de forma limpa.</w:t>
+        <w:t xml:space="preserve">O cheiro do bilhete nunca tinha sido do Sam. Era do trabalho dele. Um ferreiro acaba o ferro queimando óleo nele enquanto ainda está quente, e o ferro novo guarda aquele cheiro de fumaça por semanas. O saguão da Fiona estava cheio daquilo, o corrimão da escada, a grade da lareira, os suportes que estavam sendo instalados na varanda, e o casaco e a bolsa de ferramentas do Sam ficavam pendurados perto da porta dela todo santo dia por três semanas. Qualquer papel que ficasse em cima daquela mesa pegava o cheiro. O bilhete também ficara lá. A pista que o colocara no topo da minha lista vinha me dizendo o tempo todo onde o bilhete estivera. Não quem o escrevera. Eu estivera lendo aquilo de trás para frente. Agora eu podia ler do jeito certo, e o jeito certo o absolvia por completo, de forma limpa.</w:t>
       </w:r>
     </w:p>
     <w:p/>
@@ -3362,7 +3362,7 @@
     </w:p>
     <w:p>
       <w:r>
-        <w:t xml:space="preserve">— A firma é de verdade — disse ela, antes que eu sequer pudesse soltar um alô. — Uma firma antiga, a dois estados de distância, faz exatamente o que o seu homem diz que faz: inventário, testamentos e localização de espólios perdidos para advogados que têm mais dinheiro do que tempo. E há um espólio dos Blackburn, Jessica, um de verdade, atual. O último da linhagem de Adelaide Blackburn morreu lá na cidade nesta primavera, sem filhos, sem testamento que preste, e deixou uma confusão dos diabos. Nosso prefeito é do lado dos primos, o lado que herdou o nariz e nenhum centavo. Ele não está metido nisso. O Carter consta nos registros da firma como o pesquisador que contrataram para passar tudo a limpo. Fiquei sabendo por uma funcionária que confirmou a história toda sem se dar conta de que estava confirmando o que quer que seja. Ele é exatamente, com toda a precisão, quem ele disse para você que era. Um bisbilhoteiro com licença e verba para despesas.</w:t>
+        <w:t xml:space="preserve">— A firma é de verdade — disse ela, antes que eu sequer pudesse soltar um alô. — Uma firma antiga, a dois estados de distância, faz exatamente o que o seu homem diz que faz: inventário, testamentos e localização de bens perdidos para advogados que têm mais dinheiro do que tempo. E há um espólio dos Blackburn, Jessica, um de verdade, atual. O último da linhagem de Adelaide Blackburn morreu lá na cidade nesta primavera, sem filhos, sem testamento que preste, e deixou uma confusão dos diabos. Nosso prefeito é do lado dos primos, o lado que herdou o nariz e nenhum centavo. Ele não está metido nisso. O Carter consta nos registros da firma como o pesquisador que contrataram para passar tudo a limpo. Fiquei sabendo por uma funcionária que confirmou a história toda sem se dar conta de que estava confirmando o que quer que seja. Ele é exatamente, com toda a precisão, quem ele disse para você que era. Um bisbilhoteiro com licença e verba para despesas.</w:t>
       </w:r>
     </w:p>
     <w:p/>
@@ -3448,7 +3448,7 @@
     <w:p/>
     <w:p>
       <w:r>
-        <w:t>Agradeci-lhe, e o agradecimento veio do fundo da alma. Recolhi a pasta e o meu pinguim, que deixou a lupa a contragosto, e saí para o frio com o último dos meus falsos suspeitos deixado para trás. Eu fora à biblioteca para inocentar Neil Carter. Inocente ele estava, e saí de lá segurando a coisa que um dia talvez permitisse à Fiona andar de cabeça erguida, acontecesse o que acontecesse: a história inteira e verdadeira de onde o broche fora parar e por quê.</w:t>
+        <w:t xml:space="preserve">Agradeci-lhe, e o agradecimento veio do fundo da alma. Recolhi a pasta e o meu pinguim, que deixou a lupa a contragosto, e saí para o frio com o último dos meus falsos suspeitos deixado para trás. Eu fora à biblioteca para inocentar Neil Carter. Eu o inocentara, e saí de lá segurando a coisa que um dia talvez permitisse à Fiona andar de cabeça erguida, acontecesse o que acontecesse: a história inteira e verdadeira de onde o broche fora parar e por quê.</w:t>
       </w:r>
     </w:p>
     <w:p>
@@ -3797,7 +3797,7 @@
     <w:p/>
     <w:p>
       <w:r>
-        <w:t>Mas alguém conseguia. Alguém que circulava por aquela cidade de forma tão comum que nenhum olhar jamais bateria nela, que podia passar pela pousada no meio da multidão do festival, deixar uma coisa ali, seguir em frente e não deixar marola nenhuma. Eu não conseguia ver quem seria. Mas, com dois bilhetes na mão, captei o primeiro indício de que a mão que os escrevera e a mão que os levara até o saguão podiam não ser a mesma mão.</w:t>
+        <w:t xml:space="preserve">Mas alguém conseguia. Alguém que circulava por aquela cidade de forma tão comum que nenhum olhar jamais bateria nele, que podia passar pela pousada no meio da multidão do festival, deixar uma coisa ali, seguir em frente e não deixar marola nenhuma. Eu não conseguia ver quem seria. Mas, com dois bilhetes na mão, captei o primeiro indício de que a mão que os escrevera e a mão que os levara até o saguão podiam não ser a mesma mão.</w:t>
       </w:r>
     </w:p>
     <w:p/>
@@ -3831,7 +3831,7 @@
     </w:p>
     <w:p>
       <w:r>
-        <w:t xml:space="preserve">A praça havia se transformado desde a manhã. As mesas de cavalete que carregáramos e arrumáramos com tanto esmero agora estavam abarrotadas com as ofertas da cidade: as tortas de Greta, cem potes de conservas, os bolinhos da esposa do Sr. Kim e uma mesa inteira com as luvas de lã do círculo dispostas em fileiras por tamanho. O palco na extremidade norte exibia uma banda, uma banda de verdade, três velhinhos e uma garota com um violino, tocando aquele tipo de música que fazia até quem jurava não dançar bater a bota contra o chão frio. Lanternas pendiam das árvores despidas. Barracas de suco de maçã quente e castanhas assadas estendiam-se por toda a extensão do largo, e sobre tudo isso as luzes do festival brilhavam. Brilhavam em tom dourado agora, cada festão, constante e quente. Nenhuma alma comentou sobre isso, porque a cidade inteira decidira em conjunto, sem dizer uma palavra, que as luzes sempre tinham sido douradas e pronto.</w:t>
+        <w:t xml:space="preserve">A praça havia se transformado desde a manhã. As mesas de cavalete que carregáramos e arrumáramos com tanto esmero agora estavam abarrotadas com as ofertas da cidade: as tortas de Greta, cem potes de conservas, os bolinhos da esposa do Sr. Kim e uma mesa inteira com as luvas de lã do círculo dispostas em fileiras por tamanho. O palco na extremidade norte exibia uma banda, uma banda de verdade, três velhinhos e uma garota com um violino, tocando aquele tipo de música que fazia até quem jurava não dançar bater a bota contra o chão frio. Lanternas pendiam das árvores despidas. Barracas de suco de maçã quente e castanhas assadas estendiam-se por toda a extensão do largo, e sobre tudo isso as luzes do festival brilhavam. Brilhavam em tom dourado agora, cada cordão, constante e quente. Nenhuma alma comentou sobre isso, porque a cidade inteira decidira em conjunto, sem dizer uma palavra, que as luzes sempre tinham sido douradas e pronto.</w:t>
       </w:r>
     </w:p>
     <w:p>
@@ -3906,7 +3906,7 @@
     </w:p>
     <w:p>
       <w:r>
-        <w:t>Fiquei em pé na neve que caía entre meus vizinhos, com Pip encostada na minha bota, a mão enluvada de Emma encontrando a minha de um lado e a de Fiona do outro. Olhei para tudo aquilo, as lanternas, a neve, a luz dourada, a centena de rostos voltados para o céu, e compreendi, daquele jeito visceral que vem antes de a mente acompanhar, exatamente o que estava em jogo. Não um prédio. Nem mesmo um segredo. Isto. Esta reunião, esta cidade sendo o melhor de si mesma em um dia frio e brilhante. Um homem estendera a mão desde a escuridão para extorquir um pedaço daquilo, para transformá-lo em uma arma e no medo. Postada ali na neve, minha mente tornou-se dura e clara como o frio. Custe o que me custasse, eu não deixaria que ele mantivesse seu domínio sobre aquilo. Eu traria tudo para a luz, para um dia como aquele, onde as coisas pudessem cicatrizar.</w:t>
+        <w:t xml:space="preserve">Fiquei em pé na neve que caía entre meus vizinhos, com Pip encostada na minha bota, a mão enluvada de Emma encontrando a minha de um lado e a de Fiona do outro. Olhei para tudo aquilo, as lanternas, a neve, a luz dourada, a centena de rostos voltados para o céu, e compreendi, daquele jeito visceral que vem antes de a mente acompanhar, exatamente o que estava em jogo. Não um prédio. Nem mesmo um segredo. Isto. Esta reunião, esta cidade sendo o melhor de si mesma em um dia frio e brilhante. Um homem estendera a mão desde a escuridão para extorquir um pedaço daquilo, para transformá-lo em uma arma e em medo. Postada ali na neve, minha mente tornou-se dura e clara como o frio. Custasse o que custasse, eu não deixaria que ele mantivesse seu domínio sobre aquilo. Eu traria tudo para a luz, para um dia como aquele, onde as coisas pudessem cicatrizar.</w:t>
       </w:r>
     </w:p>
     <w:p>
@@ -4010,7 +4010,7 @@
     </w:p>
     <w:p>
       <w:r>
-        <w:t>Fiquei imóvel à luz da lâmpada. O roubo do broche e a compra da pousada eram dois segredos diferentes, guardados em dois prédios diferentes. Theo detinha um deles. Ele tinha o arquivo, as cartas, a ficha de catálogo, o papel de carta. Ele tinha o roubo. Mas a prova de que o dinheiro roubado se transformara naquela pousada tão querida ficava na Prefeitura, nos registros imobiliários que uma mulher tensa e cansada me olhara nos olhos e jurara nunca ler.</w:t>
+        <w:t xml:space="preserve">Fiquei imóvel à luz da lâmpada. O roubo do broche e a compra da pousada eram dois segredos diferentes, guardados em dois prédios diferentes. Theo detinha um deles. Ele tinha o arquivo, as cartas, a ficha de catálogo, o papel de carta. Ele tinha o segredo do roubo. Mas a prova de que o dinheiro roubado se transformara naquela pousada tão querida ficava na Prefeitura, nos registros imobiliários que uma mulher tensa e cansada me olhara nos olhos e jurara nunca ler.</w:t>
       </w:r>
     </w:p>
     <w:p>
@@ -4046,7 +4046,7 @@
     <w:p/>
     <w:p>
       <w:r>
-        <w:t>A prefeitura abriu no sábado na semana do festival. Voltei lá na manhã seguinte com uma história pronta, pois, para ter certeza sobre Vera, eu precisava ver uma única coisa, e, para vê-la, eu precisava que ela se levantasse da cadeira e atravessasse a sala.</w:t>
+        <w:t xml:space="preserve">A Prefeitura abriu no sábado na semana do festival. Voltei lá na manhã seguinte com uma história pronta, pois, para ter certeza sobre Vera, eu precisava ver uma única coisa, e, para vê-la, eu precisava que ela se levantasse da cadeira e atravessasse a sala.</w:t>
       </w:r>
     </w:p>
     <w:p/>
@@ -4088,7 +4088,7 @@
     <w:p/>
     <w:p>
       <w:r>
-        <w:t xml:space="preserve">Quando ela voltou com uma cópia da escritura da praça, agradeci-lhe e fiz meus comentários sem graça de comitê sobre vendedores e a colocação das barracas. Depois, levei o meu tempo dobrando o papel e colocando-o na minha bolsa. Observei-a, e agora que eu sabia o que estava vendo, conseguia decifrá-la claramente. Ela não era uma mulher durona. Foi isso que me pegou. Eu meio que esperava, quando finalmente vi aquilo por completo, encontrar algo frio e avarento sob o cansaço. Não havia absolutamente nada de frio ali, apenas o medo desgastado até a exaustão, o medo enraizado até a medula de uma pessoa que fez algo grande demais para si e passa todas as noites acordada dentro desse erro. As mãos dela não estavam firmes ao ajeitar a cesta. Duas xícaras de café esquecidas repousavam frias sobre a mesa. Ela parecia com a Fiona a semana inteira, como uma pessoa sendo esmagada, exceto pelo fato de que era ela quem estava esmagando, e de algum modo aquilo era ainda mais triste.</w:t>
+        <w:t xml:space="preserve">Quando ela voltou com uma cópia da escritura da praça, agradeci-lhe e fiz meus comentários sem graça de comitê sobre vendedores e a colocação das barracas. Depois, levei o meu tempo dobrando o papel e colocando-o na minha bolsa. Observei-a, e agora que eu sabia o que estava vendo, conseguia decifrá-la claramente. Ela não era uma mulher durona. Foi isso que me pegou. Eu meio que esperava, quando finalmente vi aquilo por completo, encontrar algo frio e avarento sob o cansaço. Não havia absolutamente nada de frio ali, apenas o medo desgastado até a exaustão, o medo enraizado até a medula de uma pessoa que fez algo grande demais para si e passa todas as noites acordada dentro desse erro. As mãos dela não estavam firmes ao ajeitar a cesta. Duas xícaras de café esquecidas repousavam frias sobre a mesa. Ela estava com a mesma cara que a Fiona tivera a semana inteira, como uma pessoa sendo esmagada, exceto pelo fato de que era ela quem estava esmagando, e de algum modo aquilo era ainda mais triste.</w:t>
       </w:r>
     </w:p>
     <w:p/>
@@ -4118,7 +4118,7 @@
     <w:p/>
     <w:p>
       <w:r>
-        <w:t xml:space="preserve">Theo tinha o furto. Ele o descobrira nas cartas dos Blackburn, o broche, a gema, a casa de penhores. Ele o catalogara com sua caligrafia caprichosa, a safira em seu coração, e depois retirara essas cartas dos arquivos, declarando-as sumidas. Mas Theo, afundando, vigiado por toda a cidade, nunca em casa, não poderia ter feito o resto. Ele não podia ter confirmado que a pousada havia sido comprada com o dinheiro, porque essa prova não estava no prédio dele. E ele não podia ter levado os bilhetes cruzando a cidade e deixado um sobre uma mesa cheia de gente em plena luz do dia de festival, porque Theo Hussein não conseguia caminhar pela Avenida Evergreen sem ser notado nem para salvar a própria vida.</w:t>
+        <w:t xml:space="preserve">Theo tinha o segredo do furto. Ele o descobrira nas cartas dos Blackburn, o broche, a gema, a casa de penhores. Ele o catalogara com sua caligrafia caprichosa, a safira em seu coração, e depois retirara essas cartas dos arquivos, declarando-as sumidas. Mas Theo, afundando, vigiado por toda a cidade, nunca em casa, não poderia ter feito o resto. Ele não podia ter confirmado que a pousada havia sido comprada com o dinheiro, porque essa prova não estava no prédio dele. E ele não podia ter levado os bilhetes cruzando a cidade e deixado um sobre uma mesa cheia de gente em plena luz do dia de festival, porque Theo Hussein não conseguia caminhar pela Avenida Evergreen sem ser notado nem para salvar a própria vida.</w:t>
       </w:r>
     </w:p>
     <w:p/>
@@ -4154,7 +4154,7 @@
     <w:p/>
     <w:p>
       <w:r>
-        <w:t xml:space="preserve">Caminhando o resto do caminho para casa no frio, com a escritura da praça na bolsa e os nomes de ambos pesando no meu peito, eu podia sentir a escolha se aproximando. Ela trazia o peso do tipo mais difícil, o tipo que eu não precisava fazer desde o dia em que desci do topo do mundo.</w:t>
+        <w:t xml:space="preserve">Caminhando o resto do caminho para casa no frio, com a escritura da praça na bolsa e os nomes de ambos pesando no meu peito, eu podia sentir a escolha se aproximando. Ela trazia o peso do tipo mais difícil, o tipo que eu não precisara fazer desde o dia em que desci do topo do mundo.</w:t>
       </w:r>
     </w:p>
     <w:p>
@@ -4237,7 +4237,7 @@
     <w:p/>
     <w:p>
       <w:r>
-        <w:t xml:space="preserve">Aí estava, o último medo, o menor deles e o mais inteiramente meu. Eu ainda era meio estrangeira naquela cidade. Todos os outros se conheciam desde que eram crianças aprendendo a andar naquelas mesmas calçadas, e eu vinha conquistando meu espaço centímetro por centímetro, uma caçarola aqui, uma busca por cachorro acolá, uma cadeira puxada no círculo de tricô. Arrastar Theo Hussein para a luz podia me custar um pouco desse espaço conquistado a custo. As pessoas nem sempre gostam de quem diz a dura verdade. Eu podia fazer exatamente a coisa certa e ser, para sempre, a forasteira que destruiu um homem bom e trouxe sofrimento à cidade.</w:t>
+        <w:t xml:space="preserve">Aí estava, o último medo, o menor deles e o mais inteiramente meu. Eu ainda era meio forasteira naquela cidade. Todos os outros se conheciam desde que eram crianças aprendendo a andar naquelas mesmas calçadas, e eu vinha conquistando meu espaço centímetro por centímetro, uma caçarola aqui, uma busca por cachorro acolá, uma cadeira puxada no círculo de tricô. Arrastar Theo Hussein para a luz podia me custar um pouco desse espaço conquistado a custo. As pessoas nem sempre gostam de quem diz a dura verdade. Eu podia fazer exatamente a coisa certa e ser, para sempre, a forasteira que destruiu um homem bom e trouxe sofrimento à cidade.</w:t>
       </w:r>
     </w:p>
     <w:p/>
@@ -4296,7 +4296,7 @@
     <w:p/>
     <w:p>
       <w:r>
-        <w:t>Ela não me interrompeu nenhuma vez. Quando terminei, ficou em silêncio por um instante, girando a caneta devagar pela metade na página aberta.</w:t>
+        <w:t xml:space="preserve">Ela não me interrompeu nenhuma vez. Quando terminei, ficou em silêncio por um instante, dando à caneta uma lenta meia-volta sobre a página aberta.</w:t>
       </w:r>
     </w:p>
     <w:p/>
@@ -4332,7 +4332,7 @@
     <w:p/>
     <w:p>
       <w:r>
-        <w:t>— Então é assim que vamos fazer. — Ela fechou o caderno. — Sem armadilha. Sem dinheiro marcado, sem envelope isca enfiado debaixo dos degraus da pousada no escuro. Isso é coisa de filme. Coloca pessoas comuns em perigo sem nenhum bom motivo. Vamos nos sentar com eles. Eu, você e Fiona, se ela estiver disposta a participar. Vamos expor o que sabemos, claramente, do mesmo jeito que você me expôs agora há pouco, e vamos dar a eles a chance de serem as pessoas em quem esta cidade sempre acreditou que eles fossem. A maioria das pessoas, diante da verdade apresentada de forma gentil e íntegra, aproveita essa chance. Elas estão cansadas de carregar esse peso. No fundo, por trás do medo, boa parte delas fica meio aliviada por poder largá-lo.</w:t>
+        <w:t xml:space="preserve">— Então é assim que vamos fazer. — Ela fechou o caderno. — Sem armadilha. Sem dinheiro marcado, sem envelope isca enfiado debaixo dos degraus da pousada no escuro. Isso é coisa de filme. Coloca pessoas comuns em perigo sem nenhum bom motivo. Vamos nos sentar com eles. Eu, você e Fiona, se ela estiver disposta a participar. Vamos expor o que sabemos, claramente, do mesmo jeito que você me expôs agora há pouco, e vamos dar a eles a chance de serem as pessoas que esta cidade sempre acreditou que eles fossem. A maioria das pessoas, diante da verdade apresentada de forma gentil e íntegra, aproveita essa chance. Elas estão cansadas de carregar esse peso. No fundo, por trás do medo, boa parte delas fica meio aliviada por poder largá-lo.</w:t>
       </w:r>
     </w:p>
     <w:p/>
@@ -4505,7 +4505,7 @@
     <w:p/>
     <w:p>
       <w:r>
-        <w:t xml:space="preserve">— Vera — eu disse. — Theo tinha o roubo. Mas os bilhetes sabiam que a pousada havia sido comprada com o dinheiro do broche, e isso nunca esteve em nenhuma carta dos Blackburn. Isso é um registro de propriedade. Uma escritura. E a escritura desta pousada estava fora de sua gaveta na sua cesta de rearquivamento ontem de manhã, manuseada, na escrivaninha de uma mulher que me dissera duas vezes que nunca lê os registros que ficam atrás dela. — Mantive a voz macia. — Ele tinha o roubo. A senhora tinha a escritura. E a senhora tinha as pernas, Vera. Ele não conseguiria cruzar esta cidade sem ser notado nem se sua vida dependesse disso, todo mundo conhece o Theo, todo mundo o para. Mas ninguém pisca para a secretária do prefeito dando um pulo na pousada durante o festival. Eu mesma passei pela senhora nos degraus naquela manhã, com os passes de estacionamento. Ele não teria conseguido fazer isso sozinho. Precisava de alguém que pudesse se mover pela cidade sem ser visto. Essa pessoa era a senhora.</w:t>
+        <w:t xml:space="preserve">— Vera — eu disse. — Theo tinha o segredo do roubo. Mas os bilhetes sabiam que a pousada havia sido comprada com o dinheiro do broche, e isso nunca esteve em nenhuma carta dos Blackburn. Isso é um registro de propriedade. Uma escritura. E a escritura desta pousada estava fora de sua gaveta na sua cesta de rearquivamento ontem de manhã, manuseada, na escrivaninha de uma mulher que me dissera duas vezes que nunca lê os registros que ficam atrás dela. — Mantive a voz macia. — Ele tinha o segredo do roubo. A senhora tinha a escritura. E a senhora tinha as pernas, Vera. Ele não conseguiria cruzar esta cidade sem ser notado nem se sua vida dependesse disso, todo mundo conhece o Theo, todo mundo o para. Mas ninguém pisca para a secretária do prefeito dando um pulo na pousada durante o festival. Eu mesma passei pela senhora nos degraus naquela manhã, com os passes de estacionamento. Ele não teria conseguido fazer isso sozinho. Precisava de alguém que pudesse se mover pela cidade sem ser visto. Essa pessoa era a senhora.</w:t>
       </w:r>
     </w:p>
     <w:p/>
@@ -4930,7 +4930,7 @@
     <w:p/>
     <w:p>
       <w:r>
-        <w:t xml:space="preserve">Sam Patel fez a escavação, porque Sam fazia o trabalho pesado e honesto e gostava disso. Ficamos todos em volta dele sob o ouro dos lampiões e das luzes penduradas, nosso hálito subindo junto no frio. Emma Redfern segurou minha mão de um lado e Pip encostou-se, quentinha, à minha bota do outro. Snowball usava seu gorro de chifres. Mark ficou atrás da filha com as mãos nos ombros dela. O círculo inteiro estava lá, e Neil Carter também, que tinha ficado por mais tempo do que planejara e estava no fundo, com o caderno pela primeira vez guardado no bolso. Quando a pá de Sam bateu em algo que soou oco, sólido e metálico, a praça inteira emitiu um único som coletivo, um ah suave e estupefato que pairou no ar frio.</w:t>
+        <w:t xml:space="preserve">Sam Patel fez a escavação, porque Sam fazia o trabalho pesado e honesto e gostava disso. Ficamos todos em volta dele sob o ouro dos lampiões e das luzes penduradas, nosso hálito subindo junto no frio. Emma Redfern segurou minha mão de um lado e Pip encostou-se, quentinha, à minha bota do outro. Snowball usava seu chapéu de chifres. Mark ficou atrás da filha com as mãos nos ombros dela. O círculo inteiro estava lá, e Neil Carter também, que tinha ficado por mais tempo do que planejara e estava no fundo, com o caderno pela primeira vez guardado no bolso. Quando a pá de Sam bateu em algo que soou surdo, sólido e metálico, a praça inteira emitiu um único som coletivo, um ah suave e estupefato que pairou no ar frio.</w:t>
       </w:r>
     </w:p>
     <w:p/>
@@ -4954,7 +4954,7 @@
     <w:p/>
     <w:p>
       <w:r>
-        <w:t xml:space="preserve">— Ele encontrou metade da trilha até ela, afinal de contas — continuou Noriko —, mesmo que tenha acabado de encontrá-la do jeito errado. Ele dedicou trinta anos a saber onde as coisas enterradas desta cidade estão. Ele deveria estar lá para ver esta vir à luz. Pode ser a primeira coisa boa de que ele chega a participar de novo. E participar de uma coisa boa pela qual ele não pode levar crédito nenhum talvez seja exatamente o remédio de que ele precisa.</w:t>
+        <w:t xml:space="preserve">— Ele encontrou metade da trilha até ela, afinal de contas — continuou Noriko —, mesmo que a tenha encontrado do jeito errado. Ele dedicou trinta anos a saber onde as coisas enterradas desta cidade estão. Ele deveria estar lá para ver esta vir à luz. Pode ser a primeira coisa boa de que ele chega a participar de novo. E participar de uma coisa boa pela qual ele não pode levar crédito nenhum talvez seja exatamente o remédio de que ele precisa.</w:t>
       </w:r>
     </w:p>
     <w:p/>

</xml_diff>